<commit_message>
Add JD-aware resume enhancements and candidate photo support
</commit_message>
<xml_diff>
--- a/templates/ford-india-resume-template.docx
+++ b/templates/ford-india-resume-template.docx
@@ -49,6 +49,31 @@
     </w:p>
     <w:p>
       <w:pPr>
+        <w:keepNext w:val="0"/>
+        <w:keepLines w:val="0"/>
+        <w:pageBreakBefore w:val="0"/>
+        <w:widowControl w:val="0"/>
+        <w:pBdr>
+          <w:top w:space="0" w:sz="0" w:val="nil"/>
+          <w:left w:space="0" w:sz="0" w:val="nil"/>
+          <w:bottom w:space="0" w:sz="0" w:val="nil"/>
+          <w:right w:space="0" w:sz="0" w:val="nil"/>
+          <w:between w:space="0" w:sz="0" w:val="nil"/>
+        </w:pBdr>
+        <w:shd w:fill="auto" w:val="clear"/>
+        <w:spacing w:after="0" w:before="0" w:line="276" w:lineRule="auto"/>
+        <w:ind w:left="0" w:right="0" w:firstLine="0"/>
+        <w:jc w:val="left"/>
+        <w:rPr/>
+      </w:pPr>
+      <w:r>
+        <w:rPr>
+          <w:rtl w:val="0"/>
+        </w:rPr>
+      </w:r>
+    </w:p>
+    <w:p>
+      <w:pPr>
         <w:pStyle w:val="Subtitle"/>
         <w:pBdr>
           <w:top w:color="000000" w:space="1" w:sz="4" w:val="single"/>
@@ -142,1042 +167,1184 @@
           <mc:Choice Requires="wpg">
             <w:drawing>
               <wp:inline distB="0" distT="0" distL="0" distR="0">
-                <wp:extent cx="6705600" cy="6793277"/>
+                <wp:extent cx="6715125" cy="7077589"/>
                 <wp:effectExtent b="0" l="0" r="0" t="0"/>
-                <wp:docPr id="221" name=""/>
+                <wp:docPr id="224" name=""/>
                 <a:graphic>
-                  <a:graphicData uri="http://schemas.microsoft.com/office/word/2010/wordprocessingShape">
-                    <wps:wsp>
-                      <wps:cNvSpPr/>
-                      <wps:cNvPr id="2" name="Shape 2"/>
-                      <wps:spPr>
+                  <a:graphicData uri="http://schemas.microsoft.com/office/word/2010/wordprocessingGroup">
+                    <wpg:wgp>
+                      <wpg:cNvGrpSpPr/>
+                      <wpg:grpSpPr>
                         <a:xfrm>
-                          <a:off x="2002650" y="603150"/>
-                          <a:ext cx="6686700" cy="6353700"/>
+                          <a:off x="1997875" y="493750"/>
+                          <a:ext cx="6715125" cy="7077589"/>
+                          <a:chOff x="1997875" y="493750"/>
+                          <a:chExt cx="6696250" cy="6467950"/>
                         </a:xfrm>
-                        <a:prstGeom prst="rect">
-                          <a:avLst/>
-                        </a:prstGeom>
-                        <a:noFill/>
-                        <a:ln cap="flat" cmpd="sng" w="9525">
-                          <a:solidFill>
-                            <a:srgbClr val="000000"/>
-                          </a:solidFill>
-                          <a:prstDash val="solid"/>
-                          <a:miter lim="800000"/>
-                          <a:headEnd len="sm" w="sm" type="none"/>
-                          <a:tailEnd len="sm" w="sm" type="none"/>
-                        </a:ln>
-                      </wps:spPr>
-                      <wps:txbx>
-                        <w:txbxContent>
-                          <w:p>
-                            <w:pPr>
-                              <w:spacing w:after="0" w:before="50" w:line="240"/>
-                              <w:ind w:left="0" w:right="0" w:firstLine="0"/>
-                              <w:jc w:val="left"/>
-                              <w:textDirection w:val="btLr"/>
-                            </w:pPr>
-                            <w:r>
-                              <w:rPr>
-                                <w:rFonts w:ascii="Trebuchet MS" w:cs="Trebuchet MS" w:eastAsia="Trebuchet MS" w:hAnsi="Trebuchet MS"/>
-                                <w:b w:val="0"/>
-                                <w:i w:val="0"/>
-                                <w:smallCaps w:val="0"/>
-                                <w:strike w:val="0"/>
-                                <w:color w:val="000000"/>
-                                <w:sz w:val="20"/>
-                                <w:vertAlign w:val="baseline"/>
-                              </w:rPr>
-                              <w:t xml:space="preserve"> </w:t>
-                            </w:r>
-                            <w:r>
-                              <w:rPr>
-                                <w:rFonts w:ascii="Century Gothic" w:cs="Century Gothic" w:eastAsia="Century Gothic" w:hAnsi="Century Gothic"/>
-                                <w:b w:val="1"/>
-                                <w:i w:val="0"/>
-                                <w:smallCaps w:val="0"/>
-                                <w:strike w:val="0"/>
-                                <w:color w:val="1f497d"/>
-                                <w:sz w:val="22"/>
-                                <w:vertAlign w:val="baseline"/>
-                              </w:rPr>
-                              <w:t xml:space="preserve">Candidate First Name:  {{ first_name }}</w:t>
-                            </w:r>
-                          </w:p>
-                          <w:p>
-                            <w:pPr>
-                              <w:spacing w:after="0" w:before="50" w:line="240"/>
-                              <w:ind w:left="0" w:right="0" w:firstLine="0"/>
-                              <w:jc w:val="left"/>
-                              <w:textDirection w:val="btLr"/>
-                            </w:pPr>
-                            <w:r>
-                              <w:rPr>
-                                <w:rFonts w:ascii="Century Gothic" w:cs="Century Gothic" w:eastAsia="Century Gothic" w:hAnsi="Century Gothic"/>
-                                <w:b w:val="1"/>
-                                <w:i w:val="0"/>
-                                <w:smallCaps w:val="0"/>
-                                <w:strike w:val="0"/>
-                                <w:color w:val="1f497d"/>
-                                <w:sz w:val="22"/>
-                                <w:vertAlign w:val="baseline"/>
-                              </w:rPr>
-                            </w:r>
-                            <w:r>
-                              <w:rPr>
-                                <w:rFonts w:ascii="Century Gothic" w:cs="Century Gothic" w:eastAsia="Century Gothic" w:hAnsi="Century Gothic"/>
-                                <w:b w:val="1"/>
-                                <w:i w:val="0"/>
-                                <w:smallCaps w:val="0"/>
-                                <w:strike w:val="0"/>
-                                <w:color w:val="1f497d"/>
-                                <w:sz w:val="22"/>
-                                <w:vertAlign w:val="baseline"/>
-                              </w:rPr>
-                              <w:t xml:space="preserve">(As per PAN/Aadhar)</w:t>
-                            </w:r>
-                          </w:p>
-                          <w:p>
-                            <w:pPr>
-                              <w:spacing w:after="0" w:before="50" w:line="240"/>
-                              <w:ind w:left="0" w:right="0" w:firstLine="0"/>
-                              <w:jc w:val="left"/>
-                              <w:textDirection w:val="btLr"/>
-                            </w:pPr>
-                            <w:r>
-                              <w:rPr>
-                                <w:rFonts w:ascii="Century Gothic" w:cs="Century Gothic" w:eastAsia="Century Gothic" w:hAnsi="Century Gothic"/>
-                                <w:b w:val="1"/>
-                                <w:i w:val="0"/>
-                                <w:smallCaps w:val="0"/>
-                                <w:strike w:val="0"/>
-                                <w:color w:val="1f497d"/>
-                                <w:sz w:val="22"/>
-                                <w:vertAlign w:val="baseline"/>
-                              </w:rPr>
-                            </w:r>
-                          </w:p>
-                          <w:p>
-                            <w:pPr>
-                              <w:spacing w:after="0" w:before="50" w:line="240"/>
-                              <w:ind w:left="0" w:right="0" w:firstLine="0"/>
-                              <w:jc w:val="left"/>
-                              <w:textDirection w:val="btLr"/>
-                            </w:pPr>
-                            <w:r>
-                              <w:rPr>
-                                <w:rFonts w:ascii="Century Gothic" w:cs="Century Gothic" w:eastAsia="Century Gothic" w:hAnsi="Century Gothic"/>
-                                <w:b w:val="1"/>
-                                <w:i w:val="0"/>
-                                <w:smallCaps w:val="0"/>
-                                <w:strike w:val="0"/>
-                                <w:color w:val="1f497d"/>
-                                <w:sz w:val="22"/>
-                                <w:vertAlign w:val="baseline"/>
-                              </w:rPr>
-                            </w:r>
-                            <w:r>
-                              <w:rPr>
-                                <w:rFonts w:ascii="Century Gothic" w:cs="Century Gothic" w:eastAsia="Century Gothic" w:hAnsi="Century Gothic"/>
-                                <w:b w:val="1"/>
-                                <w:i w:val="0"/>
-                                <w:smallCaps w:val="0"/>
-                                <w:strike w:val="0"/>
-                                <w:color w:val="1f497d"/>
-                                <w:sz w:val="22"/>
-                                <w:vertAlign w:val="baseline"/>
-                              </w:rPr>
-                              <w:t xml:space="preserve"> Candidate Last Name: {{ last_name }}</w:t>
-                            </w:r>
-                            <w:r>
-                              <w:rPr>
-                                <w:rFonts w:ascii="Century Gothic" w:cs="Century Gothic" w:eastAsia="Century Gothic" w:hAnsi="Century Gothic"/>
-                                <w:b w:val="1"/>
-                                <w:i w:val="0"/>
-                                <w:smallCaps w:val="0"/>
-                                <w:strike w:val="0"/>
-                                <w:color w:val="1f497d"/>
-                                <w:sz w:val="22"/>
-                                <w:vertAlign w:val="baseline"/>
-                              </w:rPr>
-                              <w:br w:type="textWrapping"/>
-                            </w:r>
-                            <w:r>
-                              <w:rPr>
-                                <w:rFonts w:ascii="Century Gothic" w:cs="Century Gothic" w:eastAsia="Century Gothic" w:hAnsi="Century Gothic"/>
-                                <w:b w:val="1"/>
-                                <w:i w:val="0"/>
-                                <w:smallCaps w:val="0"/>
-                                <w:strike w:val="0"/>
-                                <w:color w:val="1f497d"/>
-                                <w:sz w:val="22"/>
-                                <w:vertAlign w:val="baseline"/>
-                              </w:rPr>
-                              <w:t xml:space="preserve"> (As per PAN/Aadhar)</w:t>
-                            </w:r>
-                          </w:p>
-                          <w:p>
-                            <w:pPr>
-                              <w:spacing w:after="0" w:before="50" w:line="240"/>
-                              <w:ind w:left="0" w:right="0" w:firstLine="0"/>
-                              <w:jc w:val="left"/>
-                              <w:textDirection w:val="btLr"/>
-                            </w:pPr>
-                            <w:r>
-                              <w:rPr>
-                                <w:rFonts w:ascii="Century Gothic" w:cs="Century Gothic" w:eastAsia="Century Gothic" w:hAnsi="Century Gothic"/>
-                                <w:b w:val="1"/>
-                                <w:i w:val="0"/>
-                                <w:smallCaps w:val="0"/>
-                                <w:strike w:val="0"/>
-                                <w:color w:val="1f497d"/>
-                                <w:sz w:val="22"/>
-                                <w:vertAlign w:val="baseline"/>
-                              </w:rPr>
-                            </w:r>
-                          </w:p>
-                          <w:p>
-                            <w:pPr>
-                              <w:spacing w:after="0" w:before="50" w:line="240"/>
-                              <w:ind w:left="0" w:right="0" w:firstLine="0"/>
-                              <w:jc w:val="left"/>
-                              <w:textDirection w:val="btLr"/>
-                            </w:pPr>
-                            <w:r>
-                              <w:rPr>
-                                <w:rFonts w:ascii="Century Gothic" w:cs="Century Gothic" w:eastAsia="Century Gothic" w:hAnsi="Century Gothic"/>
-                                <w:b w:val="1"/>
-                                <w:i w:val="0"/>
-                                <w:smallCaps w:val="0"/>
-                                <w:strike w:val="0"/>
-                                <w:color w:val="1f497d"/>
-                                <w:sz w:val="22"/>
-                                <w:vertAlign w:val="baseline"/>
-                              </w:rPr>
-                            </w:r>
-                            <w:r>
-                              <w:rPr>
-                                <w:rFonts w:ascii="Century Gothic" w:cs="Century Gothic" w:eastAsia="Century Gothic" w:hAnsi="Century Gothic"/>
-                                <w:b w:val="1"/>
-                                <w:i w:val="0"/>
-                                <w:smallCaps w:val="0"/>
-                                <w:strike w:val="0"/>
-                                <w:color w:val="1f497d"/>
-                                <w:sz w:val="22"/>
-                                <w:vertAlign w:val="baseline"/>
-                              </w:rPr>
-                              <w:t xml:space="preserve"> Notice Period of the Candidate: {{ notice_period }}</w:t>
-                            </w:r>
-                          </w:p>
-                          <w:p>
-                            <w:pPr>
-                              <w:spacing w:after="0" w:before="50" w:line="240"/>
-                              <w:ind w:left="0" w:right="0" w:firstLine="0"/>
-                              <w:jc w:val="left"/>
-                              <w:textDirection w:val="btLr"/>
-                            </w:pPr>
-                            <w:r>
-                              <w:rPr>
-                                <w:rFonts w:ascii="Century Gothic" w:cs="Century Gothic" w:eastAsia="Century Gothic" w:hAnsi="Century Gothic"/>
-                                <w:b w:val="1"/>
-                                <w:i w:val="0"/>
-                                <w:smallCaps w:val="0"/>
-                                <w:strike w:val="0"/>
-                                <w:color w:val="1f497d"/>
-                                <w:sz w:val="22"/>
-                                <w:vertAlign w:val="baseline"/>
-                              </w:rPr>
-                            </w:r>
-                          </w:p>
-                          <w:p>
-                            <w:pPr>
-                              <w:spacing w:after="0" w:before="50" w:line="240"/>
-                              <w:ind w:left="0" w:right="0" w:firstLine="0"/>
-                              <w:jc w:val="left"/>
-                              <w:textDirection w:val="btLr"/>
-                            </w:pPr>
-                            <w:r>
-                              <w:rPr>
-                                <w:rFonts w:ascii="Century Gothic" w:cs="Century Gothic" w:eastAsia="Century Gothic" w:hAnsi="Century Gothic"/>
-                                <w:b w:val="1"/>
-                                <w:i w:val="0"/>
-                                <w:smallCaps w:val="0"/>
-                                <w:strike w:val="0"/>
-                                <w:color w:val="1f497d"/>
-                                <w:sz w:val="22"/>
-                                <w:vertAlign w:val="baseline"/>
-                              </w:rPr>
-                            </w:r>
-                            <w:r>
-                              <w:rPr>
-                                <w:rFonts w:ascii="Century Gothic" w:cs="Century Gothic" w:eastAsia="Century Gothic" w:hAnsi="Century Gothic"/>
-                                <w:b w:val="1"/>
-                                <w:i w:val="0"/>
-                                <w:smallCaps w:val="0"/>
-                                <w:strike w:val="0"/>
-                                <w:color w:val="1f497d"/>
-                                <w:sz w:val="22"/>
-                                <w:vertAlign w:val="baseline"/>
-                              </w:rPr>
-                              <w:t xml:space="preserve"> Internal or External Candidate: {{ candidate_type }}</w:t>
-                            </w:r>
-                          </w:p>
-                          <w:p>
-                            <w:pPr>
-                              <w:spacing w:after="0" w:before="50" w:line="240"/>
-                              <w:ind w:left="0" w:right="0" w:firstLine="0"/>
-                              <w:jc w:val="left"/>
-                              <w:textDirection w:val="btLr"/>
-                            </w:pPr>
-                            <w:r>
-                              <w:rPr>
-                                <w:rFonts w:ascii="Century Gothic" w:cs="Century Gothic" w:eastAsia="Century Gothic" w:hAnsi="Century Gothic"/>
-                                <w:b w:val="1"/>
-                                <w:i w:val="0"/>
-                                <w:smallCaps w:val="0"/>
-                                <w:strike w:val="0"/>
-                                <w:color w:val="1f497d"/>
-                                <w:sz w:val="22"/>
-                                <w:vertAlign w:val="baseline"/>
-                              </w:rPr>
-                            </w:r>
-                          </w:p>
-                          <w:p>
-                            <w:pPr>
-                              <w:spacing w:after="0" w:before="50" w:line="240"/>
-                              <w:ind w:left="0" w:right="0" w:firstLine="0"/>
-                              <w:jc w:val="left"/>
-                              <w:textDirection w:val="btLr"/>
-                            </w:pPr>
-                            <w:r>
-                              <w:rPr>
-                                <w:rFonts w:ascii="Century Gothic" w:cs="Century Gothic" w:eastAsia="Century Gothic" w:hAnsi="Century Gothic"/>
-                                <w:b w:val="1"/>
-                                <w:i w:val="0"/>
-                                <w:smallCaps w:val="0"/>
-                                <w:strike w:val="0"/>
-                                <w:color w:val="1f497d"/>
-                                <w:sz w:val="22"/>
-                                <w:vertAlign w:val="baseline"/>
-                              </w:rPr>
-                            </w:r>
-                            <w:r>
-                              <w:rPr>
-                                <w:rFonts w:ascii="Century Gothic" w:cs="Century Gothic" w:eastAsia="Century Gothic" w:hAnsi="Century Gothic"/>
-                                <w:b w:val="1"/>
-                                <w:i w:val="0"/>
-                                <w:smallCaps w:val="0"/>
-                                <w:strike w:val="0"/>
-                                <w:color w:val="1f497d"/>
-                                <w:sz w:val="22"/>
-                                <w:vertAlign w:val="baseline"/>
-                              </w:rPr>
-                              <w:t xml:space="preserve"> Interview Availability Date: {{ interview_availability }}</w:t>
-                            </w:r>
-                          </w:p>
-                          <w:p>
-                            <w:pPr>
-                              <w:spacing w:after="0" w:before="50" w:line="240"/>
-                              <w:ind w:left="0" w:right="0" w:firstLine="0"/>
-                              <w:jc w:val="left"/>
-                              <w:textDirection w:val="btLr"/>
-                            </w:pPr>
-                            <w:r>
-                              <w:rPr>
-                                <w:rFonts w:ascii="Century Gothic" w:cs="Century Gothic" w:eastAsia="Century Gothic" w:hAnsi="Century Gothic"/>
-                                <w:b w:val="1"/>
-                                <w:i w:val="0"/>
-                                <w:smallCaps w:val="0"/>
-                                <w:strike w:val="0"/>
-                                <w:color w:val="1f497d"/>
-                                <w:sz w:val="22"/>
-                                <w:vertAlign w:val="baseline"/>
-                              </w:rPr>
-                            </w:r>
-                          </w:p>
-                          <w:p>
-                            <w:pPr>
-                              <w:spacing w:after="0" w:before="50" w:line="240"/>
-                              <w:ind w:left="0" w:right="0" w:firstLine="0"/>
-                              <w:jc w:val="left"/>
-                              <w:textDirection w:val="btLr"/>
-                            </w:pPr>
-                            <w:r>
-                              <w:rPr>
-                                <w:rFonts w:ascii="Century Gothic" w:cs="Century Gothic" w:eastAsia="Century Gothic" w:hAnsi="Century Gothic"/>
-                                <w:b w:val="1"/>
-                                <w:i w:val="0"/>
-                                <w:smallCaps w:val="0"/>
-                                <w:strike w:val="0"/>
-                                <w:color w:val="1f497d"/>
-                                <w:sz w:val="22"/>
-                                <w:vertAlign w:val="baseline"/>
-                              </w:rPr>
-                            </w:r>
-                            <w:r>
-                              <w:rPr>
-                                <w:rFonts w:ascii="Century Gothic" w:cs="Century Gothic" w:eastAsia="Century Gothic" w:hAnsi="Century Gothic"/>
-                                <w:b w:val="1"/>
-                                <w:i w:val="0"/>
-                                <w:smallCaps w:val="0"/>
-                                <w:strike w:val="0"/>
-                                <w:color w:val="1f497d"/>
-                                <w:sz w:val="22"/>
-                                <w:vertAlign w:val="baseline"/>
-                              </w:rPr>
-                              <w:t xml:space="preserve"> Start Availability Date: {{ start_availability }}</w:t>
-                            </w:r>
-                          </w:p>
-                          <w:p>
-                            <w:pPr>
-                              <w:spacing w:after="0" w:before="50" w:line="240"/>
-                              <w:ind w:left="0" w:right="0" w:firstLine="0"/>
-                              <w:jc w:val="left"/>
-                              <w:textDirection w:val="btLr"/>
-                            </w:pPr>
-                            <w:r>
-                              <w:rPr>
-                                <w:rFonts w:ascii="Century Gothic" w:cs="Century Gothic" w:eastAsia="Century Gothic" w:hAnsi="Century Gothic"/>
-                                <w:b w:val="1"/>
-                                <w:i w:val="0"/>
-                                <w:smallCaps w:val="0"/>
-                                <w:strike w:val="0"/>
-                                <w:color w:val="1f497d"/>
-                                <w:sz w:val="22"/>
-                                <w:vertAlign w:val="baseline"/>
-                              </w:rPr>
-                            </w:r>
-                          </w:p>
-                          <w:p>
-                            <w:pPr>
-                              <w:spacing w:after="0" w:before="50" w:line="240"/>
-                              <w:ind w:left="0" w:right="0" w:firstLine="0"/>
-                              <w:jc w:val="left"/>
-                              <w:textDirection w:val="btLr"/>
-                            </w:pPr>
-                            <w:r>
-                              <w:rPr>
-                                <w:rFonts w:ascii="Century Gothic" w:cs="Century Gothic" w:eastAsia="Century Gothic" w:hAnsi="Century Gothic"/>
-                                <w:b w:val="1"/>
-                                <w:i w:val="0"/>
-                                <w:smallCaps w:val="0"/>
-                                <w:strike w:val="0"/>
-                                <w:color w:val="1f497d"/>
-                                <w:sz w:val="22"/>
-                                <w:vertAlign w:val="baseline"/>
-                              </w:rPr>
-                            </w:r>
-                            <w:r>
-                              <w:rPr>
-                                <w:rFonts w:ascii="Century Gothic" w:cs="Century Gothic" w:eastAsia="Century Gothic" w:hAnsi="Century Gothic"/>
-                                <w:b w:val="1"/>
-                                <w:i w:val="0"/>
-                                <w:smallCaps w:val="0"/>
-                                <w:strike w:val="0"/>
-                                <w:color w:val="1f497d"/>
-                                <w:sz w:val="22"/>
-                                <w:vertAlign w:val="baseline"/>
-                              </w:rPr>
-                              <w:t xml:space="preserve">Has the candidate worked directly for Ford before? (Yes/No) {{ worked_with_ford_before }}</w:t>
-                            </w:r>
-                          </w:p>
-                          <w:p>
-                            <w:pPr>
-                              <w:spacing w:after="0" w:before="50" w:line="240"/>
-                              <w:ind w:left="0" w:right="0" w:firstLine="0"/>
-                              <w:jc w:val="left"/>
-                              <w:textDirection w:val="btLr"/>
-                            </w:pPr>
-                            <w:r>
-                              <w:rPr>
-                                <w:rFonts w:ascii="Century Gothic" w:cs="Century Gothic" w:eastAsia="Century Gothic" w:hAnsi="Century Gothic"/>
-                                <w:b w:val="1"/>
-                                <w:i w:val="0"/>
-                                <w:smallCaps w:val="0"/>
-                                <w:strike w:val="0"/>
-                                <w:color w:val="1f497d"/>
-                                <w:sz w:val="22"/>
-                                <w:vertAlign w:val="baseline"/>
-                              </w:rPr>
-                            </w:r>
-                            <w:r>
-                              <w:rPr>
-                                <w:rFonts w:ascii="Century Gothic" w:cs="Century Gothic" w:eastAsia="Century Gothic" w:hAnsi="Century Gothic"/>
-                                <w:b w:val="1"/>
-                                <w:i w:val="0"/>
-                                <w:smallCaps w:val="0"/>
-                                <w:strike w:val="0"/>
-                                <w:color w:val="1f497d"/>
-                                <w:sz w:val="22"/>
-                                <w:vertAlign w:val="baseline"/>
-                              </w:rPr>
-                              <w:t xml:space="preserve"> Has the candidate worked for Ford as an Agency worker before? (Yes/No)  {{ worked_with_ford_agency_before }}</w:t>
-                            </w:r>
-                          </w:p>
-                          <w:p>
-                            <w:pPr>
-                              <w:spacing w:after="0" w:before="50" w:line="240"/>
-                              <w:ind w:left="0" w:right="0" w:firstLine="0"/>
-                              <w:jc w:val="left"/>
-                              <w:textDirection w:val="btLr"/>
-                            </w:pPr>
-                            <w:r>
-                              <w:rPr>
-                                <w:rFonts w:ascii="Century Gothic" w:cs="Century Gothic" w:eastAsia="Century Gothic" w:hAnsi="Century Gothic"/>
-                                <w:b w:val="1"/>
-                                <w:i w:val="0"/>
-                                <w:smallCaps w:val="0"/>
-                                <w:strike w:val="0"/>
-                                <w:color w:val="1f497d"/>
-                                <w:sz w:val="22"/>
-                                <w:vertAlign w:val="baseline"/>
-                              </w:rPr>
-                            </w:r>
-                          </w:p>
-                          <w:p>
-                            <w:pPr>
-                              <w:spacing w:after="0" w:before="50" w:line="240"/>
-                              <w:ind w:left="720" w:right="0" w:firstLine="720"/>
-                              <w:jc w:val="left"/>
-                              <w:textDirection w:val="btLr"/>
-                            </w:pPr>
-                            <w:r>
-                              <w:rPr>
-                                <w:rFonts w:ascii="Century Gothic" w:cs="Century Gothic" w:eastAsia="Century Gothic" w:hAnsi="Century Gothic"/>
-                                <w:b w:val="1"/>
-                                <w:i w:val="0"/>
-                                <w:smallCaps w:val="0"/>
-                                <w:strike w:val="0"/>
-                                <w:color w:val="1f497d"/>
-                                <w:sz w:val="22"/>
-                                <w:vertAlign w:val="baseline"/>
-                              </w:rPr>
-                            </w:r>
-                            <w:r>
-                              <w:rPr>
-                                <w:rFonts w:ascii="Century Gothic" w:cs="Century Gothic" w:eastAsia="Century Gothic" w:hAnsi="Century Gothic"/>
-                                <w:b w:val="1"/>
-                                <w:i w:val="0"/>
-                                <w:smallCaps w:val="0"/>
-                                <w:strike w:val="0"/>
-                                <w:color w:val="1f497d"/>
-                                <w:sz w:val="22"/>
-                                <w:vertAlign w:val="baseline"/>
-                              </w:rPr>
-                              <w:t xml:space="preserve"> If yes to either of the above, please specify the below details:</w:t>
-                            </w:r>
-                          </w:p>
-                          <w:p>
-                            <w:pPr>
-                              <w:spacing w:after="0" w:before="50" w:line="240"/>
-                              <w:ind w:left="1640" w:right="0" w:firstLine="3080"/>
-                              <w:jc w:val="left"/>
-                              <w:textDirection w:val="btLr"/>
-                            </w:pPr>
-                            <w:r>
-                              <w:rPr>
-                                <w:rFonts w:ascii="Century Gothic" w:cs="Century Gothic" w:eastAsia="Century Gothic" w:hAnsi="Century Gothic"/>
-                                <w:b w:val="1"/>
-                                <w:i w:val="0"/>
-                                <w:smallCaps w:val="0"/>
-                                <w:strike w:val="0"/>
-                                <w:color w:val="1f497d"/>
-                                <w:sz w:val="22"/>
-                                <w:vertAlign w:val="baseline"/>
-                              </w:rPr>
-                            </w:r>
-                            <w:r>
-                              <w:rPr>
-                                <w:rFonts w:ascii="Century Gothic" w:cs="Century Gothic" w:eastAsia="Century Gothic" w:hAnsi="Century Gothic"/>
-                                <w:b w:val="1"/>
-                                <w:i w:val="0"/>
-                                <w:smallCaps w:val="0"/>
-                                <w:strike w:val="0"/>
-                                <w:color w:val="1f497d"/>
-                                <w:sz w:val="22"/>
-                                <w:vertAlign w:val="baseline"/>
-                              </w:rPr>
-                              <w:t xml:space="preserve">CDSID:</w:t>
-                            </w:r>
-                          </w:p>
-                          <w:p>
-                            <w:pPr>
-                              <w:spacing w:after="0" w:before="50" w:line="240"/>
-                              <w:ind w:left="1640" w:right="0" w:firstLine="3080"/>
-                              <w:jc w:val="left"/>
-                              <w:textDirection w:val="btLr"/>
-                            </w:pPr>
-                            <w:r>
-                              <w:rPr>
-                                <w:rFonts w:ascii="Century Gothic" w:cs="Century Gothic" w:eastAsia="Century Gothic" w:hAnsi="Century Gothic"/>
-                                <w:b w:val="1"/>
-                                <w:i w:val="0"/>
-                                <w:smallCaps w:val="0"/>
-                                <w:strike w:val="0"/>
-                                <w:color w:val="1f497d"/>
-                                <w:sz w:val="22"/>
-                                <w:vertAlign w:val="baseline"/>
-                              </w:rPr>
-                            </w:r>
-                            <w:r>
-                              <w:rPr>
-                                <w:rFonts w:ascii="Century Gothic" w:cs="Century Gothic" w:eastAsia="Century Gothic" w:hAnsi="Century Gothic"/>
-                                <w:b w:val="1"/>
-                                <w:i w:val="0"/>
-                                <w:smallCaps w:val="0"/>
-                                <w:strike w:val="0"/>
-                                <w:color w:val="1f497d"/>
-                                <w:sz w:val="22"/>
-                                <w:vertAlign w:val="baseline"/>
-                              </w:rPr>
-                              <w:t xml:space="preserve">Supervisor:</w:t>
-                            </w:r>
-                          </w:p>
-                          <w:p>
-                            <w:pPr>
-                              <w:spacing w:after="0" w:before="50" w:line="240"/>
-                              <w:ind w:left="1640" w:right="0" w:firstLine="3080"/>
-                              <w:jc w:val="left"/>
-                              <w:textDirection w:val="btLr"/>
-                            </w:pPr>
-                            <w:r>
-                              <w:rPr>
-                                <w:rFonts w:ascii="Century Gothic" w:cs="Century Gothic" w:eastAsia="Century Gothic" w:hAnsi="Century Gothic"/>
-                                <w:b w:val="1"/>
-                                <w:i w:val="0"/>
-                                <w:smallCaps w:val="0"/>
-                                <w:strike w:val="0"/>
-                                <w:color w:val="1f497d"/>
-                                <w:sz w:val="22"/>
-                                <w:vertAlign w:val="baseline"/>
-                              </w:rPr>
-                            </w:r>
-                            <w:r>
-                              <w:rPr>
-                                <w:rFonts w:ascii="Century Gothic" w:cs="Century Gothic" w:eastAsia="Century Gothic" w:hAnsi="Century Gothic"/>
-                                <w:b w:val="1"/>
-                                <w:i w:val="0"/>
-                                <w:smallCaps w:val="0"/>
-                                <w:strike w:val="0"/>
-                                <w:color w:val="1f497d"/>
-                                <w:sz w:val="22"/>
-                                <w:vertAlign w:val="baseline"/>
-                              </w:rPr>
-                              <w:t xml:space="preserve">Duration of the Project:</w:t>
-                            </w:r>
-                          </w:p>
-                          <w:p>
-                            <w:pPr>
-                              <w:spacing w:after="0" w:before="50" w:line="240"/>
-                              <w:ind w:left="1640" w:right="0" w:firstLine="3080"/>
-                              <w:jc w:val="left"/>
-                              <w:textDirection w:val="btLr"/>
-                            </w:pPr>
-                            <w:r>
-                              <w:rPr>
-                                <w:rFonts w:ascii="Century Gothic" w:cs="Century Gothic" w:eastAsia="Century Gothic" w:hAnsi="Century Gothic"/>
-                                <w:b w:val="1"/>
-                                <w:i w:val="0"/>
-                                <w:smallCaps w:val="0"/>
-                                <w:strike w:val="0"/>
-                                <w:color w:val="1f497d"/>
-                                <w:sz w:val="22"/>
-                                <w:vertAlign w:val="baseline"/>
-                              </w:rPr>
-                            </w:r>
-                            <w:r>
-                              <w:rPr>
-                                <w:rFonts w:ascii="Century Gothic" w:cs="Century Gothic" w:eastAsia="Century Gothic" w:hAnsi="Century Gothic"/>
-                                <w:b w:val="1"/>
-                                <w:i w:val="0"/>
-                                <w:smallCaps w:val="0"/>
-                                <w:strike w:val="0"/>
-                                <w:color w:val="1f497d"/>
-                                <w:sz w:val="22"/>
-                                <w:vertAlign w:val="baseline"/>
-                              </w:rPr>
-                              <w:t xml:space="preserve">Exit reason:</w:t>
-                            </w:r>
-                          </w:p>
-                          <w:p>
-                            <w:pPr>
-                              <w:spacing w:after="0" w:before="50" w:line="240"/>
-                              <w:ind w:left="0" w:right="0" w:firstLine="0"/>
-                              <w:jc w:val="left"/>
-                              <w:textDirection w:val="btLr"/>
-                            </w:pPr>
-                            <w:r>
-                              <w:rPr>
-                                <w:rFonts w:ascii="Century Gothic" w:cs="Century Gothic" w:eastAsia="Century Gothic" w:hAnsi="Century Gothic"/>
-                                <w:b w:val="1"/>
-                                <w:i w:val="0"/>
-                                <w:smallCaps w:val="0"/>
-                                <w:strike w:val="0"/>
-                                <w:color w:val="1f497d"/>
-                                <w:sz w:val="22"/>
-                                <w:vertAlign w:val="baseline"/>
-                              </w:rPr>
-                            </w:r>
-                          </w:p>
-                          <w:p>
-                            <w:pPr>
-                              <w:spacing w:after="0" w:before="50" w:line="240"/>
-                              <w:ind w:left="0" w:right="0" w:firstLine="0"/>
-                              <w:jc w:val="left"/>
-                              <w:textDirection w:val="btLr"/>
-                            </w:pPr>
-                            <w:r>
-                              <w:rPr>
-                                <w:rFonts w:ascii="Century Gothic" w:cs="Century Gothic" w:eastAsia="Century Gothic" w:hAnsi="Century Gothic"/>
-                                <w:b w:val="1"/>
-                                <w:i w:val="0"/>
-                                <w:smallCaps w:val="0"/>
-                                <w:strike w:val="0"/>
-                                <w:color w:val="1f497d"/>
-                                <w:sz w:val="22"/>
-                                <w:vertAlign w:val="baseline"/>
-                              </w:rPr>
-                            </w:r>
-                            <w:r>
-                              <w:rPr>
-                                <w:rFonts w:ascii="Century Gothic" w:cs="Century Gothic" w:eastAsia="Century Gothic" w:hAnsi="Century Gothic"/>
-                                <w:b w:val="1"/>
-                                <w:i w:val="0"/>
-                                <w:smallCaps w:val="0"/>
-                                <w:strike w:val="0"/>
-                                <w:color w:val="1f497d"/>
-                                <w:sz w:val="22"/>
-                                <w:vertAlign w:val="baseline"/>
-                              </w:rPr>
-                              <w:t xml:space="preserve"> Overall IT Experience: {{ total_experience_years}} Years</w:t>
-                            </w:r>
-                          </w:p>
-                          <w:p>
-                            <w:pPr>
-                              <w:spacing w:after="0" w:before="50" w:line="240"/>
-                              <w:ind w:left="0" w:right="0" w:firstLine="0"/>
-                              <w:jc w:val="left"/>
-                              <w:textDirection w:val="btLr"/>
-                            </w:pPr>
-                            <w:r>
-                              <w:rPr>
-                                <w:rFonts w:ascii="Century Gothic" w:cs="Century Gothic" w:eastAsia="Century Gothic" w:hAnsi="Century Gothic"/>
-                                <w:b w:val="1"/>
-                                <w:i w:val="0"/>
-                                <w:smallCaps w:val="0"/>
-                                <w:strike w:val="0"/>
-                                <w:color w:val="1f497d"/>
-                                <w:sz w:val="22"/>
-                                <w:vertAlign w:val="baseline"/>
-                              </w:rPr>
-                            </w:r>
-                          </w:p>
-                          <w:p>
-                            <w:pPr>
-                              <w:spacing w:after="0" w:before="50" w:line="240"/>
-                              <w:ind w:left="0" w:right="0" w:firstLine="0"/>
-                              <w:jc w:val="left"/>
-                              <w:textDirection w:val="btLr"/>
-                            </w:pPr>
-                            <w:r>
-                              <w:rPr>
-                                <w:rFonts w:ascii="Century Gothic" w:cs="Century Gothic" w:eastAsia="Century Gothic" w:hAnsi="Century Gothic"/>
-                                <w:b w:val="1"/>
-                                <w:i w:val="0"/>
-                                <w:smallCaps w:val="0"/>
-                                <w:strike w:val="0"/>
-                                <w:color w:val="1f497d"/>
-                                <w:sz w:val="22"/>
-                                <w:vertAlign w:val="baseline"/>
-                              </w:rPr>
-                            </w:r>
-                            <w:r>
-                              <w:rPr>
-                                <w:rFonts w:ascii="Century Gothic" w:cs="Century Gothic" w:eastAsia="Century Gothic" w:hAnsi="Century Gothic"/>
-                                <w:b w:val="1"/>
-                                <w:i w:val="0"/>
-                                <w:smallCaps w:val="0"/>
-                                <w:strike w:val="0"/>
-                                <w:color w:val="1f497d"/>
-                                <w:sz w:val="22"/>
-                                <w:vertAlign w:val="baseline"/>
-                              </w:rPr>
-                              <w:t xml:space="preserve"> Experience in Core Skills: {{ relevant_experience_years }} Years</w:t>
-                            </w:r>
-                          </w:p>
-                          <w:p>
-                            <w:pPr>
-                              <w:spacing w:after="0" w:before="50" w:line="240"/>
-                              <w:ind w:left="0" w:right="0" w:firstLine="0"/>
-                              <w:jc w:val="left"/>
-                              <w:textDirection w:val="btLr"/>
-                            </w:pPr>
-                            <w:r>
-                              <w:rPr>
-                                <w:rFonts w:ascii="Century Gothic" w:cs="Century Gothic" w:eastAsia="Century Gothic" w:hAnsi="Century Gothic"/>
-                                <w:b w:val="1"/>
-                                <w:i w:val="0"/>
-                                <w:smallCaps w:val="0"/>
-                                <w:strike w:val="0"/>
-                                <w:color w:val="1f497d"/>
-                                <w:sz w:val="22"/>
-                                <w:vertAlign w:val="baseline"/>
-                              </w:rPr>
-                            </w:r>
-                          </w:p>
-                          <w:p>
-                            <w:pPr>
-                              <w:spacing w:after="0" w:before="50" w:line="240"/>
-                              <w:ind w:left="0" w:right="0" w:firstLine="0"/>
-                              <w:jc w:val="left"/>
-                              <w:textDirection w:val="btLr"/>
-                            </w:pPr>
-                            <w:r>
-                              <w:rPr>
-                                <w:rFonts w:ascii="Century Gothic" w:cs="Century Gothic" w:eastAsia="Century Gothic" w:hAnsi="Century Gothic"/>
-                                <w:b w:val="1"/>
-                                <w:i w:val="0"/>
-                                <w:smallCaps w:val="0"/>
-                                <w:strike w:val="0"/>
-                                <w:color w:val="1f497d"/>
-                                <w:sz w:val="22"/>
-                                <w:vertAlign w:val="baseline"/>
-                              </w:rPr>
-                            </w:r>
-                            <w:r>
-                              <w:rPr>
-                                <w:rFonts w:ascii="Century Gothic" w:cs="Century Gothic" w:eastAsia="Century Gothic" w:hAnsi="Century Gothic"/>
-                                <w:b w:val="1"/>
-                                <w:i w:val="0"/>
-                                <w:smallCaps w:val="0"/>
-                                <w:strike w:val="0"/>
-                                <w:color w:val="1f497d"/>
-                                <w:sz w:val="22"/>
-                                <w:vertAlign w:val="baseline"/>
-                              </w:rPr>
-                              <w:t xml:space="preserve"> Other relevant Qualification/Certifications, if any:</w:t>
-                            </w:r>
-                          </w:p>
-                          <w:p>
-                            <w:pPr>
-                              <w:spacing w:after="0" w:before="50" w:line="240"/>
-                              <w:ind w:left="0" w:right="0" w:firstLine="0"/>
-                              <w:jc w:val="left"/>
-                              <w:textDirection w:val="btLr"/>
-                            </w:pPr>
-                            <w:r>
-                              <w:rPr>
-                                <w:rFonts w:ascii="Century Gothic" w:cs="Century Gothic" w:eastAsia="Century Gothic" w:hAnsi="Century Gothic"/>
-                                <w:b w:val="1"/>
-                                <w:i w:val="0"/>
-                                <w:smallCaps w:val="0"/>
-                                <w:strike w:val="0"/>
-                                <w:color w:val="1f497d"/>
-                                <w:sz w:val="22"/>
-                                <w:vertAlign w:val="baseline"/>
-                              </w:rPr>
-                            </w:r>
-                          </w:p>
-                          <w:p>
-                            <w:pPr>
-                              <w:spacing w:after="0" w:before="50" w:line="240"/>
-                              <w:ind w:left="0" w:right="0" w:firstLine="0"/>
-                              <w:jc w:val="left"/>
-                              <w:textDirection w:val="btLr"/>
-                            </w:pPr>
-                            <w:r>
-                              <w:rPr>
-                                <w:rFonts w:ascii="Century Gothic" w:cs="Century Gothic" w:eastAsia="Century Gothic" w:hAnsi="Century Gothic"/>
-                                <w:b w:val="1"/>
-                                <w:i w:val="0"/>
-                                <w:smallCaps w:val="0"/>
-                                <w:strike w:val="0"/>
-                                <w:color w:val="1f497d"/>
-                                <w:sz w:val="22"/>
-                                <w:vertAlign w:val="baseline"/>
-                              </w:rPr>
-                            </w:r>
-                            <w:r>
-                              <w:rPr>
-                                <w:rFonts w:ascii="Century Gothic" w:cs="Century Gothic" w:eastAsia="Century Gothic" w:hAnsi="Century Gothic"/>
-                                <w:b w:val="1"/>
-                                <w:i w:val="0"/>
-                                <w:smallCaps w:val="0"/>
-                                <w:strike w:val="0"/>
-                                <w:color w:val="1f497d"/>
-                                <w:sz w:val="22"/>
-                                <w:vertAlign w:val="baseline"/>
-                              </w:rPr>
-                              <w:t xml:space="preserve">Hacker rank Score:     {{ hacker_rank_score }}</w:t>
-                            </w:r>
-                          </w:p>
-                          <w:p>
-                            <w:pPr>
-                              <w:spacing w:after="0" w:before="50" w:line="240"/>
-                              <w:ind w:left="0" w:right="0" w:firstLine="0"/>
-                              <w:jc w:val="left"/>
-                              <w:textDirection w:val="btLr"/>
-                            </w:pPr>
-                            <w:r>
-                              <w:rPr>
-                                <w:rFonts w:ascii="Century Gothic" w:cs="Century Gothic" w:eastAsia="Century Gothic" w:hAnsi="Century Gothic"/>
-                                <w:b w:val="1"/>
-                                <w:i w:val="0"/>
-                                <w:smallCaps w:val="0"/>
-                                <w:strike w:val="0"/>
-                                <w:color w:val="1f497d"/>
-                                <w:sz w:val="22"/>
-                                <w:vertAlign w:val="baseline"/>
-                              </w:rPr>
-                            </w:r>
-                          </w:p>
-                          <w:p>
-                            <w:pPr>
-                              <w:spacing w:after="0" w:before="50" w:line="240"/>
-                              <w:ind w:left="0" w:right="0" w:firstLine="0"/>
-                              <w:jc w:val="left"/>
-                              <w:textDirection w:val="btLr"/>
-                            </w:pPr>
-                            <w:r>
-                              <w:rPr>
-                                <w:rFonts w:ascii="Century Gothic" w:cs="Century Gothic" w:eastAsia="Century Gothic" w:hAnsi="Century Gothic"/>
-                                <w:b w:val="1"/>
-                                <w:i w:val="0"/>
-                                <w:smallCaps w:val="0"/>
-                                <w:strike w:val="0"/>
-                                <w:color w:val="1f497d"/>
-                                <w:sz w:val="22"/>
-                                <w:vertAlign w:val="baseline"/>
-                              </w:rPr>
-                            </w:r>
-                          </w:p>
-                          <w:p>
-                            <w:pPr>
-                              <w:spacing w:after="0" w:before="50" w:line="240"/>
-                              <w:ind w:left="0" w:right="0" w:firstLine="0"/>
-                              <w:jc w:val="left"/>
-                              <w:textDirection w:val="btLr"/>
-                            </w:pPr>
-                            <w:r>
-                              <w:rPr>
-                                <w:rFonts w:ascii="Century Gothic" w:cs="Century Gothic" w:eastAsia="Century Gothic" w:hAnsi="Century Gothic"/>
-                                <w:b w:val="1"/>
-                                <w:i w:val="0"/>
-                                <w:smallCaps w:val="0"/>
-                                <w:strike w:val="0"/>
-                                <w:color w:val="1f497d"/>
-                                <w:sz w:val="22"/>
-                                <w:vertAlign w:val="baseline"/>
-                              </w:rPr>
-                            </w:r>
-                          </w:p>
-                          <w:p>
-                            <w:pPr>
-                              <w:spacing w:after="0" w:before="50" w:line="240"/>
-                              <w:ind w:left="0" w:right="0" w:firstLine="0"/>
-                              <w:jc w:val="left"/>
-                              <w:textDirection w:val="btLr"/>
-                            </w:pPr>
-                            <w:r>
-                              <w:rPr>
-                                <w:rFonts w:ascii="Century Gothic" w:cs="Century Gothic" w:eastAsia="Century Gothic" w:hAnsi="Century Gothic"/>
-                                <w:b w:val="1"/>
-                                <w:i w:val="0"/>
-                                <w:smallCaps w:val="0"/>
-                                <w:strike w:val="0"/>
-                                <w:color w:val="1f497d"/>
-                                <w:sz w:val="22"/>
-                                <w:vertAlign w:val="baseline"/>
-                              </w:rPr>
-                            </w:r>
-                          </w:p>
-                          <w:p>
-                            <w:pPr>
-                              <w:spacing w:after="0" w:before="50" w:line="240"/>
-                              <w:ind w:left="0" w:right="0" w:firstLine="0"/>
-                              <w:jc w:val="left"/>
-                              <w:textDirection w:val="btLr"/>
-                            </w:pPr>
-                            <w:r>
-                              <w:rPr>
-                                <w:rFonts w:ascii="Century Gothic" w:cs="Century Gothic" w:eastAsia="Century Gothic" w:hAnsi="Century Gothic"/>
-                                <w:b w:val="1"/>
-                                <w:i w:val="0"/>
-                                <w:smallCaps w:val="0"/>
-                                <w:strike w:val="0"/>
-                                <w:color w:val="1f497d"/>
-                                <w:sz w:val="22"/>
-                                <w:vertAlign w:val="baseline"/>
-                              </w:rPr>
-                            </w:r>
-                          </w:p>
-                          <w:p>
-                            <w:pPr>
-                              <w:spacing w:after="0" w:before="50" w:line="240"/>
-                              <w:ind w:left="0" w:right="0" w:firstLine="0"/>
-                              <w:jc w:val="left"/>
-                              <w:textDirection w:val="btLr"/>
-                            </w:pPr>
-                            <w:r>
-                              <w:rPr>
-                                <w:rFonts w:ascii="Century Gothic" w:cs="Century Gothic" w:eastAsia="Century Gothic" w:hAnsi="Century Gothic"/>
-                                <w:b w:val="1"/>
-                                <w:i w:val="0"/>
-                                <w:smallCaps w:val="0"/>
-                                <w:strike w:val="0"/>
-                                <w:color w:val="1f497d"/>
-                                <w:sz w:val="22"/>
-                                <w:vertAlign w:val="baseline"/>
-                              </w:rPr>
-                            </w:r>
-                          </w:p>
-                          <w:p>
-                            <w:pPr>
-                              <w:spacing w:after="0" w:before="50" w:line="240"/>
-                              <w:ind w:left="0" w:right="0" w:firstLine="0"/>
-                              <w:jc w:val="left"/>
-                              <w:textDirection w:val="btLr"/>
-                            </w:pPr>
-                            <w:r>
-                              <w:rPr>
-                                <w:rFonts w:ascii="Century Gothic" w:cs="Century Gothic" w:eastAsia="Century Gothic" w:hAnsi="Century Gothic"/>
-                                <w:b w:val="1"/>
-                                <w:i w:val="0"/>
-                                <w:smallCaps w:val="0"/>
-                                <w:strike w:val="0"/>
-                                <w:color w:val="1f497d"/>
-                                <w:sz w:val="22"/>
-                                <w:vertAlign w:val="baseline"/>
-                              </w:rPr>
-                            </w:r>
-                          </w:p>
-                          <w:p>
-                            <w:pPr>
-                              <w:spacing w:after="0" w:before="50" w:line="240"/>
-                              <w:ind w:left="103.00000190734863" w:right="0" w:firstLine="103.00000190734863"/>
-                              <w:jc w:val="left"/>
-                              <w:textDirection w:val="btLr"/>
-                            </w:pPr>
-                            <w:r>
-                              <w:rPr>
-                                <w:rFonts w:ascii="Century Gothic" w:cs="Century Gothic" w:eastAsia="Century Gothic" w:hAnsi="Century Gothic"/>
-                                <w:b w:val="1"/>
-                                <w:i w:val="0"/>
-                                <w:smallCaps w:val="0"/>
-                                <w:strike w:val="0"/>
-                                <w:color w:val="1f497d"/>
-                                <w:sz w:val="22"/>
-                                <w:vertAlign w:val="baseline"/>
-                              </w:rPr>
-                            </w:r>
-                          </w:p>
-                        </w:txbxContent>
-                      </wps:txbx>
-                      <wps:bodyPr anchorCtr="0" anchor="t" bIns="0" lIns="0" spcFirstLastPara="1" rIns="0" wrap="square" tIns="0">
-                        <a:noAutofit/>
-                      </wps:bodyPr>
-                    </wps:wsp>
+                      </wpg:grpSpPr>
+                      <wps:wsp>
+                        <wps:cNvSpPr/>
+                        <wps:cNvPr id="2" name="Shape 2"/>
+                        <wps:spPr>
+                          <a:xfrm>
+                            <a:off x="2002650" y="498525"/>
+                            <a:ext cx="6686700" cy="6458400"/>
+                          </a:xfrm>
+                          <a:prstGeom prst="rect">
+                            <a:avLst/>
+                          </a:prstGeom>
+                          <a:noFill/>
+                          <a:ln cap="flat" cmpd="sng" w="9525">
+                            <a:solidFill>
+                              <a:srgbClr val="000000"/>
+                            </a:solidFill>
+                            <a:prstDash val="solid"/>
+                            <a:miter lim="800000"/>
+                            <a:headEnd len="sm" w="sm" type="none"/>
+                            <a:tailEnd len="sm" w="sm" type="none"/>
+                          </a:ln>
+                        </wps:spPr>
+                        <wps:txbx>
+                          <w:txbxContent>
+                            <w:p>
+                              <w:pPr>
+                                <w:spacing w:after="0" w:before="50" w:line="240"/>
+                                <w:ind w:left="0" w:right="0" w:firstLine="0"/>
+                                <w:jc w:val="left"/>
+                                <w:textDirection w:val="btLr"/>
+                              </w:pPr>
+                              <w:r>
+                                <w:rPr>
+                                  <w:rFonts w:ascii="Trebuchet MS" w:cs="Trebuchet MS" w:eastAsia="Trebuchet MS" w:hAnsi="Trebuchet MS"/>
+                                  <w:b w:val="0"/>
+                                  <w:i w:val="0"/>
+                                  <w:smallCaps w:val="0"/>
+                                  <w:strike w:val="0"/>
+                                  <w:color w:val="000000"/>
+                                  <w:sz w:val="20"/>
+                                  <w:vertAlign w:val="baseline"/>
+                                </w:rPr>
+                                <w:t xml:space="preserve"> </w:t>
+                              </w:r>
+                              <w:r>
+                                <w:rPr>
+                                  <w:rFonts w:ascii="Century Gothic" w:cs="Century Gothic" w:eastAsia="Century Gothic" w:hAnsi="Century Gothic"/>
+                                  <w:b w:val="1"/>
+                                  <w:i w:val="0"/>
+                                  <w:smallCaps w:val="0"/>
+                                  <w:strike w:val="0"/>
+                                  <w:color w:val="1f497d"/>
+                                  <w:sz w:val="22"/>
+                                  <w:vertAlign w:val="baseline"/>
+                                </w:rPr>
+                                <w:t xml:space="preserve">Candidate First Name:  {{ first_name }}</w:t>
+                              </w:r>
+                            </w:p>
+                            <w:p>
+                              <w:pPr>
+                                <w:spacing w:after="0" w:before="50" w:line="240"/>
+                                <w:ind w:left="0" w:right="0" w:firstLine="0"/>
+                                <w:jc w:val="left"/>
+                                <w:textDirection w:val="btLr"/>
+                              </w:pPr>
+                              <w:r>
+                                <w:rPr>
+                                  <w:rFonts w:ascii="Century Gothic" w:cs="Century Gothic" w:eastAsia="Century Gothic" w:hAnsi="Century Gothic"/>
+                                  <w:b w:val="1"/>
+                                  <w:i w:val="0"/>
+                                  <w:smallCaps w:val="0"/>
+                                  <w:strike w:val="0"/>
+                                  <w:color w:val="1f497d"/>
+                                  <w:sz w:val="22"/>
+                                  <w:vertAlign w:val="baseline"/>
+                                </w:rPr>
+                              </w:r>
+                              <w:r>
+                                <w:rPr>
+                                  <w:rFonts w:ascii="Century Gothic" w:cs="Century Gothic" w:eastAsia="Century Gothic" w:hAnsi="Century Gothic"/>
+                                  <w:b w:val="1"/>
+                                  <w:i w:val="0"/>
+                                  <w:smallCaps w:val="0"/>
+                                  <w:strike w:val="0"/>
+                                  <w:color w:val="1f497d"/>
+                                  <w:sz w:val="22"/>
+                                  <w:vertAlign w:val="baseline"/>
+                                </w:rPr>
+                                <w:t xml:space="preserve">(As per PAN/Aadhar)</w:t>
+                              </w:r>
+                            </w:p>
+                            <w:p>
+                              <w:pPr>
+                                <w:spacing w:after="0" w:before="50" w:line="240"/>
+                                <w:ind w:left="0" w:right="0" w:firstLine="0"/>
+                                <w:jc w:val="left"/>
+                                <w:textDirection w:val="btLr"/>
+                              </w:pPr>
+                              <w:r>
+                                <w:rPr>
+                                  <w:rFonts w:ascii="Century Gothic" w:cs="Century Gothic" w:eastAsia="Century Gothic" w:hAnsi="Century Gothic"/>
+                                  <w:b w:val="1"/>
+                                  <w:i w:val="0"/>
+                                  <w:smallCaps w:val="0"/>
+                                  <w:strike w:val="0"/>
+                                  <w:color w:val="1f497d"/>
+                                  <w:sz w:val="22"/>
+                                  <w:vertAlign w:val="baseline"/>
+                                </w:rPr>
+                              </w:r>
+                            </w:p>
+                            <w:p>
+                              <w:pPr>
+                                <w:spacing w:after="0" w:before="50" w:line="240"/>
+                                <w:ind w:left="0" w:right="0" w:firstLine="0"/>
+                                <w:jc w:val="left"/>
+                                <w:textDirection w:val="btLr"/>
+                              </w:pPr>
+                              <w:r>
+                                <w:rPr>
+                                  <w:rFonts w:ascii="Century Gothic" w:cs="Century Gothic" w:eastAsia="Century Gothic" w:hAnsi="Century Gothic"/>
+                                  <w:b w:val="1"/>
+                                  <w:i w:val="0"/>
+                                  <w:smallCaps w:val="0"/>
+                                  <w:strike w:val="0"/>
+                                  <w:color w:val="1f497d"/>
+                                  <w:sz w:val="22"/>
+                                  <w:vertAlign w:val="baseline"/>
+                                </w:rPr>
+                              </w:r>
+                              <w:r>
+                                <w:rPr>
+                                  <w:rFonts w:ascii="Century Gothic" w:cs="Century Gothic" w:eastAsia="Century Gothic" w:hAnsi="Century Gothic"/>
+                                  <w:b w:val="1"/>
+                                  <w:i w:val="0"/>
+                                  <w:smallCaps w:val="0"/>
+                                  <w:strike w:val="0"/>
+                                  <w:color w:val="1f497d"/>
+                                  <w:sz w:val="22"/>
+                                  <w:vertAlign w:val="baseline"/>
+                                </w:rPr>
+                                <w:t xml:space="preserve"> Candidate Last Name: {{ last_name }}</w:t>
+                              </w:r>
+                              <w:r>
+                                <w:rPr>
+                                  <w:rFonts w:ascii="Century Gothic" w:cs="Century Gothic" w:eastAsia="Century Gothic" w:hAnsi="Century Gothic"/>
+                                  <w:b w:val="1"/>
+                                  <w:i w:val="0"/>
+                                  <w:smallCaps w:val="0"/>
+                                  <w:strike w:val="0"/>
+                                  <w:color w:val="1f497d"/>
+                                  <w:sz w:val="22"/>
+                                  <w:vertAlign w:val="baseline"/>
+                                </w:rPr>
+                                <w:br w:type="textWrapping"/>
+                              </w:r>
+                              <w:r>
+                                <w:rPr>
+                                  <w:rFonts w:ascii="Century Gothic" w:cs="Century Gothic" w:eastAsia="Century Gothic" w:hAnsi="Century Gothic"/>
+                                  <w:b w:val="1"/>
+                                  <w:i w:val="0"/>
+                                  <w:smallCaps w:val="0"/>
+                                  <w:strike w:val="0"/>
+                                  <w:color w:val="1f497d"/>
+                                  <w:sz w:val="22"/>
+                                  <w:vertAlign w:val="baseline"/>
+                                </w:rPr>
+                                <w:t xml:space="preserve"> (As per PAN/Aadhar)</w:t>
+                              </w:r>
+                            </w:p>
+                            <w:p>
+                              <w:pPr>
+                                <w:spacing w:after="0" w:before="50" w:line="240"/>
+                                <w:ind w:left="0" w:right="0" w:firstLine="0"/>
+                                <w:jc w:val="left"/>
+                                <w:textDirection w:val="btLr"/>
+                              </w:pPr>
+                              <w:r>
+                                <w:rPr>
+                                  <w:rFonts w:ascii="Century Gothic" w:cs="Century Gothic" w:eastAsia="Century Gothic" w:hAnsi="Century Gothic"/>
+                                  <w:b w:val="1"/>
+                                  <w:i w:val="0"/>
+                                  <w:smallCaps w:val="0"/>
+                                  <w:strike w:val="0"/>
+                                  <w:color w:val="1f497d"/>
+                                  <w:sz w:val="22"/>
+                                  <w:vertAlign w:val="baseline"/>
+                                </w:rPr>
+                              </w:r>
+                            </w:p>
+                            <w:p>
+                              <w:pPr>
+                                <w:spacing w:after="0" w:before="50" w:line="240"/>
+                                <w:ind w:left="0" w:right="0" w:firstLine="0"/>
+                                <w:jc w:val="left"/>
+                                <w:textDirection w:val="btLr"/>
+                              </w:pPr>
+                              <w:r>
+                                <w:rPr>
+                                  <w:rFonts w:ascii="Century Gothic" w:cs="Century Gothic" w:eastAsia="Century Gothic" w:hAnsi="Century Gothic"/>
+                                  <w:b w:val="1"/>
+                                  <w:i w:val="0"/>
+                                  <w:smallCaps w:val="0"/>
+                                  <w:strike w:val="0"/>
+                                  <w:color w:val="1f497d"/>
+                                  <w:sz w:val="22"/>
+                                  <w:vertAlign w:val="baseline"/>
+                                </w:rPr>
+                              </w:r>
+                              <w:r>
+                                <w:rPr>
+                                  <w:rFonts w:ascii="Century Gothic" w:cs="Century Gothic" w:eastAsia="Century Gothic" w:hAnsi="Century Gothic"/>
+                                  <w:b w:val="1"/>
+                                  <w:i w:val="0"/>
+                                  <w:smallCaps w:val="0"/>
+                                  <w:strike w:val="0"/>
+                                  <w:color w:val="1f497d"/>
+                                  <w:sz w:val="22"/>
+                                  <w:vertAlign w:val="baseline"/>
+                                </w:rPr>
+                                <w:t xml:space="preserve"> Notice Period of the Candidate: {{ notice_period }}</w:t>
+                              </w:r>
+                            </w:p>
+                            <w:p>
+                              <w:pPr>
+                                <w:spacing w:after="0" w:before="50" w:line="240"/>
+                                <w:ind w:left="0" w:right="0" w:firstLine="0"/>
+                                <w:jc w:val="left"/>
+                                <w:textDirection w:val="btLr"/>
+                              </w:pPr>
+                              <w:r>
+                                <w:rPr>
+                                  <w:rFonts w:ascii="Century Gothic" w:cs="Century Gothic" w:eastAsia="Century Gothic" w:hAnsi="Century Gothic"/>
+                                  <w:b w:val="1"/>
+                                  <w:i w:val="0"/>
+                                  <w:smallCaps w:val="0"/>
+                                  <w:strike w:val="0"/>
+                                  <w:color w:val="1f497d"/>
+                                  <w:sz w:val="22"/>
+                                  <w:vertAlign w:val="baseline"/>
+                                </w:rPr>
+                              </w:r>
+                            </w:p>
+                            <w:p>
+                              <w:pPr>
+                                <w:spacing w:after="0" w:before="50" w:line="240"/>
+                                <w:ind w:left="0" w:right="0" w:firstLine="0"/>
+                                <w:jc w:val="left"/>
+                                <w:textDirection w:val="btLr"/>
+                              </w:pPr>
+                              <w:r>
+                                <w:rPr>
+                                  <w:rFonts w:ascii="Century Gothic" w:cs="Century Gothic" w:eastAsia="Century Gothic" w:hAnsi="Century Gothic"/>
+                                  <w:b w:val="1"/>
+                                  <w:i w:val="0"/>
+                                  <w:smallCaps w:val="0"/>
+                                  <w:strike w:val="0"/>
+                                  <w:color w:val="1f497d"/>
+                                  <w:sz w:val="22"/>
+                                  <w:vertAlign w:val="baseline"/>
+                                </w:rPr>
+                              </w:r>
+                              <w:r>
+                                <w:rPr>
+                                  <w:rFonts w:ascii="Century Gothic" w:cs="Century Gothic" w:eastAsia="Century Gothic" w:hAnsi="Century Gothic"/>
+                                  <w:b w:val="1"/>
+                                  <w:i w:val="0"/>
+                                  <w:smallCaps w:val="0"/>
+                                  <w:strike w:val="0"/>
+                                  <w:color w:val="1f497d"/>
+                                  <w:sz w:val="22"/>
+                                  <w:vertAlign w:val="baseline"/>
+                                </w:rPr>
+                                <w:t xml:space="preserve"> Internal or External Candidate: {{ candidate_type }}</w:t>
+                              </w:r>
+                            </w:p>
+                            <w:p>
+                              <w:pPr>
+                                <w:spacing w:after="0" w:before="50" w:line="240"/>
+                                <w:ind w:left="0" w:right="0" w:firstLine="0"/>
+                                <w:jc w:val="left"/>
+                                <w:textDirection w:val="btLr"/>
+                              </w:pPr>
+                              <w:r>
+                                <w:rPr>
+                                  <w:rFonts w:ascii="Century Gothic" w:cs="Century Gothic" w:eastAsia="Century Gothic" w:hAnsi="Century Gothic"/>
+                                  <w:b w:val="1"/>
+                                  <w:i w:val="0"/>
+                                  <w:smallCaps w:val="0"/>
+                                  <w:strike w:val="0"/>
+                                  <w:color w:val="1f497d"/>
+                                  <w:sz w:val="22"/>
+                                  <w:vertAlign w:val="baseline"/>
+                                </w:rPr>
+                              </w:r>
+                            </w:p>
+                            <w:p>
+                              <w:pPr>
+                                <w:spacing w:after="0" w:before="50" w:line="240"/>
+                                <w:ind w:left="0" w:right="0" w:firstLine="0"/>
+                                <w:jc w:val="left"/>
+                                <w:textDirection w:val="btLr"/>
+                              </w:pPr>
+                              <w:r>
+                                <w:rPr>
+                                  <w:rFonts w:ascii="Century Gothic" w:cs="Century Gothic" w:eastAsia="Century Gothic" w:hAnsi="Century Gothic"/>
+                                  <w:b w:val="1"/>
+                                  <w:i w:val="0"/>
+                                  <w:smallCaps w:val="0"/>
+                                  <w:strike w:val="0"/>
+                                  <w:color w:val="1f497d"/>
+                                  <w:sz w:val="22"/>
+                                  <w:vertAlign w:val="baseline"/>
+                                </w:rPr>
+                              </w:r>
+                              <w:r>
+                                <w:rPr>
+                                  <w:rFonts w:ascii="Century Gothic" w:cs="Century Gothic" w:eastAsia="Century Gothic" w:hAnsi="Century Gothic"/>
+                                  <w:b w:val="1"/>
+                                  <w:i w:val="0"/>
+                                  <w:smallCaps w:val="0"/>
+                                  <w:strike w:val="0"/>
+                                  <w:color w:val="1f497d"/>
+                                  <w:sz w:val="22"/>
+                                  <w:vertAlign w:val="baseline"/>
+                                </w:rPr>
+                                <w:t xml:space="preserve"> Interview Availability Date: {{ interview_availability }}</w:t>
+                              </w:r>
+                            </w:p>
+                            <w:p>
+                              <w:pPr>
+                                <w:spacing w:after="0" w:before="50" w:line="240"/>
+                                <w:ind w:left="0" w:right="0" w:firstLine="0"/>
+                                <w:jc w:val="left"/>
+                                <w:textDirection w:val="btLr"/>
+                              </w:pPr>
+                              <w:r>
+                                <w:rPr>
+                                  <w:rFonts w:ascii="Century Gothic" w:cs="Century Gothic" w:eastAsia="Century Gothic" w:hAnsi="Century Gothic"/>
+                                  <w:b w:val="1"/>
+                                  <w:i w:val="0"/>
+                                  <w:smallCaps w:val="0"/>
+                                  <w:strike w:val="0"/>
+                                  <w:color w:val="1f497d"/>
+                                  <w:sz w:val="22"/>
+                                  <w:vertAlign w:val="baseline"/>
+                                </w:rPr>
+                              </w:r>
+                            </w:p>
+                            <w:p>
+                              <w:pPr>
+                                <w:spacing w:after="0" w:before="50" w:line="240"/>
+                                <w:ind w:left="0" w:right="0" w:firstLine="0"/>
+                                <w:jc w:val="left"/>
+                                <w:textDirection w:val="btLr"/>
+                              </w:pPr>
+                              <w:r>
+                                <w:rPr>
+                                  <w:rFonts w:ascii="Century Gothic" w:cs="Century Gothic" w:eastAsia="Century Gothic" w:hAnsi="Century Gothic"/>
+                                  <w:b w:val="1"/>
+                                  <w:i w:val="0"/>
+                                  <w:smallCaps w:val="0"/>
+                                  <w:strike w:val="0"/>
+                                  <w:color w:val="1f497d"/>
+                                  <w:sz w:val="22"/>
+                                  <w:vertAlign w:val="baseline"/>
+                                </w:rPr>
+                              </w:r>
+                              <w:r>
+                                <w:rPr>
+                                  <w:rFonts w:ascii="Century Gothic" w:cs="Century Gothic" w:eastAsia="Century Gothic" w:hAnsi="Century Gothic"/>
+                                  <w:b w:val="1"/>
+                                  <w:i w:val="0"/>
+                                  <w:smallCaps w:val="0"/>
+                                  <w:strike w:val="0"/>
+                                  <w:color w:val="1f497d"/>
+                                  <w:sz w:val="22"/>
+                                  <w:vertAlign w:val="baseline"/>
+                                </w:rPr>
+                                <w:t xml:space="preserve"> Start Availability Date: {{ start_availability }}</w:t>
+                              </w:r>
+                            </w:p>
+                            <w:p>
+                              <w:pPr>
+                                <w:spacing w:after="0" w:before="50" w:line="240"/>
+                                <w:ind w:left="0" w:right="0" w:firstLine="0"/>
+                                <w:jc w:val="left"/>
+                                <w:textDirection w:val="btLr"/>
+                              </w:pPr>
+                              <w:r>
+                                <w:rPr>
+                                  <w:rFonts w:ascii="Century Gothic" w:cs="Century Gothic" w:eastAsia="Century Gothic" w:hAnsi="Century Gothic"/>
+                                  <w:b w:val="1"/>
+                                  <w:i w:val="0"/>
+                                  <w:smallCaps w:val="0"/>
+                                  <w:strike w:val="0"/>
+                                  <w:color w:val="1f497d"/>
+                                  <w:sz w:val="22"/>
+                                  <w:vertAlign w:val="baseline"/>
+                                </w:rPr>
+                              </w:r>
+                            </w:p>
+                            <w:p>
+                              <w:pPr>
+                                <w:spacing w:after="0" w:before="50" w:line="240"/>
+                                <w:ind w:left="0" w:right="0" w:firstLine="0"/>
+                                <w:jc w:val="left"/>
+                                <w:textDirection w:val="btLr"/>
+                              </w:pPr>
+                              <w:r>
+                                <w:rPr>
+                                  <w:rFonts w:ascii="Century Gothic" w:cs="Century Gothic" w:eastAsia="Century Gothic" w:hAnsi="Century Gothic"/>
+                                  <w:b w:val="1"/>
+                                  <w:i w:val="0"/>
+                                  <w:smallCaps w:val="0"/>
+                                  <w:strike w:val="0"/>
+                                  <w:color w:val="1f497d"/>
+                                  <w:sz w:val="22"/>
+                                  <w:vertAlign w:val="baseline"/>
+                                </w:rPr>
+                              </w:r>
+                              <w:r>
+                                <w:rPr>
+                                  <w:rFonts w:ascii="Century Gothic" w:cs="Century Gothic" w:eastAsia="Century Gothic" w:hAnsi="Century Gothic"/>
+                                  <w:b w:val="1"/>
+                                  <w:i w:val="0"/>
+                                  <w:smallCaps w:val="0"/>
+                                  <w:strike w:val="0"/>
+                                  <w:color w:val="1f497d"/>
+                                  <w:sz w:val="22"/>
+                                  <w:vertAlign w:val="baseline"/>
+                                </w:rPr>
+                                <w:t xml:space="preserve">Has the candidate worked directly for Ford before? (Yes/No) {{ worked_with_ford_before }}</w:t>
+                              </w:r>
+                            </w:p>
+                            <w:p>
+                              <w:pPr>
+                                <w:spacing w:after="0" w:before="50" w:line="240"/>
+                                <w:ind w:left="0" w:right="0" w:firstLine="0"/>
+                                <w:jc w:val="left"/>
+                                <w:textDirection w:val="btLr"/>
+                              </w:pPr>
+                              <w:r>
+                                <w:rPr>
+                                  <w:rFonts w:ascii="Century Gothic" w:cs="Century Gothic" w:eastAsia="Century Gothic" w:hAnsi="Century Gothic"/>
+                                  <w:b w:val="1"/>
+                                  <w:i w:val="0"/>
+                                  <w:smallCaps w:val="0"/>
+                                  <w:strike w:val="0"/>
+                                  <w:color w:val="1f497d"/>
+                                  <w:sz w:val="22"/>
+                                  <w:vertAlign w:val="baseline"/>
+                                </w:rPr>
+                              </w:r>
+                              <w:r>
+                                <w:rPr>
+                                  <w:rFonts w:ascii="Century Gothic" w:cs="Century Gothic" w:eastAsia="Century Gothic" w:hAnsi="Century Gothic"/>
+                                  <w:b w:val="1"/>
+                                  <w:i w:val="0"/>
+                                  <w:smallCaps w:val="0"/>
+                                  <w:strike w:val="0"/>
+                                  <w:color w:val="1f497d"/>
+                                  <w:sz w:val="22"/>
+                                  <w:vertAlign w:val="baseline"/>
+                                </w:rPr>
+                                <w:t xml:space="preserve"> Has the candidate worked for Ford as an Agency worker before? (Yes/No)  {{ worked_with_ford_agency_before }}</w:t>
+                              </w:r>
+                            </w:p>
+                            <w:p>
+                              <w:pPr>
+                                <w:spacing w:after="0" w:before="50" w:line="240"/>
+                                <w:ind w:left="0" w:right="0" w:firstLine="0"/>
+                                <w:jc w:val="left"/>
+                                <w:textDirection w:val="btLr"/>
+                              </w:pPr>
+                              <w:r>
+                                <w:rPr>
+                                  <w:rFonts w:ascii="Century Gothic" w:cs="Century Gothic" w:eastAsia="Century Gothic" w:hAnsi="Century Gothic"/>
+                                  <w:b w:val="1"/>
+                                  <w:i w:val="0"/>
+                                  <w:smallCaps w:val="0"/>
+                                  <w:strike w:val="0"/>
+                                  <w:color w:val="1f497d"/>
+                                  <w:sz w:val="22"/>
+                                  <w:vertAlign w:val="baseline"/>
+                                </w:rPr>
+                              </w:r>
+                            </w:p>
+                            <w:p>
+                              <w:pPr>
+                                <w:spacing w:after="0" w:before="50" w:line="240"/>
+                                <w:ind w:left="720" w:right="0" w:firstLine="1440"/>
+                                <w:jc w:val="left"/>
+                                <w:textDirection w:val="btLr"/>
+                              </w:pPr>
+                              <w:r>
+                                <w:rPr>
+                                  <w:rFonts w:ascii="Century Gothic" w:cs="Century Gothic" w:eastAsia="Century Gothic" w:hAnsi="Century Gothic"/>
+                                  <w:b w:val="1"/>
+                                  <w:i w:val="0"/>
+                                  <w:smallCaps w:val="0"/>
+                                  <w:strike w:val="0"/>
+                                  <w:color w:val="1f497d"/>
+                                  <w:sz w:val="22"/>
+                                  <w:vertAlign w:val="baseline"/>
+                                </w:rPr>
+                              </w:r>
+                              <w:r>
+                                <w:rPr>
+                                  <w:rFonts w:ascii="Century Gothic" w:cs="Century Gothic" w:eastAsia="Century Gothic" w:hAnsi="Century Gothic"/>
+                                  <w:b w:val="1"/>
+                                  <w:i w:val="0"/>
+                                  <w:smallCaps w:val="0"/>
+                                  <w:strike w:val="0"/>
+                                  <w:color w:val="1f497d"/>
+                                  <w:sz w:val="22"/>
+                                  <w:vertAlign w:val="baseline"/>
+                                </w:rPr>
+                                <w:t xml:space="preserve"> If yes to either of the above, please specify the below details:</w:t>
+                              </w:r>
+                            </w:p>
+                            <w:p>
+                              <w:pPr>
+                                <w:spacing w:after="0" w:before="50" w:line="240"/>
+                                <w:ind w:left="1640" w:right="0" w:firstLine="4720"/>
+                                <w:jc w:val="left"/>
+                                <w:textDirection w:val="btLr"/>
+                              </w:pPr>
+                              <w:r>
+                                <w:rPr>
+                                  <w:rFonts w:ascii="Century Gothic" w:cs="Century Gothic" w:eastAsia="Century Gothic" w:hAnsi="Century Gothic"/>
+                                  <w:b w:val="1"/>
+                                  <w:i w:val="0"/>
+                                  <w:smallCaps w:val="0"/>
+                                  <w:strike w:val="0"/>
+                                  <w:color w:val="1f497d"/>
+                                  <w:sz w:val="22"/>
+                                  <w:vertAlign w:val="baseline"/>
+                                </w:rPr>
+                              </w:r>
+                              <w:r>
+                                <w:rPr>
+                                  <w:rFonts w:ascii="Century Gothic" w:cs="Century Gothic" w:eastAsia="Century Gothic" w:hAnsi="Century Gothic"/>
+                                  <w:b w:val="1"/>
+                                  <w:i w:val="0"/>
+                                  <w:smallCaps w:val="0"/>
+                                  <w:strike w:val="0"/>
+                                  <w:color w:val="1f497d"/>
+                                  <w:sz w:val="22"/>
+                                  <w:vertAlign w:val="baseline"/>
+                                </w:rPr>
+                                <w:t xml:space="preserve">CDSID:</w:t>
+                              </w:r>
+                            </w:p>
+                            <w:p>
+                              <w:pPr>
+                                <w:spacing w:after="0" w:before="50" w:line="240"/>
+                                <w:ind w:left="1640" w:right="0" w:firstLine="4720"/>
+                                <w:jc w:val="left"/>
+                                <w:textDirection w:val="btLr"/>
+                              </w:pPr>
+                              <w:r>
+                                <w:rPr>
+                                  <w:rFonts w:ascii="Century Gothic" w:cs="Century Gothic" w:eastAsia="Century Gothic" w:hAnsi="Century Gothic"/>
+                                  <w:b w:val="1"/>
+                                  <w:i w:val="0"/>
+                                  <w:smallCaps w:val="0"/>
+                                  <w:strike w:val="0"/>
+                                  <w:color w:val="1f497d"/>
+                                  <w:sz w:val="22"/>
+                                  <w:vertAlign w:val="baseline"/>
+                                </w:rPr>
+                              </w:r>
+                              <w:r>
+                                <w:rPr>
+                                  <w:rFonts w:ascii="Century Gothic" w:cs="Century Gothic" w:eastAsia="Century Gothic" w:hAnsi="Century Gothic"/>
+                                  <w:b w:val="1"/>
+                                  <w:i w:val="0"/>
+                                  <w:smallCaps w:val="0"/>
+                                  <w:strike w:val="0"/>
+                                  <w:color w:val="1f497d"/>
+                                  <w:sz w:val="22"/>
+                                  <w:vertAlign w:val="baseline"/>
+                                </w:rPr>
+                                <w:t xml:space="preserve">Supervisor:</w:t>
+                              </w:r>
+                            </w:p>
+                            <w:p>
+                              <w:pPr>
+                                <w:spacing w:after="0" w:before="50" w:line="240"/>
+                                <w:ind w:left="1640" w:right="0" w:firstLine="4720"/>
+                                <w:jc w:val="left"/>
+                                <w:textDirection w:val="btLr"/>
+                              </w:pPr>
+                              <w:r>
+                                <w:rPr>
+                                  <w:rFonts w:ascii="Century Gothic" w:cs="Century Gothic" w:eastAsia="Century Gothic" w:hAnsi="Century Gothic"/>
+                                  <w:b w:val="1"/>
+                                  <w:i w:val="0"/>
+                                  <w:smallCaps w:val="0"/>
+                                  <w:strike w:val="0"/>
+                                  <w:color w:val="1f497d"/>
+                                  <w:sz w:val="22"/>
+                                  <w:vertAlign w:val="baseline"/>
+                                </w:rPr>
+                              </w:r>
+                              <w:r>
+                                <w:rPr>
+                                  <w:rFonts w:ascii="Century Gothic" w:cs="Century Gothic" w:eastAsia="Century Gothic" w:hAnsi="Century Gothic"/>
+                                  <w:b w:val="1"/>
+                                  <w:i w:val="0"/>
+                                  <w:smallCaps w:val="0"/>
+                                  <w:strike w:val="0"/>
+                                  <w:color w:val="1f497d"/>
+                                  <w:sz w:val="22"/>
+                                  <w:vertAlign w:val="baseline"/>
+                                </w:rPr>
+                                <w:t xml:space="preserve">Duration of the Project:</w:t>
+                              </w:r>
+                            </w:p>
+                            <w:p>
+                              <w:pPr>
+                                <w:spacing w:after="0" w:before="50" w:line="240"/>
+                                <w:ind w:left="1640" w:right="0" w:firstLine="4720"/>
+                                <w:jc w:val="left"/>
+                                <w:textDirection w:val="btLr"/>
+                              </w:pPr>
+                              <w:r>
+                                <w:rPr>
+                                  <w:rFonts w:ascii="Century Gothic" w:cs="Century Gothic" w:eastAsia="Century Gothic" w:hAnsi="Century Gothic"/>
+                                  <w:b w:val="1"/>
+                                  <w:i w:val="0"/>
+                                  <w:smallCaps w:val="0"/>
+                                  <w:strike w:val="0"/>
+                                  <w:color w:val="1f497d"/>
+                                  <w:sz w:val="22"/>
+                                  <w:vertAlign w:val="baseline"/>
+                                </w:rPr>
+                              </w:r>
+                              <w:r>
+                                <w:rPr>
+                                  <w:rFonts w:ascii="Century Gothic" w:cs="Century Gothic" w:eastAsia="Century Gothic" w:hAnsi="Century Gothic"/>
+                                  <w:b w:val="1"/>
+                                  <w:i w:val="0"/>
+                                  <w:smallCaps w:val="0"/>
+                                  <w:strike w:val="0"/>
+                                  <w:color w:val="1f497d"/>
+                                  <w:sz w:val="22"/>
+                                  <w:vertAlign w:val="baseline"/>
+                                </w:rPr>
+                                <w:t xml:space="preserve">Exit reason:</w:t>
+                              </w:r>
+                            </w:p>
+                            <w:p>
+                              <w:pPr>
+                                <w:spacing w:after="0" w:before="50" w:line="240"/>
+                                <w:ind w:left="0" w:right="0" w:firstLine="0"/>
+                                <w:jc w:val="left"/>
+                                <w:textDirection w:val="btLr"/>
+                              </w:pPr>
+                              <w:r>
+                                <w:rPr>
+                                  <w:rFonts w:ascii="Century Gothic" w:cs="Century Gothic" w:eastAsia="Century Gothic" w:hAnsi="Century Gothic"/>
+                                  <w:b w:val="1"/>
+                                  <w:i w:val="0"/>
+                                  <w:smallCaps w:val="0"/>
+                                  <w:strike w:val="0"/>
+                                  <w:color w:val="1f497d"/>
+                                  <w:sz w:val="22"/>
+                                  <w:vertAlign w:val="baseline"/>
+                                </w:rPr>
+                              </w:r>
+                            </w:p>
+                            <w:p>
+                              <w:pPr>
+                                <w:spacing w:after="0" w:before="50" w:line="240"/>
+                                <w:ind w:left="0" w:right="0" w:firstLine="0"/>
+                                <w:jc w:val="left"/>
+                                <w:textDirection w:val="btLr"/>
+                              </w:pPr>
+                              <w:r>
+                                <w:rPr>
+                                  <w:rFonts w:ascii="Century Gothic" w:cs="Century Gothic" w:eastAsia="Century Gothic" w:hAnsi="Century Gothic"/>
+                                  <w:b w:val="1"/>
+                                  <w:i w:val="0"/>
+                                  <w:smallCaps w:val="0"/>
+                                  <w:strike w:val="0"/>
+                                  <w:color w:val="1f497d"/>
+                                  <w:sz w:val="22"/>
+                                  <w:vertAlign w:val="baseline"/>
+                                </w:rPr>
+                              </w:r>
+                              <w:r>
+                                <w:rPr>
+                                  <w:rFonts w:ascii="Century Gothic" w:cs="Century Gothic" w:eastAsia="Century Gothic" w:hAnsi="Century Gothic"/>
+                                  <w:b w:val="1"/>
+                                  <w:i w:val="0"/>
+                                  <w:smallCaps w:val="0"/>
+                                  <w:strike w:val="0"/>
+                                  <w:color w:val="1f497d"/>
+                                  <w:sz w:val="22"/>
+                                  <w:vertAlign w:val="baseline"/>
+                                </w:rPr>
+                                <w:t xml:space="preserve"> Overall IT Experience: {{ total_experience_years}} Years</w:t>
+                              </w:r>
+                            </w:p>
+                            <w:p>
+                              <w:pPr>
+                                <w:spacing w:after="0" w:before="50" w:line="240"/>
+                                <w:ind w:left="0" w:right="0" w:firstLine="0"/>
+                                <w:jc w:val="left"/>
+                                <w:textDirection w:val="btLr"/>
+                              </w:pPr>
+                              <w:r>
+                                <w:rPr>
+                                  <w:rFonts w:ascii="Century Gothic" w:cs="Century Gothic" w:eastAsia="Century Gothic" w:hAnsi="Century Gothic"/>
+                                  <w:b w:val="1"/>
+                                  <w:i w:val="0"/>
+                                  <w:smallCaps w:val="0"/>
+                                  <w:strike w:val="0"/>
+                                  <w:color w:val="1f497d"/>
+                                  <w:sz w:val="22"/>
+                                  <w:vertAlign w:val="baseline"/>
+                                </w:rPr>
+                              </w:r>
+                            </w:p>
+                            <w:p>
+                              <w:pPr>
+                                <w:spacing w:after="0" w:before="50" w:line="240"/>
+                                <w:ind w:left="0" w:right="0" w:firstLine="0"/>
+                                <w:jc w:val="left"/>
+                                <w:textDirection w:val="btLr"/>
+                              </w:pPr>
+                              <w:r>
+                                <w:rPr>
+                                  <w:rFonts w:ascii="Century Gothic" w:cs="Century Gothic" w:eastAsia="Century Gothic" w:hAnsi="Century Gothic"/>
+                                  <w:b w:val="1"/>
+                                  <w:i w:val="0"/>
+                                  <w:smallCaps w:val="0"/>
+                                  <w:strike w:val="0"/>
+                                  <w:color w:val="1f497d"/>
+                                  <w:sz w:val="22"/>
+                                  <w:vertAlign w:val="baseline"/>
+                                </w:rPr>
+                              </w:r>
+                              <w:r>
+                                <w:rPr>
+                                  <w:rFonts w:ascii="Century Gothic" w:cs="Century Gothic" w:eastAsia="Century Gothic" w:hAnsi="Century Gothic"/>
+                                  <w:b w:val="1"/>
+                                  <w:i w:val="0"/>
+                                  <w:smallCaps w:val="0"/>
+                                  <w:strike w:val="0"/>
+                                  <w:color w:val="1f497d"/>
+                                  <w:sz w:val="22"/>
+                                  <w:vertAlign w:val="baseline"/>
+                                </w:rPr>
+                                <w:t xml:space="preserve"> Experience in Core Skills: {{ relevant_experience_years }} Years</w:t>
+                              </w:r>
+                            </w:p>
+                            <w:p>
+                              <w:pPr>
+                                <w:spacing w:after="0" w:before="50" w:line="240"/>
+                                <w:ind w:left="0" w:right="0" w:firstLine="0"/>
+                                <w:jc w:val="left"/>
+                                <w:textDirection w:val="btLr"/>
+                              </w:pPr>
+                              <w:r>
+                                <w:rPr>
+                                  <w:rFonts w:ascii="Century Gothic" w:cs="Century Gothic" w:eastAsia="Century Gothic" w:hAnsi="Century Gothic"/>
+                                  <w:b w:val="1"/>
+                                  <w:i w:val="0"/>
+                                  <w:smallCaps w:val="0"/>
+                                  <w:strike w:val="0"/>
+                                  <w:color w:val="1f497d"/>
+                                  <w:sz w:val="22"/>
+                                  <w:vertAlign w:val="baseline"/>
+                                </w:rPr>
+                              </w:r>
+                            </w:p>
+                            <w:p>
+                              <w:pPr>
+                                <w:spacing w:after="0" w:before="50" w:line="240"/>
+                                <w:ind w:left="0" w:right="0" w:firstLine="0"/>
+                                <w:jc w:val="left"/>
+                                <w:textDirection w:val="btLr"/>
+                              </w:pPr>
+                              <w:r>
+                                <w:rPr>
+                                  <w:rFonts w:ascii="Century Gothic" w:cs="Century Gothic" w:eastAsia="Century Gothic" w:hAnsi="Century Gothic"/>
+                                  <w:b w:val="1"/>
+                                  <w:i w:val="0"/>
+                                  <w:smallCaps w:val="0"/>
+                                  <w:strike w:val="0"/>
+                                  <w:color w:val="1f497d"/>
+                                  <w:sz w:val="22"/>
+                                  <w:vertAlign w:val="baseline"/>
+                                </w:rPr>
+                              </w:r>
+                              <w:r>
+                                <w:rPr>
+                                  <w:rFonts w:ascii="Century Gothic" w:cs="Century Gothic" w:eastAsia="Century Gothic" w:hAnsi="Century Gothic"/>
+                                  <w:b w:val="1"/>
+                                  <w:i w:val="0"/>
+                                  <w:smallCaps w:val="0"/>
+                                  <w:strike w:val="0"/>
+                                  <w:color w:val="1f497d"/>
+                                  <w:sz w:val="22"/>
+                                  <w:vertAlign w:val="baseline"/>
+                                </w:rPr>
+                                <w:t xml:space="preserve"> Other relevant Qualification/Certifications, if any:</w:t>
+                              </w:r>
+                            </w:p>
+                            <w:p>
+                              <w:pPr>
+                                <w:spacing w:after="0" w:before="50" w:line="240"/>
+                                <w:ind w:left="0" w:right="0" w:firstLine="0"/>
+                                <w:jc w:val="left"/>
+                                <w:textDirection w:val="btLr"/>
+                              </w:pPr>
+                              <w:r>
+                                <w:rPr>
+                                  <w:rFonts w:ascii="Century Gothic" w:cs="Century Gothic" w:eastAsia="Century Gothic" w:hAnsi="Century Gothic"/>
+                                  <w:b w:val="1"/>
+                                  <w:i w:val="0"/>
+                                  <w:smallCaps w:val="0"/>
+                                  <w:strike w:val="0"/>
+                                  <w:color w:val="1f497d"/>
+                                  <w:sz w:val="22"/>
+                                  <w:vertAlign w:val="baseline"/>
+                                </w:rPr>
+                              </w:r>
+                            </w:p>
+                            <w:p>
+                              <w:pPr>
+                                <w:spacing w:after="0" w:before="50" w:line="240"/>
+                                <w:ind w:left="0" w:right="0" w:firstLine="0"/>
+                                <w:jc w:val="left"/>
+                                <w:textDirection w:val="btLr"/>
+                              </w:pPr>
+                              <w:r>
+                                <w:rPr>
+                                  <w:rFonts w:ascii="Century Gothic" w:cs="Century Gothic" w:eastAsia="Century Gothic" w:hAnsi="Century Gothic"/>
+                                  <w:b w:val="1"/>
+                                  <w:i w:val="0"/>
+                                  <w:smallCaps w:val="0"/>
+                                  <w:strike w:val="0"/>
+                                  <w:color w:val="1f497d"/>
+                                  <w:sz w:val="22"/>
+                                  <w:vertAlign w:val="baseline"/>
+                                </w:rPr>
+                              </w:r>
+                              <w:r>
+                                <w:rPr>
+                                  <w:rFonts w:ascii="Century Gothic" w:cs="Century Gothic" w:eastAsia="Century Gothic" w:hAnsi="Century Gothic"/>
+                                  <w:b w:val="1"/>
+                                  <w:i w:val="0"/>
+                                  <w:smallCaps w:val="0"/>
+                                  <w:strike w:val="0"/>
+                                  <w:color w:val="1f497d"/>
+                                  <w:sz w:val="22"/>
+                                  <w:vertAlign w:val="baseline"/>
+                                </w:rPr>
+                                <w:t xml:space="preserve">Hacker rank Score:     {{ hacker_rank_score }}</w:t>
+                              </w:r>
+                            </w:p>
+                            <w:p>
+                              <w:pPr>
+                                <w:spacing w:after="0" w:before="50" w:line="240"/>
+                                <w:ind w:left="0" w:right="0" w:firstLine="0"/>
+                                <w:jc w:val="left"/>
+                                <w:textDirection w:val="btLr"/>
+                              </w:pPr>
+                              <w:r>
+                                <w:rPr>
+                                  <w:rFonts w:ascii="Century Gothic" w:cs="Century Gothic" w:eastAsia="Century Gothic" w:hAnsi="Century Gothic"/>
+                                  <w:b w:val="1"/>
+                                  <w:i w:val="0"/>
+                                  <w:smallCaps w:val="0"/>
+                                  <w:strike w:val="0"/>
+                                  <w:color w:val="1f497d"/>
+                                  <w:sz w:val="22"/>
+                                  <w:vertAlign w:val="baseline"/>
+                                </w:rPr>
+                              </w:r>
+                            </w:p>
+                            <w:p>
+                              <w:pPr>
+                                <w:spacing w:after="0" w:before="50" w:line="240"/>
+                                <w:ind w:left="0" w:right="0" w:firstLine="0"/>
+                                <w:jc w:val="left"/>
+                                <w:textDirection w:val="btLr"/>
+                              </w:pPr>
+                              <w:r>
+                                <w:rPr>
+                                  <w:rFonts w:ascii="Century Gothic" w:cs="Century Gothic" w:eastAsia="Century Gothic" w:hAnsi="Century Gothic"/>
+                                  <w:b w:val="1"/>
+                                  <w:i w:val="0"/>
+                                  <w:smallCaps w:val="0"/>
+                                  <w:strike w:val="0"/>
+                                  <w:color w:val="1f497d"/>
+                                  <w:sz w:val="22"/>
+                                  <w:vertAlign w:val="baseline"/>
+                                </w:rPr>
+                              </w:r>
+                            </w:p>
+                            <w:p>
+                              <w:pPr>
+                                <w:spacing w:after="0" w:before="50" w:line="240"/>
+                                <w:ind w:left="0" w:right="0" w:firstLine="0"/>
+                                <w:jc w:val="left"/>
+                                <w:textDirection w:val="btLr"/>
+                              </w:pPr>
+                              <w:r>
+                                <w:rPr>
+                                  <w:rFonts w:ascii="Century Gothic" w:cs="Century Gothic" w:eastAsia="Century Gothic" w:hAnsi="Century Gothic"/>
+                                  <w:b w:val="1"/>
+                                  <w:i w:val="0"/>
+                                  <w:smallCaps w:val="0"/>
+                                  <w:strike w:val="0"/>
+                                  <w:color w:val="1f497d"/>
+                                  <w:sz w:val="22"/>
+                                  <w:vertAlign w:val="baseline"/>
+                                </w:rPr>
+                              </w:r>
+                            </w:p>
+                            <w:p>
+                              <w:pPr>
+                                <w:spacing w:after="0" w:before="50" w:line="240"/>
+                                <w:ind w:left="0" w:right="0" w:firstLine="0"/>
+                                <w:jc w:val="left"/>
+                                <w:textDirection w:val="btLr"/>
+                              </w:pPr>
+                              <w:r>
+                                <w:rPr>
+                                  <w:rFonts w:ascii="Century Gothic" w:cs="Century Gothic" w:eastAsia="Century Gothic" w:hAnsi="Century Gothic"/>
+                                  <w:b w:val="1"/>
+                                  <w:i w:val="0"/>
+                                  <w:smallCaps w:val="0"/>
+                                  <w:strike w:val="0"/>
+                                  <w:color w:val="1f497d"/>
+                                  <w:sz w:val="22"/>
+                                  <w:vertAlign w:val="baseline"/>
+                                </w:rPr>
+                              </w:r>
+                            </w:p>
+                            <w:p>
+                              <w:pPr>
+                                <w:spacing w:after="0" w:before="50" w:line="240"/>
+                                <w:ind w:left="0" w:right="0" w:firstLine="0"/>
+                                <w:jc w:val="left"/>
+                                <w:textDirection w:val="btLr"/>
+                              </w:pPr>
+                              <w:r>
+                                <w:rPr>
+                                  <w:rFonts w:ascii="Century Gothic" w:cs="Century Gothic" w:eastAsia="Century Gothic" w:hAnsi="Century Gothic"/>
+                                  <w:b w:val="1"/>
+                                  <w:i w:val="0"/>
+                                  <w:smallCaps w:val="0"/>
+                                  <w:strike w:val="0"/>
+                                  <w:color w:val="1f497d"/>
+                                  <w:sz w:val="22"/>
+                                  <w:vertAlign w:val="baseline"/>
+                                </w:rPr>
+                              </w:r>
+                            </w:p>
+                            <w:p>
+                              <w:pPr>
+                                <w:spacing w:after="0" w:before="50" w:line="240"/>
+                                <w:ind w:left="0" w:right="0" w:firstLine="0"/>
+                                <w:jc w:val="left"/>
+                                <w:textDirection w:val="btLr"/>
+                              </w:pPr>
+                              <w:r>
+                                <w:rPr>
+                                  <w:rFonts w:ascii="Century Gothic" w:cs="Century Gothic" w:eastAsia="Century Gothic" w:hAnsi="Century Gothic"/>
+                                  <w:b w:val="1"/>
+                                  <w:i w:val="0"/>
+                                  <w:smallCaps w:val="0"/>
+                                  <w:strike w:val="0"/>
+                                  <w:color w:val="1f497d"/>
+                                  <w:sz w:val="22"/>
+                                  <w:vertAlign w:val="baseline"/>
+                                </w:rPr>
+                              </w:r>
+                            </w:p>
+                            <w:p>
+                              <w:pPr>
+                                <w:spacing w:after="0" w:before="50" w:line="240"/>
+                                <w:ind w:left="0" w:right="0" w:firstLine="0"/>
+                                <w:jc w:val="left"/>
+                                <w:textDirection w:val="btLr"/>
+                              </w:pPr>
+                              <w:r>
+                                <w:rPr>
+                                  <w:rFonts w:ascii="Century Gothic" w:cs="Century Gothic" w:eastAsia="Century Gothic" w:hAnsi="Century Gothic"/>
+                                  <w:b w:val="1"/>
+                                  <w:i w:val="0"/>
+                                  <w:smallCaps w:val="0"/>
+                                  <w:strike w:val="0"/>
+                                  <w:color w:val="1f497d"/>
+                                  <w:sz w:val="22"/>
+                                  <w:vertAlign w:val="baseline"/>
+                                </w:rPr>
+                              </w:r>
+                            </w:p>
+                            <w:p>
+                              <w:pPr>
+                                <w:spacing w:after="0" w:before="50" w:line="240"/>
+                                <w:ind w:left="103.00000190734863" w:right="0" w:firstLine="206.00000381469727"/>
+                                <w:jc w:val="left"/>
+                                <w:textDirection w:val="btLr"/>
+                              </w:pPr>
+                              <w:r>
+                                <w:rPr>
+                                  <w:rFonts w:ascii="Century Gothic" w:cs="Century Gothic" w:eastAsia="Century Gothic" w:hAnsi="Century Gothic"/>
+                                  <w:b w:val="1"/>
+                                  <w:i w:val="0"/>
+                                  <w:smallCaps w:val="0"/>
+                                  <w:strike w:val="0"/>
+                                  <w:color w:val="1f497d"/>
+                                  <w:sz w:val="22"/>
+                                  <w:vertAlign w:val="baseline"/>
+                                </w:rPr>
+                              </w:r>
+                            </w:p>
+                          </w:txbxContent>
+                        </wps:txbx>
+                        <wps:bodyPr anchorCtr="0" anchor="t" bIns="0" lIns="0" spcFirstLastPara="1" rIns="0" wrap="square" tIns="0">
+                          <a:noAutofit/>
+                        </wps:bodyPr>
+                      </wps:wsp>
+                      <wps:wsp>
+                        <wps:cNvSpPr/>
+                        <wps:cNvPr id="3" name="Shape 3"/>
+                        <wps:spPr>
+                          <a:xfrm>
+                            <a:off x="6438525" y="753100"/>
+                            <a:ext cx="1941300" cy="2004900"/>
+                          </a:xfrm>
+                          <a:prstGeom prst="rect">
+                            <a:avLst/>
+                          </a:prstGeom>
+                          <a:noFill/>
+                          <a:ln cap="flat" cmpd="sng" w="9525">
+                            <a:solidFill>
+                              <a:srgbClr val="000000"/>
+                            </a:solidFill>
+                            <a:prstDash val="solid"/>
+                            <a:miter lim="8000"/>
+                            <a:headEnd len="sm" w="sm" type="none"/>
+                            <a:tailEnd len="sm" w="sm" type="none"/>
+                          </a:ln>
+                        </wps:spPr>
+                        <wps:txbx>
+                          <w:txbxContent>
+                            <w:p>
+                              <w:pPr>
+                                <w:spacing w:after="0" w:before="0" w:line="240"/>
+                                <w:ind w:left="0" w:right="0" w:firstLine="0"/>
+                                <w:jc w:val="center"/>
+                                <w:textDirection w:val="btLr"/>
+                              </w:pPr>
+                            </w:p>
+                            <w:p>
+                              <w:pPr>
+                                <w:spacing w:after="0" w:before="0" w:line="240"/>
+                                <w:ind w:left="0" w:right="0" w:firstLine="0"/>
+                                <w:jc w:val="center"/>
+                                <w:textDirection w:val="btLr"/>
+                              </w:pPr>
+                              <w:r>
+                                <w:rPr>
+                                  <w:rFonts w:ascii="Arial" w:cs="Arial" w:eastAsia="Arial" w:hAnsi="Arial"/>
+                                  <w:b w:val="0"/>
+                                  <w:i w:val="0"/>
+                                  <w:smallCaps w:val="0"/>
+                                  <w:strike w:val="0"/>
+                                  <w:color w:val="000000"/>
+                                  <w:sz w:val="28"/>
+                                  <w:vertAlign w:val="baseline"/>
+                                </w:rPr>
+                              </w:r>
+                            </w:p>
+                            <w:p>
+                              <w:pPr>
+                                <w:spacing w:after="0" w:before="0" w:line="240"/>
+                                <w:ind w:left="0" w:right="0" w:firstLine="0"/>
+                                <w:jc w:val="left"/>
+                                <w:textDirection w:val="btLr"/>
+                              </w:pPr>
+                              <w:r>
+                                <w:rPr>
+                                  <w:rFonts w:ascii="Arial" w:cs="Arial" w:eastAsia="Arial" w:hAnsi="Arial"/>
+                                  <w:b w:val="0"/>
+                                  <w:i w:val="0"/>
+                                  <w:smallCaps w:val="0"/>
+                                  <w:strike w:val="0"/>
+                                  <w:color w:val="000000"/>
+                                  <w:sz w:val="28"/>
+                                  <w:vertAlign w:val="baseline"/>
+                                </w:rPr>
+                              </w:r>
+                            </w:p>
+                            <w:p>
+                              <w:pPr>
+                                <w:spacing w:after="0" w:before="0" w:line="240"/>
+                                <w:ind w:left="0" w:right="0" w:firstLine="0"/>
+                                <w:jc w:val="left"/>
+                                <w:textDirection w:val="btLr"/>
+                              </w:pPr>
+                              <w:r>
+                                <w:rPr>
+                                  <w:rFonts w:ascii="Arial" w:cs="Arial" w:eastAsia="Arial" w:hAnsi="Arial"/>
+                                  <w:b w:val="0"/>
+                                  <w:i w:val="0"/>
+                                  <w:smallCaps w:val="0"/>
+                                  <w:strike w:val="0"/>
+                                  <w:color w:val="000000"/>
+                                  <w:sz w:val="28"/>
+                                  <w:vertAlign w:val="baseline"/>
+                                </w:rPr>
+                              </w:r>
+                            </w:p>
+                            <w:p>
+                              <w:pPr>
+                                <w:spacing w:after="0" w:before="0" w:line="240"/>
+                                <w:ind w:left="0" w:right="0" w:firstLine="0"/>
+                                <w:jc w:val="left"/>
+                                <w:textDirection w:val="btLr"/>
+                              </w:pPr>
+                              <w:r>
+                                <w:rPr>
+                                  <w:rFonts w:ascii="Arial" w:cs="Arial" w:eastAsia="Arial" w:hAnsi="Arial"/>
+                                  <w:b w:val="0"/>
+                                  <w:i w:val="0"/>
+                                  <w:smallCaps w:val="0"/>
+                                  <w:strike w:val="0"/>
+                                  <w:color w:val="000000"/>
+                                  <w:sz w:val="28"/>
+                                  <w:vertAlign w:val="baseline"/>
+                                </w:rPr>
+                              </w:r>
+                              <w:r>
+                                <w:rPr>
+                                  <w:rFonts w:ascii="Arial" w:cs="Arial" w:eastAsia="Arial" w:hAnsi="Arial"/>
+                                  <w:b w:val="0"/>
+                                  <w:i w:val="0"/>
+                                  <w:smallCaps w:val="0"/>
+                                  <w:strike w:val="0"/>
+                                  <w:color w:val="000000"/>
+                                  <w:sz w:val="28"/>
+                                  <w:vertAlign w:val="baseline"/>
+                                </w:rPr>
+                                <w:t xml:space="preserve"> {{candidate_photo}}</w:t>
+                              </w:r>
+                            </w:p>
+                          </w:txbxContent>
+                        </wps:txbx>
+                        <wps:bodyPr anchorCtr="0" anchor="t" bIns="91425" lIns="91425" spcFirstLastPara="1" rIns="91425" wrap="square" tIns="91425">
+                          <a:noAutofit/>
+                        </wps:bodyPr>
+                      </wps:wsp>
+                    </wpg:wgp>
                   </a:graphicData>
                 </a:graphic>
               </wp:inline>
@@ -1186,9 +1353,9 @@
           <mc:Fallback>
             <w:drawing>
               <wp:inline distB="0" distT="0" distL="0" distR="0">
-                <wp:extent cx="6705600" cy="6793277"/>
+                <wp:extent cx="6715125" cy="7077589"/>
                 <wp:effectExtent b="0" l="0" r="0" t="0"/>
-                <wp:docPr id="221" name="image3.png"/>
+                <wp:docPr id="224" name="image3.png"/>
                 <a:graphic>
                   <a:graphicData uri="http://schemas.openxmlformats.org/drawingml/2006/picture">
                     <pic:pic>
@@ -1206,7 +1373,7 @@
                       <pic:spPr>
                         <a:xfrm>
                           <a:off x="0" y="0"/>
-                          <a:ext cx="6705600" cy="6793277"/>
+                          <a:ext cx="6715125" cy="7077589"/>
                         </a:xfrm>
                         <a:prstGeom prst="rect"/>
                         <a:ln/>
@@ -1439,7 +1606,7 @@
           <w:color w:val="1f497d"/>
           <w:rtl w:val="0"/>
         </w:rPr>
-        <w:t xml:space="preserve">{%- for skill in skills %}</w:t>
+        <w:t xml:space="preserve">{%- for skill in relevant_skills %}</w:t>
       </w:r>
     </w:p>
     <w:p>
@@ -2206,6 +2373,11 @@
         </w:rPr>
         <w:t xml:space="preserve">{{csum}}</w:t>
       </w:r>
+      <w:r>
+        <w:rPr>
+          <w:rtl w:val="0"/>
+        </w:rPr>
+      </w:r>
     </w:p>
     <w:p>
       <w:pPr>
@@ -2319,6 +2491,11 @@
         </w:rPr>
         <w:t xml:space="preserve">{{edu.degree}} in {{edu.field_of_study}} from {{edu.institution}} Graduated: {{edu.graduation_date}}</w:t>
       </w:r>
+      <w:r>
+        <w:rPr>
+          <w:rtl w:val="0"/>
+        </w:rPr>
+      </w:r>
     </w:p>
     <w:p>
       <w:pPr>
@@ -2447,6 +2624,11 @@
           <w:rtl w:val="0"/>
         </w:rPr>
         <w:t xml:space="preserve"> {{skill.skills | join(", ")}}</w:t>
+      </w:r>
+      <w:r>
+        <w:rPr>
+          <w:rtl w:val="0"/>
+        </w:rPr>
       </w:r>
     </w:p>
     <w:p>
@@ -2747,6 +2929,11 @@
           <w:rtl w:val="0"/>
         </w:rPr>
         <w:t xml:space="preserve">   {{resp }}</w:t>
+      </w:r>
+      <w:r>
+        <w:rPr>
+          <w:rtl w:val="0"/>
+        </w:rPr>
       </w:r>
     </w:p>
     <w:p>
@@ -3009,7 +3196,7 @@
           <wp:extent cx="1720850" cy="676910"/>
           <wp:effectExtent b="0" l="0" r="0" t="0"/>
           <wp:wrapNone/>
-          <wp:docPr descr="Logo, company name&#10;&#10;Description automatically generated" id="223" name="image1.jpg"/>
+          <wp:docPr descr="Logo, company name&#10;&#10;Description automatically generated" id="225" name="image1.jpg"/>
           <a:graphic>
             <a:graphicData uri="http://schemas.openxmlformats.org/drawingml/2006/picture">
               <pic:pic>
@@ -3095,7 +3282,7 @@
         <wp:inline distB="0" distT="0" distL="0" distR="0">
           <wp:extent cx="1295118" cy="570955"/>
           <wp:effectExtent b="0" l="0" r="0" t="0"/>
-          <wp:docPr descr="A blue logo with white text&#10;&#10;Description automatically generated with low confidence" id="222" name="image2.png"/>
+          <wp:docPr descr="A blue logo with white text&#10;&#10;Description automatically generated with low confidence" id="226" name="image2.png"/>
           <a:graphic>
             <a:graphicData uri="http://schemas.openxmlformats.org/drawingml/2006/picture">
               <pic:pic>
@@ -3911,6 +4098,20 @@
       <w:sz w:val="72"/>
       <w:szCs w:val="72"/>
     </w:rPr>
+  </w:style>
+  <w:style w:type="table" w:styleId="TableNormal" w:default="1">
+    <w:name w:val="TableNormal"/>
+    <w:tblPr>
+      <w:tblCellMar>
+        <w:top w:w="100.0" w:type="dxa"/>
+        <w:left w:w="100.0" w:type="dxa"/>
+        <w:bottom w:w="100.0" w:type="dxa"/>
+        <w:right w:w="100.0" w:type="dxa"/>
+      </w:tblCellMar>
+    </w:tblPr>
+  </w:style>
+  <w:style w:type="paragraph" w:styleId="Normal" w:default="1">
+    <w:name w:val="normal"/>
   </w:style>
   <w:style w:type="table" w:styleId="TableNormal" w:default="1">
     <w:name w:val="TableNormal"/>
@@ -4529,7 +4730,7 @@
 
 <file path=customXML/item1.xml><?xml version="1.0" encoding="utf-8"?>
 <go:gDocsCustomXmlDataStorage xmlns:go="http://customooxmlschemas.google.com/" xmlns:r="http://schemas.openxmlformats.org/officeDocument/2006/relationships" uri="GoogleDocsCustomDataVersion2">
-  <go:docsCustomData xmlns:go="http://customooxmlschemas.google.com/" roundtripDataSignature="AMtx7mj7d6qUFYx50gvp3PxEoUjN2IyIqw==">CgMxLjA4AHIhMUtfc1pwSDAxOEFJT25EZEZYWUd4ZTZrY25uOS1vVEhu</go:docsCustomData>
+  <go:docsCustomData xmlns:go="http://customooxmlschemas.google.com/" roundtripDataSignature="AMtx7mg79WFRJwe38+9g6GJbw2noz4C/lQ==">CgMxLjA4AHIhMWYzclR2WExNUFhFWkdPaWpOREZJZ2F1b0NFN3hyMUpo</go:docsCustomData>
 </go:gDocsCustomXmlDataStorage>
 </file>
 

</xml_diff>

<commit_message>
Enable RBAC and fix format issues
</commit_message>
<xml_diff>
--- a/templates/ford-india-resume-template.docx
+++ b/templates/ford-india-resume-template.docx
@@ -45,31 +45,6 @@
             <o:lock v:ext="edit" shapetype="t" text="t"/>
           </v:shapetype>
         </w:pict>
-      </w:r>
-    </w:p>
-    <w:p>
-      <w:pPr>
-        <w:keepNext w:val="0"/>
-        <w:keepLines w:val="0"/>
-        <w:pageBreakBefore w:val="0"/>
-        <w:widowControl w:val="0"/>
-        <w:pBdr>
-          <w:top w:space="0" w:sz="0" w:val="nil"/>
-          <w:left w:space="0" w:sz="0" w:val="nil"/>
-          <w:bottom w:space="0" w:sz="0" w:val="nil"/>
-          <w:right w:space="0" w:sz="0" w:val="nil"/>
-          <w:between w:space="0" w:sz="0" w:val="nil"/>
-        </w:pBdr>
-        <w:shd w:fill="auto" w:val="clear"/>
-        <w:spacing w:after="0" w:before="0" w:line="276" w:lineRule="auto"/>
-        <w:ind w:left="0" w:right="0" w:firstLine="0"/>
-        <w:jc w:val="left"/>
-        <w:rPr/>
-      </w:pPr>
-      <w:r>
-        <w:rPr>
-          <w:rtl w:val="0"/>
-        </w:rPr>
       </w:r>
     </w:p>
     <w:p>
@@ -647,13 +622,13 @@
                                   <w:sz w:val="22"/>
                                   <w:vertAlign w:val="baseline"/>
                                 </w:rPr>
-                                <w:t xml:space="preserve"> Has the candidate worked for Ford as an Agency worker before? (Yes/No)  {{ worked_with_ford_agency_before }}</w:t>
+                                <w:t xml:space="preserve">Has the candidate worked for Ford as an Agency worker before? (Yes/No)  {{ worked_with_ford_agency_before }}</w:t>
                               </w:r>
                             </w:p>
                             <w:p>
                               <w:pPr>
                                 <w:spacing w:after="0" w:before="50" w:line="240"/>
-                                <w:ind w:left="0" w:right="0" w:firstLine="0"/>
+                                <w:ind w:left="0" w:right="0" w:firstLine="720"/>
                                 <w:jc w:val="left"/>
                                 <w:textDirection w:val="btLr"/>
                               </w:pPr>
@@ -668,12 +643,25 @@
                                   <w:sz w:val="22"/>
                                   <w:vertAlign w:val="baseline"/>
                                 </w:rPr>
+                              </w:r>
+                              <w:r>
+                                <w:rPr>
+                                  <w:rFonts w:ascii="Century Gothic" w:cs="Century Gothic" w:eastAsia="Century Gothic" w:hAnsi="Century Gothic"/>
+                                  <w:b w:val="1"/>
+                                  <w:i w:val="0"/>
+                                  <w:smallCaps w:val="0"/>
+                                  <w:strike w:val="0"/>
+                                  <w:color w:val="1f497d"/>
+                                  <w:sz w:val="22"/>
+                                  <w:vertAlign w:val="baseline"/>
+                                </w:rPr>
+                                <w:t xml:space="preserve">If yes to either of the above, please specify the below details:</w:t>
                               </w:r>
                             </w:p>
                             <w:p>
                               <w:pPr>
                                 <w:spacing w:after="0" w:before="50" w:line="240"/>
-                                <w:ind w:left="720" w:right="0" w:firstLine="1440"/>
+                                <w:ind w:left="1440" w:right="0" w:firstLine="1080"/>
                                 <w:jc w:val="left"/>
                                 <w:textDirection w:val="btLr"/>
                               </w:pPr>
@@ -700,13 +688,13 @@
                                   <w:sz w:val="22"/>
                                   <w:vertAlign w:val="baseline"/>
                                 </w:rPr>
-                                <w:t xml:space="preserve"> If yes to either of the above, please specify the below details:</w:t>
+                                <w:t xml:space="preserve">CDSID:</w:t>
                               </w:r>
                             </w:p>
                             <w:p>
                               <w:pPr>
                                 <w:spacing w:after="0" w:before="50" w:line="240"/>
-                                <w:ind w:left="1640" w:right="0" w:firstLine="4720"/>
+                                <w:ind w:left="1440" w:right="0" w:firstLine="1080"/>
                                 <w:jc w:val="left"/>
                                 <w:textDirection w:val="btLr"/>
                               </w:pPr>
@@ -733,13 +721,13 @@
                                   <w:sz w:val="22"/>
                                   <w:vertAlign w:val="baseline"/>
                                 </w:rPr>
-                                <w:t xml:space="preserve">CDSID:</w:t>
+                                <w:t xml:space="preserve">Supervisor:</w:t>
                               </w:r>
                             </w:p>
                             <w:p>
                               <w:pPr>
                                 <w:spacing w:after="0" w:before="50" w:line="240"/>
-                                <w:ind w:left="1640" w:right="0" w:firstLine="4720"/>
+                                <w:ind w:left="1440" w:right="0" w:firstLine="1080"/>
                                 <w:jc w:val="left"/>
                                 <w:textDirection w:val="btLr"/>
                               </w:pPr>
@@ -766,46 +754,13 @@
                                   <w:sz w:val="22"/>
                                   <w:vertAlign w:val="baseline"/>
                                 </w:rPr>
-                                <w:t xml:space="preserve">Supervisor:</w:t>
+                                <w:t xml:space="preserve">Duration of the Project:</w:t>
                               </w:r>
                             </w:p>
                             <w:p>
                               <w:pPr>
                                 <w:spacing w:after="0" w:before="50" w:line="240"/>
-                                <w:ind w:left="1640" w:right="0" w:firstLine="4720"/>
-                                <w:jc w:val="left"/>
-                                <w:textDirection w:val="btLr"/>
-                              </w:pPr>
-                              <w:r>
-                                <w:rPr>
-                                  <w:rFonts w:ascii="Century Gothic" w:cs="Century Gothic" w:eastAsia="Century Gothic" w:hAnsi="Century Gothic"/>
-                                  <w:b w:val="1"/>
-                                  <w:i w:val="0"/>
-                                  <w:smallCaps w:val="0"/>
-                                  <w:strike w:val="0"/>
-                                  <w:color w:val="1f497d"/>
-                                  <w:sz w:val="22"/>
-                                  <w:vertAlign w:val="baseline"/>
-                                </w:rPr>
-                              </w:r>
-                              <w:r>
-                                <w:rPr>
-                                  <w:rFonts w:ascii="Century Gothic" w:cs="Century Gothic" w:eastAsia="Century Gothic" w:hAnsi="Century Gothic"/>
-                                  <w:b w:val="1"/>
-                                  <w:i w:val="0"/>
-                                  <w:smallCaps w:val="0"/>
-                                  <w:strike w:val="0"/>
-                                  <w:color w:val="1f497d"/>
-                                  <w:sz w:val="22"/>
-                                  <w:vertAlign w:val="baseline"/>
-                                </w:rPr>
-                                <w:t xml:space="preserve">Duration of the Project:</w:t>
-                              </w:r>
-                            </w:p>
-                            <w:p>
-                              <w:pPr>
-                                <w:spacing w:after="0" w:before="50" w:line="240"/>
-                                <w:ind w:left="1640" w:right="0" w:firstLine="4720"/>
+                                <w:ind w:left="1440" w:right="0" w:firstLine="1080"/>
                                 <w:jc w:val="left"/>
                                 <w:textDirection w:val="btLr"/>
                               </w:pPr>
@@ -1218,8 +1173,8 @@
                         <wps:cNvPr id="3" name="Shape 3"/>
                         <wps:spPr>
                           <a:xfrm>
-                            <a:off x="6438525" y="753100"/>
-                            <a:ext cx="1941300" cy="2004900"/>
+                            <a:off x="6534000" y="753100"/>
+                            <a:ext cx="1845900" cy="1813800"/>
                           </a:xfrm>
                           <a:prstGeom prst="rect">
                             <a:avLst/>
@@ -1284,14 +1239,6 @@
                                   <w:vertAlign w:val="baseline"/>
                                 </w:rPr>
                               </w:r>
-                            </w:p>
-                            <w:p>
-                              <w:pPr>
-                                <w:spacing w:after="0" w:before="0" w:line="240"/>
-                                <w:ind w:left="0" w:right="0" w:firstLine="0"/>
-                                <w:jc w:val="left"/>
-                                <w:textDirection w:val="btLr"/>
-                              </w:pPr>
                               <w:r>
                                 <w:rPr>
                                   <w:rFonts w:ascii="Arial" w:cs="Arial" w:eastAsia="Arial" w:hAnsi="Arial"/>
@@ -1303,39 +1250,7 @@
                                   <w:sz w:val="28"/>
                                   <w:vertAlign w:val="baseline"/>
                                 </w:rPr>
-                              </w:r>
-                            </w:p>
-                            <w:p>
-                              <w:pPr>
-                                <w:spacing w:after="0" w:before="0" w:line="240"/>
-                                <w:ind w:left="0" w:right="0" w:firstLine="0"/>
-                                <w:jc w:val="left"/>
-                                <w:textDirection w:val="btLr"/>
-                              </w:pPr>
-                              <w:r>
-                                <w:rPr>
-                                  <w:rFonts w:ascii="Arial" w:cs="Arial" w:eastAsia="Arial" w:hAnsi="Arial"/>
-                                  <w:b w:val="0"/>
-                                  <w:i w:val="0"/>
-                                  <w:smallCaps w:val="0"/>
-                                  <w:strike w:val="0"/>
-                                  <w:color w:val="000000"/>
-                                  <w:sz w:val="28"/>
-                                  <w:vertAlign w:val="baseline"/>
-                                </w:rPr>
-                              </w:r>
-                              <w:r>
-                                <w:rPr>
-                                  <w:rFonts w:ascii="Arial" w:cs="Arial" w:eastAsia="Arial" w:hAnsi="Arial"/>
-                                  <w:b w:val="0"/>
-                                  <w:i w:val="0"/>
-                                  <w:smallCaps w:val="0"/>
-                                  <w:strike w:val="0"/>
-                                  <w:color w:val="000000"/>
-                                  <w:sz w:val="28"/>
-                                  <w:vertAlign w:val="baseline"/>
-                                </w:rPr>
-                                <w:t xml:space="preserve"> {{candidate_photo}}</w:t>
+                                <w:t xml:space="preserve">{{candidate_photo}}</w:t>
                               </w:r>
                             </w:p>
                           </w:txbxContent>
@@ -2138,6 +2053,17 @@
           <w:rtl w:val="0"/>
         </w:rPr>
         <w:t xml:space="preserve">{% endfor %}</w:t>
+      </w:r>
+    </w:p>
+    <w:p>
+      <w:pPr>
+        <w:spacing w:after="240" w:before="240" w:lineRule="auto"/>
+        <w:rPr/>
+      </w:pPr>
+      <w:r>
+        <w:rPr>
+          <w:rtl w:val="0"/>
+        </w:rPr>
       </w:r>
     </w:p>
     <w:p>

</xml_diff>

<commit_message>
bug fix and enchancements
</commit_message>
<xml_diff>
--- a/templates/ford-india-resume-template.docx
+++ b/templates/ford-india-resume-template.docx
@@ -111,7 +111,7 @@
           <mc:Choice Requires="wpg">
             <w:drawing>
               <wp:inline distB="0" distT="0" distL="0" distR="0">
-                <wp:extent cx="6715125" cy="7304004"/>
+                <wp:extent cx="6715125" cy="7417981"/>
                 <wp:effectExtent b="0" l="0" r="0" t="0"/>
                 <wp:docPr id="1" name=""/>
                 <a:graphic>
@@ -120,20 +120,20 @@
                       <wpg:cNvGrpSpPr/>
                       <wpg:grpSpPr>
                         <a:xfrm>
-                          <a:off x="1988425" y="241200"/>
-                          <a:ext cx="6715125" cy="7304004"/>
-                          <a:chOff x="1988425" y="241200"/>
-                          <a:chExt cx="6715150" cy="7077600"/>
+                          <a:off x="1988425" y="127975"/>
+                          <a:ext cx="6715125" cy="7417981"/>
+                          <a:chOff x="1988425" y="127975"/>
+                          <a:chExt cx="6715150" cy="7304050"/>
                         </a:xfrm>
                       </wpg:grpSpPr>
                       <wpg:grpSp>
                         <wpg:cNvGrpSpPr/>
                         <wpg:grpSpPr>
                           <a:xfrm>
-                            <a:off x="1988438" y="241206"/>
-                            <a:ext cx="6715125" cy="7077589"/>
-                            <a:chOff x="1997875" y="493750"/>
-                            <a:chExt cx="6696250" cy="6467950"/>
+                            <a:off x="1988438" y="127998"/>
+                            <a:ext cx="6715125" cy="7304004"/>
+                            <a:chOff x="1988425" y="241200"/>
+                            <a:chExt cx="6715150" cy="7077600"/>
                           </a:xfrm>
                         </wpg:grpSpPr>
                         <wps:wsp>
@@ -141,8 +141,8 @@
                           <wps:cNvPr id="3" name="Shape 3"/>
                           <wps:spPr>
                             <a:xfrm>
-                              <a:off x="1997875" y="493750"/>
-                              <a:ext cx="6696250" cy="6467950"/>
+                              <a:off x="1988425" y="241200"/>
+                              <a:ext cx="6715150" cy="7077600"/>
                             </a:xfrm>
                             <a:prstGeom prst="rect">
                               <a:avLst/>
@@ -168,1233 +168,1151 @@
                             <a:noAutofit/>
                           </wps:bodyPr>
                         </wps:wsp>
-                        <wps:wsp>
-                          <wps:cNvSpPr/>
-                          <wps:cNvPr id="4" name="Shape 4"/>
-                          <wps:spPr>
+                        <wpg:grpSp>
+                          <wpg:cNvGrpSpPr/>
+                          <wpg:grpSpPr>
                             <a:xfrm>
-                              <a:off x="2002650" y="498525"/>
-                              <a:ext cx="6686700" cy="6458400"/>
+                              <a:off x="1988438" y="241206"/>
+                              <a:ext cx="6715125" cy="7077589"/>
+                              <a:chOff x="1997875" y="493750"/>
+                              <a:chExt cx="6696250" cy="6467950"/>
                             </a:xfrm>
-                            <a:prstGeom prst="rect">
-                              <a:avLst/>
-                            </a:prstGeom>
-                            <a:noFill/>
-                            <a:ln cap="flat" cmpd="sng" w="9525">
-                              <a:solidFill>
-                                <a:srgbClr val="000000"/>
-                              </a:solidFill>
-                              <a:prstDash val="solid"/>
-                              <a:miter lim="800000"/>
-                              <a:headEnd len="sm" w="sm" type="none"/>
-                              <a:tailEnd len="sm" w="sm" type="none"/>
-                            </a:ln>
-                          </wps:spPr>
-                          <wps:txbx>
-                            <w:txbxContent>
-                              <w:p>
-                                <w:pPr>
-                                  <w:spacing w:after="0" w:before="50" w:line="240"/>
-                                  <w:ind w:left="0" w:right="0" w:firstLine="0"/>
-                                  <w:jc w:val="left"/>
-                                  <w:textDirection w:val="btLr"/>
-                                </w:pPr>
-                                <w:r>
-                                  <w:rPr>
-                                    <w:rFonts w:ascii="Trebuchet MS" w:cs="Trebuchet MS" w:eastAsia="Trebuchet MS" w:hAnsi="Trebuchet MS"/>
-                                    <w:b w:val="0"/>
-                                    <w:i w:val="0"/>
-                                    <w:smallCaps w:val="0"/>
-                                    <w:strike w:val="0"/>
-                                    <w:color w:val="000000"/>
-                                    <w:sz w:val="20"/>
-                                    <w:vertAlign w:val="baseline"/>
-                                  </w:rPr>
-                                  <w:t xml:space="preserve"> </w:t>
-                                </w:r>
-                                <w:r>
-                                  <w:rPr>
-                                    <w:rFonts w:ascii="Century Gothic" w:cs="Century Gothic" w:eastAsia="Century Gothic" w:hAnsi="Century Gothic"/>
-                                    <w:b w:val="1"/>
-                                    <w:i w:val="0"/>
-                                    <w:smallCaps w:val="0"/>
-                                    <w:strike w:val="0"/>
-                                    <w:color w:val="1f497d"/>
-                                    <w:sz w:val="22"/>
-                                    <w:vertAlign w:val="baseline"/>
-                                  </w:rPr>
-                                  <w:t xml:space="preserve">Candidate First Name:  {{ first_name }}</w:t>
-                                </w:r>
-                              </w:p>
-                              <w:p>
-                                <w:pPr>
-                                  <w:spacing w:after="0" w:before="50" w:line="240"/>
-                                  <w:ind w:left="0" w:right="0" w:firstLine="0"/>
-                                  <w:jc w:val="left"/>
-                                  <w:textDirection w:val="btLr"/>
-                                </w:pPr>
-                                <w:r>
-                                  <w:rPr>
-                                    <w:rFonts w:ascii="Century Gothic" w:cs="Century Gothic" w:eastAsia="Century Gothic" w:hAnsi="Century Gothic"/>
-                                    <w:b w:val="1"/>
-                                    <w:i w:val="0"/>
-                                    <w:smallCaps w:val="0"/>
-                                    <w:strike w:val="0"/>
-                                    <w:color w:val="1f497d"/>
-                                    <w:sz w:val="22"/>
-                                    <w:vertAlign w:val="baseline"/>
-                                  </w:rPr>
-                                </w:r>
-                                <w:r>
-                                  <w:rPr>
-                                    <w:rFonts w:ascii="Century Gothic" w:cs="Century Gothic" w:eastAsia="Century Gothic" w:hAnsi="Century Gothic"/>
-                                    <w:b w:val="1"/>
-                                    <w:i w:val="0"/>
-                                    <w:smallCaps w:val="0"/>
-                                    <w:strike w:val="0"/>
-                                    <w:color w:val="1f497d"/>
-                                    <w:sz w:val="22"/>
-                                    <w:vertAlign w:val="baseline"/>
-                                  </w:rPr>
-                                  <w:t xml:space="preserve">(As per PAN/Aadhar)</w:t>
-                                </w:r>
-                              </w:p>
-                              <w:p>
-                                <w:pPr>
-                                  <w:spacing w:after="0" w:before="50" w:line="240"/>
-                                  <w:ind w:left="0" w:right="0" w:firstLine="0"/>
-                                  <w:jc w:val="left"/>
-                                  <w:textDirection w:val="btLr"/>
-                                </w:pPr>
-                                <w:r>
-                                  <w:rPr>
-                                    <w:rFonts w:ascii="Century Gothic" w:cs="Century Gothic" w:eastAsia="Century Gothic" w:hAnsi="Century Gothic"/>
-                                    <w:b w:val="1"/>
-                                    <w:i w:val="0"/>
-                                    <w:smallCaps w:val="0"/>
-                                    <w:strike w:val="0"/>
-                                    <w:color w:val="1f497d"/>
-                                    <w:sz w:val="22"/>
-                                    <w:vertAlign w:val="baseline"/>
-                                  </w:rPr>
-                                </w:r>
-                              </w:p>
-                              <w:p>
-                                <w:pPr>
-                                  <w:spacing w:after="0" w:before="50" w:line="240"/>
-                                  <w:ind w:left="0" w:right="0" w:firstLine="0"/>
-                                  <w:jc w:val="left"/>
-                                  <w:textDirection w:val="btLr"/>
-                                </w:pPr>
-                                <w:r>
-                                  <w:rPr>
-                                    <w:rFonts w:ascii="Century Gothic" w:cs="Century Gothic" w:eastAsia="Century Gothic" w:hAnsi="Century Gothic"/>
-                                    <w:b w:val="1"/>
-                                    <w:i w:val="0"/>
-                                    <w:smallCaps w:val="0"/>
-                                    <w:strike w:val="0"/>
-                                    <w:color w:val="1f497d"/>
-                                    <w:sz w:val="22"/>
-                                    <w:vertAlign w:val="baseline"/>
-                                  </w:rPr>
-                                </w:r>
-                                <w:r>
-                                  <w:rPr>
-                                    <w:rFonts w:ascii="Century Gothic" w:cs="Century Gothic" w:eastAsia="Century Gothic" w:hAnsi="Century Gothic"/>
-                                    <w:b w:val="1"/>
-                                    <w:i w:val="0"/>
-                                    <w:smallCaps w:val="0"/>
-                                    <w:strike w:val="0"/>
-                                    <w:color w:val="1f497d"/>
-                                    <w:sz w:val="22"/>
-                                    <w:vertAlign w:val="baseline"/>
-                                  </w:rPr>
-                                  <w:t xml:space="preserve"> Candidate Last Name: {{ last_name }}</w:t>
-                                </w:r>
-                                <w:r>
-                                  <w:rPr>
-                                    <w:rFonts w:ascii="Century Gothic" w:cs="Century Gothic" w:eastAsia="Century Gothic" w:hAnsi="Century Gothic"/>
-                                    <w:b w:val="1"/>
-                                    <w:i w:val="0"/>
-                                    <w:smallCaps w:val="0"/>
-                                    <w:strike w:val="0"/>
-                                    <w:color w:val="1f497d"/>
-                                    <w:sz w:val="22"/>
-                                    <w:vertAlign w:val="baseline"/>
-                                  </w:rPr>
-                                  <w:br w:type="textWrapping"/>
-                                </w:r>
-                                <w:r>
-                                  <w:rPr>
-                                    <w:rFonts w:ascii="Century Gothic" w:cs="Century Gothic" w:eastAsia="Century Gothic" w:hAnsi="Century Gothic"/>
-                                    <w:b w:val="1"/>
-                                    <w:i w:val="0"/>
-                                    <w:smallCaps w:val="0"/>
-                                    <w:strike w:val="0"/>
-                                    <w:color w:val="1f497d"/>
-                                    <w:sz w:val="22"/>
-                                    <w:vertAlign w:val="baseline"/>
-                                  </w:rPr>
-                                  <w:t xml:space="preserve"> (As per PAN/Aadhar)</w:t>
-                                </w:r>
-                              </w:p>
-                              <w:p>
-                                <w:pPr>
-                                  <w:spacing w:after="0" w:before="50" w:line="240"/>
-                                  <w:ind w:left="0" w:right="0" w:firstLine="0"/>
-                                  <w:jc w:val="left"/>
-                                  <w:textDirection w:val="btLr"/>
-                                </w:pPr>
-                                <w:r>
-                                  <w:rPr>
-                                    <w:rFonts w:ascii="Century Gothic" w:cs="Century Gothic" w:eastAsia="Century Gothic" w:hAnsi="Century Gothic"/>
-                                    <w:b w:val="1"/>
-                                    <w:i w:val="0"/>
-                                    <w:smallCaps w:val="0"/>
-                                    <w:strike w:val="0"/>
-                                    <w:color w:val="1f497d"/>
-                                    <w:sz w:val="22"/>
-                                    <w:vertAlign w:val="baseline"/>
-                                  </w:rPr>
-                                </w:r>
-                              </w:p>
-                              <w:p>
-                                <w:pPr>
-                                  <w:spacing w:after="0" w:before="50" w:line="240"/>
-                                  <w:ind w:left="0" w:right="0" w:firstLine="0"/>
-                                  <w:jc w:val="left"/>
-                                  <w:textDirection w:val="btLr"/>
-                                </w:pPr>
-                                <w:r>
-                                  <w:rPr>
-                                    <w:rFonts w:ascii="Century Gothic" w:cs="Century Gothic" w:eastAsia="Century Gothic" w:hAnsi="Century Gothic"/>
-                                    <w:b w:val="1"/>
-                                    <w:i w:val="0"/>
-                                    <w:smallCaps w:val="0"/>
-                                    <w:strike w:val="0"/>
-                                    <w:color w:val="1f497d"/>
-                                    <w:sz w:val="22"/>
-                                    <w:vertAlign w:val="baseline"/>
-                                  </w:rPr>
-                                </w:r>
-                                <w:r>
-                                  <w:rPr>
-                                    <w:rFonts w:ascii="Century Gothic" w:cs="Century Gothic" w:eastAsia="Century Gothic" w:hAnsi="Century Gothic"/>
-                                    <w:b w:val="1"/>
-                                    <w:i w:val="0"/>
-                                    <w:smallCaps w:val="0"/>
-                                    <w:strike w:val="0"/>
-                                    <w:color w:val="1f497d"/>
-                                    <w:sz w:val="22"/>
-                                    <w:vertAlign w:val="baseline"/>
-                                  </w:rPr>
-                                  <w:t xml:space="preserve"> Notice Period of the Candidate: {{ notice_period }}</w:t>
-                                </w:r>
-                              </w:p>
-                              <w:p>
-                                <w:pPr>
-                                  <w:spacing w:after="0" w:before="50" w:line="240"/>
-                                  <w:ind w:left="0" w:right="0" w:firstLine="0"/>
-                                  <w:jc w:val="left"/>
-                                  <w:textDirection w:val="btLr"/>
-                                </w:pPr>
-                                <w:r>
-                                  <w:rPr>
-                                    <w:rFonts w:ascii="Century Gothic" w:cs="Century Gothic" w:eastAsia="Century Gothic" w:hAnsi="Century Gothic"/>
-                                    <w:b w:val="1"/>
-                                    <w:i w:val="0"/>
-                                    <w:smallCaps w:val="0"/>
-                                    <w:strike w:val="0"/>
-                                    <w:color w:val="1f497d"/>
-                                    <w:sz w:val="22"/>
-                                    <w:vertAlign w:val="baseline"/>
-                                  </w:rPr>
-                                </w:r>
-                              </w:p>
-                              <w:p>
-                                <w:pPr>
-                                  <w:spacing w:after="0" w:before="50" w:line="240"/>
-                                  <w:ind w:left="0" w:right="0" w:firstLine="0"/>
-                                  <w:jc w:val="left"/>
-                                  <w:textDirection w:val="btLr"/>
-                                </w:pPr>
-                                <w:r>
-                                  <w:rPr>
-                                    <w:rFonts w:ascii="Century Gothic" w:cs="Century Gothic" w:eastAsia="Century Gothic" w:hAnsi="Century Gothic"/>
-                                    <w:b w:val="1"/>
-                                    <w:i w:val="0"/>
-                                    <w:smallCaps w:val="0"/>
-                                    <w:strike w:val="0"/>
-                                    <w:color w:val="1f497d"/>
-                                    <w:sz w:val="22"/>
-                                    <w:vertAlign w:val="baseline"/>
-                                  </w:rPr>
-                                </w:r>
-                                <w:r>
-                                  <w:rPr>
-                                    <w:rFonts w:ascii="Century Gothic" w:cs="Century Gothic" w:eastAsia="Century Gothic" w:hAnsi="Century Gothic"/>
-                                    <w:b w:val="1"/>
-                                    <w:i w:val="0"/>
-                                    <w:smallCaps w:val="0"/>
-                                    <w:strike w:val="0"/>
-                                    <w:color w:val="1f497d"/>
-                                    <w:sz w:val="22"/>
-                                    <w:vertAlign w:val="baseline"/>
-                                  </w:rPr>
-                                  <w:t xml:space="preserve"> Internal or External Candidate: {{ candidate_type }}</w:t>
-                                </w:r>
-                              </w:p>
-                              <w:p>
-                                <w:pPr>
-                                  <w:spacing w:after="0" w:before="50" w:line="240"/>
-                                  <w:ind w:left="0" w:right="0" w:firstLine="0"/>
-                                  <w:jc w:val="left"/>
-                                  <w:textDirection w:val="btLr"/>
-                                </w:pPr>
-                                <w:r>
-                                  <w:rPr>
-                                    <w:rFonts w:ascii="Century Gothic" w:cs="Century Gothic" w:eastAsia="Century Gothic" w:hAnsi="Century Gothic"/>
-                                    <w:b w:val="1"/>
-                                    <w:i w:val="0"/>
-                                    <w:smallCaps w:val="0"/>
-                                    <w:strike w:val="0"/>
-                                    <w:color w:val="1f497d"/>
-                                    <w:sz w:val="22"/>
-                                    <w:vertAlign w:val="baseline"/>
-                                  </w:rPr>
-                                </w:r>
-                              </w:p>
-                              <w:p>
-                                <w:pPr>
-                                  <w:spacing w:after="0" w:before="50" w:line="240"/>
-                                  <w:ind w:left="0" w:right="0" w:firstLine="0"/>
-                                  <w:jc w:val="left"/>
-                                  <w:textDirection w:val="btLr"/>
-                                </w:pPr>
-                                <w:r>
-                                  <w:rPr>
-                                    <w:rFonts w:ascii="Century Gothic" w:cs="Century Gothic" w:eastAsia="Century Gothic" w:hAnsi="Century Gothic"/>
-                                    <w:b w:val="1"/>
-                                    <w:i w:val="0"/>
-                                    <w:smallCaps w:val="0"/>
-                                    <w:strike w:val="0"/>
-                                    <w:color w:val="1f497d"/>
-                                    <w:sz w:val="22"/>
-                                    <w:vertAlign w:val="baseline"/>
-                                  </w:rPr>
-                                </w:r>
-                                <w:r>
-                                  <w:rPr>
-                                    <w:rFonts w:ascii="Century Gothic" w:cs="Century Gothic" w:eastAsia="Century Gothic" w:hAnsi="Century Gothic"/>
-                                    <w:b w:val="1"/>
-                                    <w:i w:val="0"/>
-                                    <w:smallCaps w:val="0"/>
-                                    <w:strike w:val="0"/>
-                                    <w:color w:val="1f497d"/>
-                                    <w:sz w:val="22"/>
-                                    <w:vertAlign w:val="baseline"/>
-                                  </w:rPr>
-                                  <w:t xml:space="preserve"> Interview Availability Date: {{ interview_availability }}</w:t>
-                                </w:r>
-                              </w:p>
-                              <w:p>
-                                <w:pPr>
-                                  <w:spacing w:after="0" w:before="50" w:line="240"/>
-                                  <w:ind w:left="0" w:right="0" w:firstLine="0"/>
-                                  <w:jc w:val="left"/>
-                                  <w:textDirection w:val="btLr"/>
-                                </w:pPr>
-                                <w:r>
-                                  <w:rPr>
-                                    <w:rFonts w:ascii="Century Gothic" w:cs="Century Gothic" w:eastAsia="Century Gothic" w:hAnsi="Century Gothic"/>
-                                    <w:b w:val="1"/>
-                                    <w:i w:val="0"/>
-                                    <w:smallCaps w:val="0"/>
-                                    <w:strike w:val="0"/>
-                                    <w:color w:val="1f497d"/>
-                                    <w:sz w:val="22"/>
-                                    <w:vertAlign w:val="baseline"/>
-                                  </w:rPr>
-                                </w:r>
-                              </w:p>
-                              <w:p>
-                                <w:pPr>
-                                  <w:spacing w:after="0" w:before="50" w:line="240"/>
-                                  <w:ind w:left="0" w:right="0" w:firstLine="0"/>
-                                  <w:jc w:val="left"/>
-                                  <w:textDirection w:val="btLr"/>
-                                </w:pPr>
-                                <w:r>
-                                  <w:rPr>
-                                    <w:rFonts w:ascii="Century Gothic" w:cs="Century Gothic" w:eastAsia="Century Gothic" w:hAnsi="Century Gothic"/>
-                                    <w:b w:val="1"/>
-                                    <w:i w:val="0"/>
-                                    <w:smallCaps w:val="0"/>
-                                    <w:strike w:val="0"/>
-                                    <w:color w:val="1f497d"/>
-                                    <w:sz w:val="22"/>
-                                    <w:vertAlign w:val="baseline"/>
-                                  </w:rPr>
-                                </w:r>
-                                <w:r>
-                                  <w:rPr>
-                                    <w:rFonts w:ascii="Century Gothic" w:cs="Century Gothic" w:eastAsia="Century Gothic" w:hAnsi="Century Gothic"/>
-                                    <w:b w:val="1"/>
-                                    <w:i w:val="0"/>
-                                    <w:smallCaps w:val="0"/>
-                                    <w:strike w:val="0"/>
-                                    <w:color w:val="1f497d"/>
-                                    <w:sz w:val="22"/>
-                                    <w:vertAlign w:val="baseline"/>
-                                  </w:rPr>
-                                  <w:t xml:space="preserve"> Start Availability Date: {{ start_availability }}</w:t>
-                                </w:r>
-                              </w:p>
-                              <w:p>
-                                <w:pPr>
-                                  <w:spacing w:after="0" w:before="50" w:line="240"/>
-                                  <w:ind w:left="0" w:right="0" w:firstLine="0"/>
-                                  <w:jc w:val="left"/>
-                                  <w:textDirection w:val="btLr"/>
-                                </w:pPr>
-                                <w:r>
-                                  <w:rPr>
-                                    <w:rFonts w:ascii="Century Gothic" w:cs="Century Gothic" w:eastAsia="Century Gothic" w:hAnsi="Century Gothic"/>
-                                    <w:b w:val="1"/>
-                                    <w:i w:val="0"/>
-                                    <w:smallCaps w:val="0"/>
-                                    <w:strike w:val="0"/>
-                                    <w:color w:val="1f497d"/>
-                                    <w:sz w:val="22"/>
-                                    <w:vertAlign w:val="baseline"/>
-                                  </w:rPr>
-                                </w:r>
-                              </w:p>
-                              <w:p>
-                                <w:pPr>
-                                  <w:spacing w:after="0" w:before="50" w:line="240"/>
-                                  <w:ind w:left="0" w:right="0" w:firstLine="0"/>
-                                  <w:jc w:val="left"/>
-                                  <w:textDirection w:val="btLr"/>
-                                </w:pPr>
-                                <w:r>
-                                  <w:rPr>
-                                    <w:rFonts w:ascii="Century Gothic" w:cs="Century Gothic" w:eastAsia="Century Gothic" w:hAnsi="Century Gothic"/>
-                                    <w:b w:val="1"/>
-                                    <w:i w:val="0"/>
-                                    <w:smallCaps w:val="0"/>
-                                    <w:strike w:val="0"/>
-                                    <w:color w:val="1f497d"/>
-                                    <w:sz w:val="22"/>
-                                    <w:vertAlign w:val="baseline"/>
-                                  </w:rPr>
-                                </w:r>
-                                <w:r>
-                                  <w:rPr>
-                                    <w:rFonts w:ascii="Century Gothic" w:cs="Century Gothic" w:eastAsia="Century Gothic" w:hAnsi="Century Gothic"/>
-                                    <w:b w:val="1"/>
-                                    <w:i w:val="0"/>
-                                    <w:smallCaps w:val="0"/>
-                                    <w:strike w:val="0"/>
-                                    <w:color w:val="1f497d"/>
-                                    <w:sz w:val="22"/>
-                                    <w:vertAlign w:val="baseline"/>
-                                  </w:rPr>
-                                  <w:t xml:space="preserve">Has the candidate worked directly for Ford before? (Yes/No) {{ worked_with_ford_before }}</w:t>
-                                </w:r>
-                              </w:p>
-                              <w:p>
-                                <w:pPr>
-                                  <w:spacing w:after="0" w:before="50" w:line="240"/>
-                                  <w:ind w:left="0" w:right="0" w:firstLine="0"/>
-                                  <w:jc w:val="left"/>
-                                  <w:textDirection w:val="btLr"/>
-                                </w:pPr>
-                                <w:r>
-                                  <w:rPr>
-                                    <w:rFonts w:ascii="Century Gothic" w:cs="Century Gothic" w:eastAsia="Century Gothic" w:hAnsi="Century Gothic"/>
-                                    <w:b w:val="1"/>
-                                    <w:i w:val="0"/>
-                                    <w:smallCaps w:val="0"/>
-                                    <w:strike w:val="0"/>
-                                    <w:color w:val="1f497d"/>
-                                    <w:sz w:val="22"/>
-                                    <w:vertAlign w:val="baseline"/>
-                                  </w:rPr>
-                                </w:r>
-                                <w:r>
-                                  <w:rPr>
-                                    <w:rFonts w:ascii="Century Gothic" w:cs="Century Gothic" w:eastAsia="Century Gothic" w:hAnsi="Century Gothic"/>
-                                    <w:b w:val="1"/>
-                                    <w:i w:val="0"/>
-                                    <w:smallCaps w:val="0"/>
-                                    <w:strike w:val="0"/>
-                                    <w:color w:val="1f497d"/>
-                                    <w:sz w:val="22"/>
-                                    <w:vertAlign w:val="baseline"/>
-                                  </w:rPr>
-                                  <w:t xml:space="preserve">Has the candidate worked for Ford as an Agency worker before? (Yes/No)  {{ worked_with_ford_agency_before }}</w:t>
-                                </w:r>
-                              </w:p>
-                              <w:p>
-                                <w:pPr>
-                                  <w:spacing w:after="0" w:before="50" w:line="240"/>
-                                  <w:ind w:left="0" w:right="0" w:firstLine="720"/>
-                                  <w:jc w:val="left"/>
-                                  <w:textDirection w:val="btLr"/>
-                                </w:pPr>
-                                <w:r>
-                                  <w:rPr>
-                                    <w:rFonts w:ascii="Century Gothic" w:cs="Century Gothic" w:eastAsia="Century Gothic" w:hAnsi="Century Gothic"/>
-                                    <w:b w:val="1"/>
-                                    <w:i w:val="0"/>
-                                    <w:smallCaps w:val="0"/>
-                                    <w:strike w:val="0"/>
-                                    <w:color w:val="1f497d"/>
-                                    <w:sz w:val="22"/>
-                                    <w:vertAlign w:val="baseline"/>
-                                  </w:rPr>
-                                </w:r>
-                                <w:r>
-                                  <w:rPr>
-                                    <w:rFonts w:ascii="Century Gothic" w:cs="Century Gothic" w:eastAsia="Century Gothic" w:hAnsi="Century Gothic"/>
-                                    <w:b w:val="1"/>
-                                    <w:i w:val="0"/>
-                                    <w:smallCaps w:val="0"/>
-                                    <w:strike w:val="0"/>
-                                    <w:color w:val="1f497d"/>
-                                    <w:sz w:val="22"/>
-                                    <w:vertAlign w:val="baseline"/>
-                                  </w:rPr>
-                                  <w:t xml:space="preserve">If yes to either of the above, please specify the below details:</w:t>
-                                </w:r>
-                              </w:p>
-                              <w:p>
-                                <w:pPr>
-                                  <w:spacing w:after="0" w:before="50" w:line="240"/>
-                                  <w:ind w:left="2160" w:right="0" w:firstLine="1800"/>
-                                  <w:jc w:val="left"/>
-                                  <w:textDirection w:val="btLr"/>
-                                </w:pPr>
-                                <w:r>
-                                  <w:rPr>
-                                    <w:rFonts w:ascii="Century Gothic" w:cs="Century Gothic" w:eastAsia="Century Gothic" w:hAnsi="Century Gothic"/>
-                                    <w:b w:val="1"/>
-                                    <w:i w:val="0"/>
-                                    <w:smallCaps w:val="0"/>
-                                    <w:strike w:val="0"/>
-                                    <w:color w:val="1f497d"/>
-                                    <w:sz w:val="22"/>
-                                    <w:vertAlign w:val="baseline"/>
-                                  </w:rPr>
-                                </w:r>
-                                <w:r>
-                                  <w:rPr>
-                                    <w:rFonts w:ascii="Century Gothic" w:cs="Century Gothic" w:eastAsia="Century Gothic" w:hAnsi="Century Gothic"/>
-                                    <w:b w:val="1"/>
-                                    <w:i w:val="0"/>
-                                    <w:smallCaps w:val="0"/>
-                                    <w:strike w:val="0"/>
-                                    <w:color w:val="1f497d"/>
-                                    <w:sz w:val="22"/>
-                                    <w:vertAlign w:val="baseline"/>
-                                  </w:rPr>
-                                  <w:t xml:space="preserve">CDSID:</w:t>
-                                </w:r>
-                              </w:p>
-                              <w:p>
-                                <w:pPr>
-                                  <w:spacing w:after="0" w:before="50" w:line="240"/>
-                                  <w:ind w:left="2160" w:right="0" w:firstLine="1800"/>
-                                  <w:jc w:val="left"/>
-                                  <w:textDirection w:val="btLr"/>
-                                </w:pPr>
-                                <w:r>
-                                  <w:rPr>
-                                    <w:rFonts w:ascii="Century Gothic" w:cs="Century Gothic" w:eastAsia="Century Gothic" w:hAnsi="Century Gothic"/>
-                                    <w:b w:val="1"/>
-                                    <w:i w:val="0"/>
-                                    <w:smallCaps w:val="0"/>
-                                    <w:strike w:val="0"/>
-                                    <w:color w:val="1f497d"/>
-                                    <w:sz w:val="22"/>
-                                    <w:vertAlign w:val="baseline"/>
-                                  </w:rPr>
-                                </w:r>
-                                <w:r>
-                                  <w:rPr>
-                                    <w:rFonts w:ascii="Century Gothic" w:cs="Century Gothic" w:eastAsia="Century Gothic" w:hAnsi="Century Gothic"/>
-                                    <w:b w:val="1"/>
-                                    <w:i w:val="0"/>
-                                    <w:smallCaps w:val="0"/>
-                                    <w:strike w:val="0"/>
-                                    <w:color w:val="1f497d"/>
-                                    <w:sz w:val="22"/>
-                                    <w:vertAlign w:val="baseline"/>
-                                  </w:rPr>
-                                  <w:t xml:space="preserve">Supervisor:</w:t>
-                                </w:r>
-                              </w:p>
-                              <w:p>
-                                <w:pPr>
-                                  <w:spacing w:after="0" w:before="50" w:line="240"/>
-                                  <w:ind w:left="2160" w:right="0" w:firstLine="1800"/>
-                                  <w:jc w:val="left"/>
-                                  <w:textDirection w:val="btLr"/>
-                                </w:pPr>
-                                <w:r>
-                                  <w:rPr>
-                                    <w:rFonts w:ascii="Century Gothic" w:cs="Century Gothic" w:eastAsia="Century Gothic" w:hAnsi="Century Gothic"/>
-                                    <w:b w:val="1"/>
-                                    <w:i w:val="0"/>
-                                    <w:smallCaps w:val="0"/>
-                                    <w:strike w:val="0"/>
-                                    <w:color w:val="1f497d"/>
-                                    <w:sz w:val="22"/>
-                                    <w:vertAlign w:val="baseline"/>
-                                  </w:rPr>
-                                </w:r>
-                                <w:r>
-                                  <w:rPr>
-                                    <w:rFonts w:ascii="Century Gothic" w:cs="Century Gothic" w:eastAsia="Century Gothic" w:hAnsi="Century Gothic"/>
-                                    <w:b w:val="1"/>
-                                    <w:i w:val="0"/>
-                                    <w:smallCaps w:val="0"/>
-                                    <w:strike w:val="0"/>
-                                    <w:color w:val="1f497d"/>
-                                    <w:sz w:val="22"/>
-                                    <w:vertAlign w:val="baseline"/>
-                                  </w:rPr>
-                                  <w:t xml:space="preserve">Duration of the Project:</w:t>
-                                </w:r>
-                              </w:p>
-                              <w:p>
-                                <w:pPr>
-                                  <w:spacing w:after="0" w:before="50" w:line="240"/>
-                                  <w:ind w:left="2160" w:right="0" w:firstLine="1800"/>
-                                  <w:jc w:val="left"/>
-                                  <w:textDirection w:val="btLr"/>
-                                </w:pPr>
-                                <w:r>
-                                  <w:rPr>
-                                    <w:rFonts w:ascii="Century Gothic" w:cs="Century Gothic" w:eastAsia="Century Gothic" w:hAnsi="Century Gothic"/>
-                                    <w:b w:val="1"/>
-                                    <w:i w:val="0"/>
-                                    <w:smallCaps w:val="0"/>
-                                    <w:strike w:val="0"/>
-                                    <w:color w:val="1f497d"/>
-                                    <w:sz w:val="22"/>
-                                    <w:vertAlign w:val="baseline"/>
-                                  </w:rPr>
-                                </w:r>
-                                <w:r>
-                                  <w:rPr>
-                                    <w:rFonts w:ascii="Century Gothic" w:cs="Century Gothic" w:eastAsia="Century Gothic" w:hAnsi="Century Gothic"/>
-                                    <w:b w:val="1"/>
-                                    <w:i w:val="0"/>
-                                    <w:smallCaps w:val="0"/>
-                                    <w:strike w:val="0"/>
-                                    <w:color w:val="1f497d"/>
-                                    <w:sz w:val="22"/>
-                                    <w:vertAlign w:val="baseline"/>
-                                  </w:rPr>
-                                  <w:t xml:space="preserve">Exit reason:</w:t>
-                                </w:r>
-                              </w:p>
-                              <w:p>
-                                <w:pPr>
-                                  <w:spacing w:after="0" w:before="50" w:line="240"/>
-                                  <w:ind w:left="0" w:right="0" w:firstLine="0"/>
-                                  <w:jc w:val="left"/>
-                                  <w:textDirection w:val="btLr"/>
-                                </w:pPr>
-                                <w:r>
-                                  <w:rPr>
-                                    <w:rFonts w:ascii="Century Gothic" w:cs="Century Gothic" w:eastAsia="Century Gothic" w:hAnsi="Century Gothic"/>
-                                    <w:b w:val="1"/>
-                                    <w:i w:val="0"/>
-                                    <w:smallCaps w:val="0"/>
-                                    <w:strike w:val="0"/>
-                                    <w:color w:val="1f497d"/>
-                                    <w:sz w:val="22"/>
-                                    <w:vertAlign w:val="baseline"/>
-                                  </w:rPr>
-                                </w:r>
-                              </w:p>
-                              <w:p>
-                                <w:pPr>
-                                  <w:spacing w:after="0" w:before="50" w:line="240"/>
-                                  <w:ind w:left="0" w:right="0" w:firstLine="0"/>
-                                  <w:jc w:val="left"/>
-                                  <w:textDirection w:val="btLr"/>
-                                </w:pPr>
-                                <w:r>
-                                  <w:rPr>
-                                    <w:rFonts w:ascii="Century Gothic" w:cs="Century Gothic" w:eastAsia="Century Gothic" w:hAnsi="Century Gothic"/>
-                                    <w:b w:val="1"/>
-                                    <w:i w:val="0"/>
-                                    <w:smallCaps w:val="0"/>
-                                    <w:strike w:val="0"/>
-                                    <w:color w:val="1f497d"/>
-                                    <w:sz w:val="22"/>
-                                    <w:vertAlign w:val="baseline"/>
-                                  </w:rPr>
-                                </w:r>
-                                <w:r>
-                                  <w:rPr>
-                                    <w:rFonts w:ascii="Century Gothic" w:cs="Century Gothic" w:eastAsia="Century Gothic" w:hAnsi="Century Gothic"/>
-                                    <w:b w:val="1"/>
-                                    <w:i w:val="0"/>
-                                    <w:smallCaps w:val="0"/>
-                                    <w:strike w:val="0"/>
-                                    <w:color w:val="1f497d"/>
-                                    <w:sz w:val="22"/>
-                                    <w:vertAlign w:val="baseline"/>
-                                  </w:rPr>
-                                  <w:t xml:space="preserve"> Overall IT Experience: {{ total_experience_years}} Years</w:t>
-                                </w:r>
-                              </w:p>
-                              <w:p>
-                                <w:pPr>
-                                  <w:spacing w:after="0" w:before="50" w:line="240"/>
-                                  <w:ind w:left="0" w:right="0" w:firstLine="0"/>
-                                  <w:jc w:val="left"/>
-                                  <w:textDirection w:val="btLr"/>
-                                </w:pPr>
-                                <w:r>
-                                  <w:rPr>
-                                    <w:rFonts w:ascii="Century Gothic" w:cs="Century Gothic" w:eastAsia="Century Gothic" w:hAnsi="Century Gothic"/>
-                                    <w:b w:val="1"/>
-                                    <w:i w:val="0"/>
-                                    <w:smallCaps w:val="0"/>
-                                    <w:strike w:val="0"/>
-                                    <w:color w:val="1f497d"/>
-                                    <w:sz w:val="22"/>
-                                    <w:vertAlign w:val="baseline"/>
-                                  </w:rPr>
-                                </w:r>
-                              </w:p>
-                              <w:p>
-                                <w:pPr>
-                                  <w:spacing w:after="0" w:before="50" w:line="240"/>
-                                  <w:ind w:left="0" w:right="0" w:firstLine="0"/>
-                                  <w:jc w:val="left"/>
-                                  <w:textDirection w:val="btLr"/>
-                                </w:pPr>
-                                <w:r>
-                                  <w:rPr>
-                                    <w:rFonts w:ascii="Century Gothic" w:cs="Century Gothic" w:eastAsia="Century Gothic" w:hAnsi="Century Gothic"/>
-                                    <w:b w:val="1"/>
-                                    <w:i w:val="0"/>
-                                    <w:smallCaps w:val="0"/>
-                                    <w:strike w:val="0"/>
-                                    <w:color w:val="1f497d"/>
-                                    <w:sz w:val="22"/>
-                                    <w:vertAlign w:val="baseline"/>
-                                  </w:rPr>
-                                </w:r>
-                                <w:r>
-                                  <w:rPr>
-                                    <w:rFonts w:ascii="Century Gothic" w:cs="Century Gothic" w:eastAsia="Century Gothic" w:hAnsi="Century Gothic"/>
-                                    <w:b w:val="1"/>
-                                    <w:i w:val="0"/>
-                                    <w:smallCaps w:val="0"/>
-                                    <w:strike w:val="0"/>
-                                    <w:color w:val="1f497d"/>
-                                    <w:sz w:val="22"/>
-                                    <w:vertAlign w:val="baseline"/>
-                                  </w:rPr>
-                                  <w:t xml:space="preserve"> Experience in Core Skills: {{ relevant_experience_years }} Years</w:t>
-                                </w:r>
-                              </w:p>
-                              <w:p>
-                                <w:pPr>
-                                  <w:spacing w:after="0" w:before="50" w:line="240"/>
-                                  <w:ind w:left="0" w:right="0" w:firstLine="0"/>
-                                  <w:jc w:val="left"/>
-                                  <w:textDirection w:val="btLr"/>
-                                </w:pPr>
-                                <w:r>
-                                  <w:rPr>
-                                    <w:rFonts w:ascii="Century Gothic" w:cs="Century Gothic" w:eastAsia="Century Gothic" w:hAnsi="Century Gothic"/>
-                                    <w:b w:val="1"/>
-                                    <w:i w:val="0"/>
-                                    <w:smallCaps w:val="0"/>
-                                    <w:strike w:val="0"/>
-                                    <w:color w:val="1f497d"/>
-                                    <w:sz w:val="22"/>
-                                    <w:vertAlign w:val="baseline"/>
-                                  </w:rPr>
-                                </w:r>
-                              </w:p>
-                              <w:p>
-                                <w:pPr>
-                                  <w:spacing w:after="0" w:before="50" w:line="240"/>
-                                  <w:ind w:left="0" w:right="0" w:firstLine="0"/>
-                                  <w:jc w:val="left"/>
-                                  <w:textDirection w:val="btLr"/>
-                                </w:pPr>
-                                <w:r>
-                                  <w:rPr>
-                                    <w:rFonts w:ascii="Century Gothic" w:cs="Century Gothic" w:eastAsia="Century Gothic" w:hAnsi="Century Gothic"/>
-                                    <w:b w:val="1"/>
-                                    <w:i w:val="0"/>
-                                    <w:smallCaps w:val="0"/>
-                                    <w:strike w:val="0"/>
-                                    <w:color w:val="1f497d"/>
-                                    <w:sz w:val="22"/>
-                                    <w:vertAlign w:val="baseline"/>
-                                  </w:rPr>
-                                </w:r>
-                                <w:r>
-                                  <w:rPr>
-                                    <w:rFonts w:ascii="Century Gothic" w:cs="Century Gothic" w:eastAsia="Century Gothic" w:hAnsi="Century Gothic"/>
-                                    <w:b w:val="1"/>
-                                    <w:i w:val="0"/>
-                                    <w:smallCaps w:val="0"/>
-                                    <w:strike w:val="0"/>
-                                    <w:color w:val="1f497d"/>
-                                    <w:sz w:val="22"/>
-                                    <w:vertAlign w:val="baseline"/>
-                                  </w:rPr>
-                                  <w:t xml:space="preserve"> Other relevant Qualification/Certifications, if any:</w:t>
-                                </w:r>
-                              </w:p>
-                              <w:p>
-                                <w:pPr>
-                                  <w:spacing w:after="0" w:before="0" w:line="275.9999942779541"/>
-                                  <w:ind w:left="0" w:right="0" w:firstLine="0"/>
-                                  <w:jc w:val="both"/>
-                                  <w:textDirection w:val="btLr"/>
-                                </w:pPr>
-                                <w:r>
-                                  <w:rPr>
-                                    <w:rFonts w:ascii="Century Gothic" w:cs="Century Gothic" w:eastAsia="Century Gothic" w:hAnsi="Century Gothic"/>
-                                    <w:b w:val="1"/>
-                                    <w:i w:val="0"/>
-                                    <w:smallCaps w:val="0"/>
-                                    <w:strike w:val="0"/>
-                                    <w:color w:val="1f497d"/>
-                                    <w:sz w:val="22"/>
-                                    <w:vertAlign w:val="baseline"/>
-                                  </w:rPr>
-                                </w:r>
-                                <w:r>
-                                  <w:rPr>
-                                    <w:rFonts w:ascii="Century Gothic" w:cs="Century Gothic" w:eastAsia="Century Gothic" w:hAnsi="Century Gothic"/>
-                                    <w:b w:val="1"/>
-                                    <w:i w:val="0"/>
-                                    <w:smallCaps w:val="0"/>
-                                    <w:strike w:val="0"/>
-                                    <w:color w:val="1f497d"/>
-                                    <w:sz w:val="22"/>
-                                    <w:vertAlign w:val="baseline"/>
-                                  </w:rPr>
-                                  <w:t xml:space="preserve">{%- for cert in certifications %}</w:t>
-                                </w:r>
-                              </w:p>
-                              <w:p>
-                                <w:pPr>
-                                  <w:spacing w:after="0" w:before="0" w:line="275.9999942779541"/>
-                                  <w:ind w:left="720" w:right="0" w:firstLine="360"/>
-                                  <w:jc w:val="both"/>
-                                  <w:textDirection w:val="btLr"/>
-                                </w:pPr>
-                                <w:r>
-                                  <w:rPr>
-                                    <w:rFonts w:ascii="Century Gothic" w:cs="Century Gothic" w:eastAsia="Century Gothic" w:hAnsi="Century Gothic"/>
-                                    <w:b w:val="1"/>
-                                    <w:i w:val="0"/>
-                                    <w:smallCaps w:val="0"/>
-                                    <w:strike w:val="0"/>
-                                    <w:color w:val="1f497d"/>
-                                    <w:sz w:val="22"/>
-                                    <w:vertAlign w:val="baseline"/>
-                                  </w:rPr>
-                                </w:r>
-                                <w:r>
-                                  <w:rPr>
-                                    <w:rFonts w:ascii="Century Gothic" w:cs="Century Gothic" w:eastAsia="Century Gothic" w:hAnsi="Century Gothic"/>
-                                    <w:b w:val="1"/>
-                                    <w:i w:val="0"/>
-                                    <w:smallCaps w:val="0"/>
-                                    <w:strike w:val="0"/>
-                                    <w:color w:val="1f497d"/>
-                                    <w:sz w:val="22"/>
-                                    <w:vertAlign w:val="baseline"/>
-                                  </w:rPr>
-                                  <w:t xml:space="preserve">{{ </w:t>
-                                </w:r>
-                                <w:r>
-                                  <w:rPr>
-                                    <w:rFonts w:ascii="Century Gothic" w:cs="Century Gothic" w:eastAsia="Century Gothic" w:hAnsi="Century Gothic"/>
-                                    <w:b w:val="1"/>
-                                    <w:i w:val="0"/>
-                                    <w:smallCaps w:val="0"/>
-                                    <w:strike w:val="0"/>
-                                    <w:color w:val="1f497d"/>
-                                    <w:sz w:val="22"/>
-                                    <w:vertAlign w:val="baseline"/>
-                                  </w:rPr>
-                                  <w:t xml:space="preserve">cert.name </w:t>
-                                </w:r>
-                                <w:r>
-                                  <w:rPr>
-                                    <w:rFonts w:ascii="Century Gothic" w:cs="Century Gothic" w:eastAsia="Century Gothic" w:hAnsi="Century Gothic"/>
-                                    <w:b w:val="1"/>
-                                    <w:i w:val="0"/>
-                                    <w:smallCaps w:val="0"/>
-                                    <w:strike w:val="0"/>
-                                    <w:color w:val="1f497d"/>
-                                    <w:sz w:val="22"/>
-                                    <w:vertAlign w:val="baseline"/>
-                                  </w:rPr>
-                                  <w:t xml:space="preserve">}}</w:t>
-                                </w:r>
-                              </w:p>
-                              <w:p>
-                                <w:pPr>
-                                  <w:spacing w:after="0" w:before="0" w:line="275.9999942779541"/>
-                                  <w:ind w:left="0" w:right="0" w:firstLine="0"/>
-                                  <w:jc w:val="both"/>
-                                  <w:textDirection w:val="btLr"/>
-                                </w:pPr>
-                                <w:r>
-                                  <w:rPr>
-                                    <w:rFonts w:ascii="Century Gothic" w:cs="Century Gothic" w:eastAsia="Century Gothic" w:hAnsi="Century Gothic"/>
-                                    <w:b w:val="1"/>
-                                    <w:i w:val="0"/>
-                                    <w:smallCaps w:val="0"/>
-                                    <w:strike w:val="0"/>
-                                    <w:color w:val="1f497d"/>
-                                    <w:sz w:val="22"/>
-                                    <w:vertAlign w:val="baseline"/>
-                                  </w:rPr>
-                                </w:r>
-                                <w:r>
-                                  <w:rPr>
-                                    <w:rFonts w:ascii="Century Gothic" w:cs="Century Gothic" w:eastAsia="Century Gothic" w:hAnsi="Century Gothic"/>
-                                    <w:b w:val="1"/>
-                                    <w:i w:val="0"/>
-                                    <w:smallCaps w:val="0"/>
-                                    <w:strike w:val="0"/>
-                                    <w:color w:val="1f497d"/>
-                                    <w:sz w:val="22"/>
-                                    <w:vertAlign w:val="baseline"/>
-                                  </w:rPr>
-                                  <w:t xml:space="preserve">{%- endfor %}</w:t>
-                                </w:r>
-                              </w:p>
-                              <w:p>
-                                <w:pPr>
-                                  <w:spacing w:after="0" w:before="50" w:line="240"/>
-                                  <w:ind w:left="0" w:right="0" w:firstLine="0"/>
-                                  <w:jc w:val="left"/>
-                                  <w:textDirection w:val="btLr"/>
-                                </w:pPr>
-                                <w:r>
-                                  <w:rPr>
-                                    <w:rFonts w:ascii="Century Gothic" w:cs="Century Gothic" w:eastAsia="Century Gothic" w:hAnsi="Century Gothic"/>
-                                    <w:b w:val="1"/>
-                                    <w:i w:val="0"/>
-                                    <w:smallCaps w:val="0"/>
-                                    <w:strike w:val="0"/>
-                                    <w:color w:val="1f497d"/>
-                                    <w:sz w:val="22"/>
-                                    <w:vertAlign w:val="baseline"/>
-                                  </w:rPr>
-                                </w:r>
-                              </w:p>
-                              <w:p>
-                                <w:pPr>
-                                  <w:spacing w:after="0" w:before="50" w:line="240"/>
-                                  <w:ind w:left="0" w:right="0" w:firstLine="0"/>
-                                  <w:jc w:val="left"/>
-                                  <w:textDirection w:val="btLr"/>
-                                </w:pPr>
-                                <w:r>
-                                  <w:rPr>
-                                    <w:rFonts w:ascii="Century Gothic" w:cs="Century Gothic" w:eastAsia="Century Gothic" w:hAnsi="Century Gothic"/>
-                                    <w:b w:val="1"/>
-                                    <w:i w:val="0"/>
-                                    <w:smallCaps w:val="0"/>
-                                    <w:strike w:val="0"/>
-                                    <w:color w:val="1f497d"/>
-                                    <w:sz w:val="22"/>
-                                    <w:vertAlign w:val="baseline"/>
-                                  </w:rPr>
-                                </w:r>
-                                <w:r>
-                                  <w:rPr>
-                                    <w:rFonts w:ascii="Century Gothic" w:cs="Century Gothic" w:eastAsia="Century Gothic" w:hAnsi="Century Gothic"/>
-                                    <w:b w:val="1"/>
-                                    <w:i w:val="0"/>
-                                    <w:smallCaps w:val="0"/>
-                                    <w:strike w:val="0"/>
-                                    <w:color w:val="1f497d"/>
-                                    <w:sz w:val="22"/>
-                                    <w:vertAlign w:val="baseline"/>
-                                  </w:rPr>
-                                  <w:t xml:space="preserve">Hacker rank Score:     {{ hacker_rank_score }}</w:t>
-                                </w:r>
-                              </w:p>
-                              <w:p>
-                                <w:pPr>
-                                  <w:spacing w:after="0" w:before="50" w:line="240"/>
-                                  <w:ind w:left="0" w:right="0" w:firstLine="0"/>
-                                  <w:jc w:val="left"/>
-                                  <w:textDirection w:val="btLr"/>
-                                </w:pPr>
-                                <w:r>
-                                  <w:rPr>
-                                    <w:rFonts w:ascii="Century Gothic" w:cs="Century Gothic" w:eastAsia="Century Gothic" w:hAnsi="Century Gothic"/>
-                                    <w:b w:val="1"/>
-                                    <w:i w:val="0"/>
-                                    <w:smallCaps w:val="0"/>
-                                    <w:strike w:val="0"/>
-                                    <w:color w:val="1f497d"/>
-                                    <w:sz w:val="22"/>
-                                    <w:vertAlign w:val="baseline"/>
-                                  </w:rPr>
-                                </w:r>
-                              </w:p>
-                              <w:p>
-                                <w:pPr>
-                                  <w:spacing w:after="0" w:before="50" w:line="240"/>
-                                  <w:ind w:left="0" w:right="0" w:firstLine="0"/>
-                                  <w:jc w:val="left"/>
-                                  <w:textDirection w:val="btLr"/>
-                                </w:pPr>
-                                <w:r>
-                                  <w:rPr>
-                                    <w:rFonts w:ascii="Century Gothic" w:cs="Century Gothic" w:eastAsia="Century Gothic" w:hAnsi="Century Gothic"/>
-                                    <w:b w:val="1"/>
-                                    <w:i w:val="0"/>
-                                    <w:smallCaps w:val="0"/>
-                                    <w:strike w:val="0"/>
-                                    <w:color w:val="1f497d"/>
-                                    <w:sz w:val="22"/>
-                                    <w:vertAlign w:val="baseline"/>
-                                  </w:rPr>
-                                </w:r>
-                              </w:p>
-                              <w:p>
-                                <w:pPr>
-                                  <w:spacing w:after="0" w:before="50" w:line="240"/>
-                                  <w:ind w:left="0" w:right="0" w:firstLine="0"/>
-                                  <w:jc w:val="left"/>
-                                  <w:textDirection w:val="btLr"/>
-                                </w:pPr>
-                                <w:r>
-                                  <w:rPr>
-                                    <w:rFonts w:ascii="Century Gothic" w:cs="Century Gothic" w:eastAsia="Century Gothic" w:hAnsi="Century Gothic"/>
-                                    <w:b w:val="1"/>
-                                    <w:i w:val="0"/>
-                                    <w:smallCaps w:val="0"/>
-                                    <w:strike w:val="0"/>
-                                    <w:color w:val="1f497d"/>
-                                    <w:sz w:val="22"/>
-                                    <w:vertAlign w:val="baseline"/>
-                                  </w:rPr>
-                                </w:r>
-                              </w:p>
-                              <w:p>
-                                <w:pPr>
-                                  <w:spacing w:after="0" w:before="50" w:line="240"/>
-                                  <w:ind w:left="0" w:right="0" w:firstLine="0"/>
-                                  <w:jc w:val="left"/>
-                                  <w:textDirection w:val="btLr"/>
-                                </w:pPr>
-                                <w:r>
-                                  <w:rPr>
-                                    <w:rFonts w:ascii="Century Gothic" w:cs="Century Gothic" w:eastAsia="Century Gothic" w:hAnsi="Century Gothic"/>
-                                    <w:b w:val="1"/>
-                                    <w:i w:val="0"/>
-                                    <w:smallCaps w:val="0"/>
-                                    <w:strike w:val="0"/>
-                                    <w:color w:val="1f497d"/>
-                                    <w:sz w:val="22"/>
-                                    <w:vertAlign w:val="baseline"/>
-                                  </w:rPr>
-                                </w:r>
-                              </w:p>
-                              <w:p>
-                                <w:pPr>
-                                  <w:spacing w:after="0" w:before="50" w:line="240"/>
-                                  <w:ind w:left="0" w:right="0" w:firstLine="0"/>
-                                  <w:jc w:val="left"/>
-                                  <w:textDirection w:val="btLr"/>
-                                </w:pPr>
-                                <w:r>
-                                  <w:rPr>
-                                    <w:rFonts w:ascii="Century Gothic" w:cs="Century Gothic" w:eastAsia="Century Gothic" w:hAnsi="Century Gothic"/>
-                                    <w:b w:val="1"/>
-                                    <w:i w:val="0"/>
-                                    <w:smallCaps w:val="0"/>
-                                    <w:strike w:val="0"/>
-                                    <w:color w:val="1f497d"/>
-                                    <w:sz w:val="22"/>
-                                    <w:vertAlign w:val="baseline"/>
-                                  </w:rPr>
-                                </w:r>
-                              </w:p>
-                              <w:p>
-                                <w:pPr>
-                                  <w:spacing w:after="0" w:before="50" w:line="240"/>
-                                  <w:ind w:left="0" w:right="0" w:firstLine="0"/>
-                                  <w:jc w:val="left"/>
-                                  <w:textDirection w:val="btLr"/>
-                                </w:pPr>
-                                <w:r>
-                                  <w:rPr>
-                                    <w:rFonts w:ascii="Century Gothic" w:cs="Century Gothic" w:eastAsia="Century Gothic" w:hAnsi="Century Gothic"/>
-                                    <w:b w:val="1"/>
-                                    <w:i w:val="0"/>
-                                    <w:smallCaps w:val="0"/>
-                                    <w:strike w:val="0"/>
-                                    <w:color w:val="1f497d"/>
-                                    <w:sz w:val="22"/>
-                                    <w:vertAlign w:val="baseline"/>
-                                  </w:rPr>
-                                </w:r>
-                              </w:p>
-                              <w:p>
-                                <w:pPr>
-                                  <w:spacing w:after="0" w:before="50" w:line="240"/>
-                                  <w:ind w:left="0" w:right="0" w:firstLine="0"/>
-                                  <w:jc w:val="left"/>
-                                  <w:textDirection w:val="btLr"/>
-                                </w:pPr>
-                                <w:r>
-                                  <w:rPr>
-                                    <w:rFonts w:ascii="Century Gothic" w:cs="Century Gothic" w:eastAsia="Century Gothic" w:hAnsi="Century Gothic"/>
-                                    <w:b w:val="1"/>
-                                    <w:i w:val="0"/>
-                                    <w:smallCaps w:val="0"/>
-                                    <w:strike w:val="0"/>
-                                    <w:color w:val="1f497d"/>
-                                    <w:sz w:val="22"/>
-                                    <w:vertAlign w:val="baseline"/>
-                                  </w:rPr>
-                                </w:r>
-                              </w:p>
-                              <w:p>
-                                <w:pPr>
-                                  <w:spacing w:after="0" w:before="50" w:line="240"/>
-                                  <w:ind w:left="103.00000190734863" w:right="0" w:firstLine="309.00001525878906"/>
-                                  <w:jc w:val="left"/>
-                                  <w:textDirection w:val="btLr"/>
-                                </w:pPr>
-                                <w:r>
-                                  <w:rPr>
-                                    <w:rFonts w:ascii="Century Gothic" w:cs="Century Gothic" w:eastAsia="Century Gothic" w:hAnsi="Century Gothic"/>
-                                    <w:b w:val="1"/>
-                                    <w:i w:val="0"/>
-                                    <w:smallCaps w:val="0"/>
-                                    <w:strike w:val="0"/>
-                                    <w:color w:val="1f497d"/>
-                                    <w:sz w:val="22"/>
-                                    <w:vertAlign w:val="baseline"/>
-                                  </w:rPr>
-                                </w:r>
-                              </w:p>
-                            </w:txbxContent>
-                          </wps:txbx>
-                          <wps:bodyPr anchorCtr="0" anchor="t" bIns="0" lIns="0" spcFirstLastPara="1" rIns="0" wrap="square" tIns="0">
-                            <a:noAutofit/>
-                          </wps:bodyPr>
-                        </wps:wsp>
-                        <wps:wsp>
-                          <wps:cNvSpPr/>
-                          <wps:cNvPr id="5" name="Shape 5"/>
-                          <wps:spPr>
-                            <a:xfrm>
-                              <a:off x="6534000" y="753100"/>
-                              <a:ext cx="1845900" cy="1813800"/>
-                            </a:xfrm>
-                            <a:prstGeom prst="rect">
-                              <a:avLst/>
-                            </a:prstGeom>
-                            <a:noFill/>
-                            <a:ln cap="flat" cmpd="sng" w="9525">
-                              <a:solidFill>
-                                <a:srgbClr val="000000"/>
-                              </a:solidFill>
-                              <a:prstDash val="solid"/>
-                              <a:miter lim="8000"/>
-                              <a:headEnd len="sm" w="sm" type="none"/>
-                              <a:tailEnd len="sm" w="sm" type="none"/>
-                            </a:ln>
-                          </wps:spPr>
-                          <wps:txbx>
-                            <w:txbxContent>
-                              <w:p>
-                                <w:pPr>
-                                  <w:spacing w:after="0" w:before="0" w:line="240"/>
-                                  <w:ind w:left="0" w:right="0" w:firstLine="0"/>
-                                  <w:jc w:val="center"/>
-                                  <w:textDirection w:val="btLr"/>
-                                </w:pPr>
-                              </w:p>
-                              <w:p>
-                                <w:pPr>
-                                  <w:spacing w:after="0" w:before="0" w:line="240"/>
-                                  <w:ind w:left="0" w:right="0" w:firstLine="0"/>
-                                  <w:jc w:val="center"/>
-                                  <w:textDirection w:val="btLr"/>
-                                </w:pPr>
-                                <w:r>
-                                  <w:rPr>
-                                    <w:rFonts w:ascii="Arial" w:cs="Arial" w:eastAsia="Arial" w:hAnsi="Arial"/>
-                                    <w:b w:val="0"/>
-                                    <w:i w:val="0"/>
-                                    <w:smallCaps w:val="0"/>
-                                    <w:strike w:val="0"/>
-                                    <w:color w:val="000000"/>
-                                    <w:sz w:val="28"/>
-                                    <w:vertAlign w:val="baseline"/>
-                                  </w:rPr>
-                                </w:r>
-                              </w:p>
-                              <w:p>
-                                <w:pPr>
-                                  <w:spacing w:after="0" w:before="0" w:line="240"/>
-                                  <w:ind w:left="0" w:right="0" w:firstLine="0"/>
-                                  <w:jc w:val="left"/>
-                                  <w:textDirection w:val="btLr"/>
-                                </w:pPr>
-                                <w:r>
-                                  <w:rPr>
-                                    <w:rFonts w:ascii="Arial" w:cs="Arial" w:eastAsia="Arial" w:hAnsi="Arial"/>
-                                    <w:b w:val="0"/>
-                                    <w:i w:val="0"/>
-                                    <w:smallCaps w:val="0"/>
-                                    <w:strike w:val="0"/>
-                                    <w:color w:val="000000"/>
-                                    <w:sz w:val="28"/>
-                                    <w:vertAlign w:val="baseline"/>
-                                  </w:rPr>
-                                </w:r>
-                                <w:r>
-                                  <w:rPr>
-                                    <w:rFonts w:ascii="Arial" w:cs="Arial" w:eastAsia="Arial" w:hAnsi="Arial"/>
-                                    <w:b w:val="0"/>
-                                    <w:i w:val="0"/>
-                                    <w:smallCaps w:val="0"/>
-                                    <w:strike w:val="0"/>
-                                    <w:color w:val="000000"/>
-                                    <w:sz w:val="28"/>
-                                    <w:vertAlign w:val="baseline"/>
-                                  </w:rPr>
-                                  <w:t xml:space="preserve">{{candidate_photo}}</w:t>
-                                </w:r>
-                              </w:p>
-                            </w:txbxContent>
-                          </wps:txbx>
-                          <wps:bodyPr anchorCtr="0" anchor="t" bIns="91425" lIns="91425" spcFirstLastPara="1" rIns="91425" wrap="square" tIns="91425">
-                            <a:noAutofit/>
-                          </wps:bodyPr>
-                        </wps:wsp>
+                          </wpg:grpSpPr>
+                          <wps:wsp>
+                            <wps:cNvSpPr/>
+                            <wps:cNvPr id="5" name="Shape 5"/>
+                            <wps:spPr>
+                              <a:xfrm>
+                                <a:off x="1997875" y="493750"/>
+                                <a:ext cx="6696250" cy="6467950"/>
+                              </a:xfrm>
+                              <a:prstGeom prst="rect">
+                                <a:avLst/>
+                              </a:prstGeom>
+                              <a:noFill/>
+                              <a:ln>
+                                <a:noFill/>
+                              </a:ln>
+                            </wps:spPr>
+                            <wps:txbx>
+                              <w:txbxContent>
+                                <w:p>
+                                  <w:pPr>
+                                    <w:spacing w:after="0" w:before="0" w:line="240"/>
+                                    <w:ind w:left="0" w:right="0" w:firstLine="0"/>
+                                    <w:jc w:val="left"/>
+                                    <w:textDirection w:val="btLr"/>
+                                  </w:pPr>
+                                </w:p>
+                              </w:txbxContent>
+                            </wps:txbx>
+                            <wps:bodyPr anchorCtr="0" anchor="ctr" bIns="91425" lIns="91425" spcFirstLastPara="1" rIns="91425" wrap="square" tIns="91425">
+                              <a:noAutofit/>
+                            </wps:bodyPr>
+                          </wps:wsp>
+                          <wps:wsp>
+                            <wps:cNvSpPr/>
+                            <wps:cNvPr id="6" name="Shape 6"/>
+                            <wps:spPr>
+                              <a:xfrm>
+                                <a:off x="2002650" y="498525"/>
+                                <a:ext cx="6686700" cy="6458400"/>
+                              </a:xfrm>
+                              <a:prstGeom prst="rect">
+                                <a:avLst/>
+                              </a:prstGeom>
+                              <a:noFill/>
+                              <a:ln cap="flat" cmpd="sng" w="9525">
+                                <a:solidFill>
+                                  <a:srgbClr val="000000"/>
+                                </a:solidFill>
+                                <a:prstDash val="solid"/>
+                                <a:miter lim="8000"/>
+                                <a:headEnd len="sm" w="sm" type="none"/>
+                                <a:tailEnd len="sm" w="sm" type="none"/>
+                              </a:ln>
+                            </wps:spPr>
+                            <wps:txbx>
+                              <w:txbxContent>
+                                <w:p>
+                                  <w:pPr>
+                                    <w:spacing w:after="0" w:before="50" w:line="240"/>
+                                    <w:ind w:left="0" w:right="0" w:firstLine="0"/>
+                                    <w:jc w:val="left"/>
+                                    <w:textDirection w:val="btLr"/>
+                                  </w:pPr>
+                                  <w:r>
+                                    <w:rPr>
+                                      <w:rFonts w:ascii="Trebuchet MS" w:cs="Trebuchet MS" w:eastAsia="Trebuchet MS" w:hAnsi="Trebuchet MS"/>
+                                      <w:b w:val="0"/>
+                                      <w:i w:val="0"/>
+                                      <w:smallCaps w:val="0"/>
+                                      <w:strike w:val="0"/>
+                                      <w:color w:val="000000"/>
+                                      <w:sz w:val="20"/>
+                                      <w:vertAlign w:val="baseline"/>
+                                    </w:rPr>
+                                    <w:t xml:space="preserve"> </w:t>
+                                  </w:r>
+                                  <w:r>
+                                    <w:rPr>
+                                      <w:rFonts w:ascii="Century Gothic" w:cs="Century Gothic" w:eastAsia="Century Gothic" w:hAnsi="Century Gothic"/>
+                                      <w:b w:val="1"/>
+                                      <w:i w:val="0"/>
+                                      <w:smallCaps w:val="0"/>
+                                      <w:strike w:val="0"/>
+                                      <w:color w:val="1f497d"/>
+                                      <w:sz w:val="22"/>
+                                      <w:vertAlign w:val="baseline"/>
+                                    </w:rPr>
+                                    <w:t xml:space="preserve">Candidate First Name:  {{ first_name }}</w:t>
+                                  </w:r>
+                                </w:p>
+                                <w:p>
+                                  <w:pPr>
+                                    <w:spacing w:after="0" w:before="50" w:line="240"/>
+                                    <w:ind w:left="0" w:right="0" w:firstLine="0"/>
+                                    <w:jc w:val="left"/>
+                                    <w:textDirection w:val="btLr"/>
+                                  </w:pPr>
+                                  <w:r>
+                                    <w:rPr>
+                                      <w:rFonts w:ascii="Century Gothic" w:cs="Century Gothic" w:eastAsia="Century Gothic" w:hAnsi="Century Gothic"/>
+                                      <w:b w:val="1"/>
+                                      <w:i w:val="0"/>
+                                      <w:smallCaps w:val="0"/>
+                                      <w:strike w:val="0"/>
+                                      <w:color w:val="1f497d"/>
+                                      <w:sz w:val="22"/>
+                                      <w:vertAlign w:val="baseline"/>
+                                    </w:rPr>
+                                  </w:r>
+                                  <w:r>
+                                    <w:rPr>
+                                      <w:rFonts w:ascii="Century Gothic" w:cs="Century Gothic" w:eastAsia="Century Gothic" w:hAnsi="Century Gothic"/>
+                                      <w:b w:val="1"/>
+                                      <w:i w:val="0"/>
+                                      <w:smallCaps w:val="0"/>
+                                      <w:strike w:val="0"/>
+                                      <w:color w:val="1f497d"/>
+                                      <w:sz w:val="22"/>
+                                      <w:vertAlign w:val="baseline"/>
+                                    </w:rPr>
+                                    <w:t xml:space="preserve">(As per PAN/Aadhar)</w:t>
+                                  </w:r>
+                                </w:p>
+                                <w:p>
+                                  <w:pPr>
+                                    <w:spacing w:after="0" w:before="50" w:line="240"/>
+                                    <w:ind w:left="0" w:right="0" w:firstLine="0"/>
+                                    <w:jc w:val="left"/>
+                                    <w:textDirection w:val="btLr"/>
+                                  </w:pPr>
+                                  <w:r>
+                                    <w:rPr>
+                                      <w:rFonts w:ascii="Century Gothic" w:cs="Century Gothic" w:eastAsia="Century Gothic" w:hAnsi="Century Gothic"/>
+                                      <w:b w:val="1"/>
+                                      <w:i w:val="0"/>
+                                      <w:smallCaps w:val="0"/>
+                                      <w:strike w:val="0"/>
+                                      <w:color w:val="1f497d"/>
+                                      <w:sz w:val="22"/>
+                                      <w:vertAlign w:val="baseline"/>
+                                    </w:rPr>
+                                  </w:r>
+                                </w:p>
+                                <w:p>
+                                  <w:pPr>
+                                    <w:spacing w:after="0" w:before="50" w:line="240"/>
+                                    <w:ind w:left="0" w:right="0" w:firstLine="0"/>
+                                    <w:jc w:val="left"/>
+                                    <w:textDirection w:val="btLr"/>
+                                  </w:pPr>
+                                  <w:r>
+                                    <w:rPr>
+                                      <w:rFonts w:ascii="Century Gothic" w:cs="Century Gothic" w:eastAsia="Century Gothic" w:hAnsi="Century Gothic"/>
+                                      <w:b w:val="1"/>
+                                      <w:i w:val="0"/>
+                                      <w:smallCaps w:val="0"/>
+                                      <w:strike w:val="0"/>
+                                      <w:color w:val="1f497d"/>
+                                      <w:sz w:val="22"/>
+                                      <w:vertAlign w:val="baseline"/>
+                                    </w:rPr>
+                                  </w:r>
+                                  <w:r>
+                                    <w:rPr>
+                                      <w:rFonts w:ascii="Century Gothic" w:cs="Century Gothic" w:eastAsia="Century Gothic" w:hAnsi="Century Gothic"/>
+                                      <w:b w:val="1"/>
+                                      <w:i w:val="0"/>
+                                      <w:smallCaps w:val="0"/>
+                                      <w:strike w:val="0"/>
+                                      <w:color w:val="1f497d"/>
+                                      <w:sz w:val="22"/>
+                                      <w:vertAlign w:val="baseline"/>
+                                    </w:rPr>
+                                    <w:t xml:space="preserve"> Candidate Last Name: {{ last_name }}</w:t>
+                                  </w:r>
+                                  <w:r>
+                                    <w:rPr>
+                                      <w:rFonts w:ascii="Century Gothic" w:cs="Century Gothic" w:eastAsia="Century Gothic" w:hAnsi="Century Gothic"/>
+                                      <w:b w:val="1"/>
+                                      <w:i w:val="0"/>
+                                      <w:smallCaps w:val="0"/>
+                                      <w:strike w:val="0"/>
+                                      <w:color w:val="1f497d"/>
+                                      <w:sz w:val="22"/>
+                                      <w:vertAlign w:val="baseline"/>
+                                    </w:rPr>
+                                    <w:br w:type="textWrapping"/>
+                                  </w:r>
+                                  <w:r>
+                                    <w:rPr>
+                                      <w:rFonts w:ascii="Century Gothic" w:cs="Century Gothic" w:eastAsia="Century Gothic" w:hAnsi="Century Gothic"/>
+                                      <w:b w:val="1"/>
+                                      <w:i w:val="0"/>
+                                      <w:smallCaps w:val="0"/>
+                                      <w:strike w:val="0"/>
+                                      <w:color w:val="1f497d"/>
+                                      <w:sz w:val="22"/>
+                                      <w:vertAlign w:val="baseline"/>
+                                    </w:rPr>
+                                    <w:t xml:space="preserve"> (As per PAN/Aadhar)</w:t>
+                                  </w:r>
+                                </w:p>
+                                <w:p>
+                                  <w:pPr>
+                                    <w:spacing w:after="0" w:before="50" w:line="240"/>
+                                    <w:ind w:left="0" w:right="0" w:firstLine="0"/>
+                                    <w:jc w:val="left"/>
+                                    <w:textDirection w:val="btLr"/>
+                                  </w:pPr>
+                                  <w:r>
+                                    <w:rPr>
+                                      <w:rFonts w:ascii="Century Gothic" w:cs="Century Gothic" w:eastAsia="Century Gothic" w:hAnsi="Century Gothic"/>
+                                      <w:b w:val="1"/>
+                                      <w:i w:val="0"/>
+                                      <w:smallCaps w:val="0"/>
+                                      <w:strike w:val="0"/>
+                                      <w:color w:val="1f497d"/>
+                                      <w:sz w:val="22"/>
+                                      <w:vertAlign w:val="baseline"/>
+                                    </w:rPr>
+                                  </w:r>
+                                </w:p>
+                                <w:p>
+                                  <w:pPr>
+                                    <w:spacing w:after="0" w:before="50" w:line="240"/>
+                                    <w:ind w:left="0" w:right="0" w:firstLine="0"/>
+                                    <w:jc w:val="left"/>
+                                    <w:textDirection w:val="btLr"/>
+                                  </w:pPr>
+                                  <w:r>
+                                    <w:rPr>
+                                      <w:rFonts w:ascii="Century Gothic" w:cs="Century Gothic" w:eastAsia="Century Gothic" w:hAnsi="Century Gothic"/>
+                                      <w:b w:val="1"/>
+                                      <w:i w:val="0"/>
+                                      <w:smallCaps w:val="0"/>
+                                      <w:strike w:val="0"/>
+                                      <w:color w:val="1f497d"/>
+                                      <w:sz w:val="22"/>
+                                      <w:vertAlign w:val="baseline"/>
+                                    </w:rPr>
+                                  </w:r>
+                                  <w:r>
+                                    <w:rPr>
+                                      <w:rFonts w:ascii="Century Gothic" w:cs="Century Gothic" w:eastAsia="Century Gothic" w:hAnsi="Century Gothic"/>
+                                      <w:b w:val="1"/>
+                                      <w:i w:val="0"/>
+                                      <w:smallCaps w:val="0"/>
+                                      <w:strike w:val="0"/>
+                                      <w:color w:val="1f497d"/>
+                                      <w:sz w:val="22"/>
+                                      <w:vertAlign w:val="baseline"/>
+                                    </w:rPr>
+                                    <w:t xml:space="preserve"> Notice Period of the Candidate: {{ notice_period }}</w:t>
+                                  </w:r>
+                                </w:p>
+                                <w:p>
+                                  <w:pPr>
+                                    <w:spacing w:after="0" w:before="50" w:line="240"/>
+                                    <w:ind w:left="0" w:right="0" w:firstLine="0"/>
+                                    <w:jc w:val="left"/>
+                                    <w:textDirection w:val="btLr"/>
+                                  </w:pPr>
+                                  <w:r>
+                                    <w:rPr>
+                                      <w:rFonts w:ascii="Century Gothic" w:cs="Century Gothic" w:eastAsia="Century Gothic" w:hAnsi="Century Gothic"/>
+                                      <w:b w:val="1"/>
+                                      <w:i w:val="0"/>
+                                      <w:smallCaps w:val="0"/>
+                                      <w:strike w:val="0"/>
+                                      <w:color w:val="1f497d"/>
+                                      <w:sz w:val="22"/>
+                                      <w:vertAlign w:val="baseline"/>
+                                    </w:rPr>
+                                  </w:r>
+                                </w:p>
+                                <w:p>
+                                  <w:pPr>
+                                    <w:spacing w:after="0" w:before="50" w:line="240"/>
+                                    <w:ind w:left="0" w:right="0" w:firstLine="0"/>
+                                    <w:jc w:val="left"/>
+                                    <w:textDirection w:val="btLr"/>
+                                  </w:pPr>
+                                  <w:r>
+                                    <w:rPr>
+                                      <w:rFonts w:ascii="Century Gothic" w:cs="Century Gothic" w:eastAsia="Century Gothic" w:hAnsi="Century Gothic"/>
+                                      <w:b w:val="1"/>
+                                      <w:i w:val="0"/>
+                                      <w:smallCaps w:val="0"/>
+                                      <w:strike w:val="0"/>
+                                      <w:color w:val="1f497d"/>
+                                      <w:sz w:val="22"/>
+                                      <w:vertAlign w:val="baseline"/>
+                                    </w:rPr>
+                                  </w:r>
+                                  <w:r>
+                                    <w:rPr>
+                                      <w:rFonts w:ascii="Century Gothic" w:cs="Century Gothic" w:eastAsia="Century Gothic" w:hAnsi="Century Gothic"/>
+                                      <w:b w:val="1"/>
+                                      <w:i w:val="0"/>
+                                      <w:smallCaps w:val="0"/>
+                                      <w:strike w:val="0"/>
+                                      <w:color w:val="1f497d"/>
+                                      <w:sz w:val="22"/>
+                                      <w:vertAlign w:val="baseline"/>
+                                    </w:rPr>
+                                    <w:t xml:space="preserve"> Internal or External Candidate: {{ candidate_type }}</w:t>
+                                  </w:r>
+                                </w:p>
+                                <w:p>
+                                  <w:pPr>
+                                    <w:spacing w:after="0" w:before="50" w:line="240"/>
+                                    <w:ind w:left="0" w:right="0" w:firstLine="0"/>
+                                    <w:jc w:val="left"/>
+                                    <w:textDirection w:val="btLr"/>
+                                  </w:pPr>
+                                  <w:r>
+                                    <w:rPr>
+                                      <w:rFonts w:ascii="Century Gothic" w:cs="Century Gothic" w:eastAsia="Century Gothic" w:hAnsi="Century Gothic"/>
+                                      <w:b w:val="1"/>
+                                      <w:i w:val="0"/>
+                                      <w:smallCaps w:val="0"/>
+                                      <w:strike w:val="0"/>
+                                      <w:color w:val="1f497d"/>
+                                      <w:sz w:val="22"/>
+                                      <w:vertAlign w:val="baseline"/>
+                                    </w:rPr>
+                                  </w:r>
+                                </w:p>
+                                <w:p>
+                                  <w:pPr>
+                                    <w:spacing w:after="0" w:before="50" w:line="240"/>
+                                    <w:ind w:left="0" w:right="0" w:firstLine="0"/>
+                                    <w:jc w:val="left"/>
+                                    <w:textDirection w:val="btLr"/>
+                                  </w:pPr>
+                                  <w:r>
+                                    <w:rPr>
+                                      <w:rFonts w:ascii="Century Gothic" w:cs="Century Gothic" w:eastAsia="Century Gothic" w:hAnsi="Century Gothic"/>
+                                      <w:b w:val="1"/>
+                                      <w:i w:val="0"/>
+                                      <w:smallCaps w:val="0"/>
+                                      <w:strike w:val="0"/>
+                                      <w:color w:val="1f497d"/>
+                                      <w:sz w:val="22"/>
+                                      <w:vertAlign w:val="baseline"/>
+                                    </w:rPr>
+                                  </w:r>
+                                  <w:r>
+                                    <w:rPr>
+                                      <w:rFonts w:ascii="Century Gothic" w:cs="Century Gothic" w:eastAsia="Century Gothic" w:hAnsi="Century Gothic"/>
+                                      <w:b w:val="1"/>
+                                      <w:i w:val="0"/>
+                                      <w:smallCaps w:val="0"/>
+                                      <w:strike w:val="0"/>
+                                      <w:color w:val="1f497d"/>
+                                      <w:sz w:val="22"/>
+                                      <w:vertAlign w:val="baseline"/>
+                                    </w:rPr>
+                                    <w:t xml:space="preserve"> Interview Availability Date: {{ interview_availability }}</w:t>
+                                  </w:r>
+                                </w:p>
+                                <w:p>
+                                  <w:pPr>
+                                    <w:spacing w:after="0" w:before="50" w:line="240"/>
+                                    <w:ind w:left="0" w:right="0" w:firstLine="0"/>
+                                    <w:jc w:val="left"/>
+                                    <w:textDirection w:val="btLr"/>
+                                  </w:pPr>
+                                  <w:r>
+                                    <w:rPr>
+                                      <w:rFonts w:ascii="Century Gothic" w:cs="Century Gothic" w:eastAsia="Century Gothic" w:hAnsi="Century Gothic"/>
+                                      <w:b w:val="1"/>
+                                      <w:i w:val="0"/>
+                                      <w:smallCaps w:val="0"/>
+                                      <w:strike w:val="0"/>
+                                      <w:color w:val="1f497d"/>
+                                      <w:sz w:val="22"/>
+                                      <w:vertAlign w:val="baseline"/>
+                                    </w:rPr>
+                                  </w:r>
+                                </w:p>
+                                <w:p>
+                                  <w:pPr>
+                                    <w:spacing w:after="0" w:before="50" w:line="240"/>
+                                    <w:ind w:left="0" w:right="0" w:firstLine="0"/>
+                                    <w:jc w:val="left"/>
+                                    <w:textDirection w:val="btLr"/>
+                                  </w:pPr>
+                                  <w:r>
+                                    <w:rPr>
+                                      <w:rFonts w:ascii="Century Gothic" w:cs="Century Gothic" w:eastAsia="Century Gothic" w:hAnsi="Century Gothic"/>
+                                      <w:b w:val="1"/>
+                                      <w:i w:val="0"/>
+                                      <w:smallCaps w:val="0"/>
+                                      <w:strike w:val="0"/>
+                                      <w:color w:val="1f497d"/>
+                                      <w:sz w:val="22"/>
+                                      <w:vertAlign w:val="baseline"/>
+                                    </w:rPr>
+                                  </w:r>
+                                  <w:r>
+                                    <w:rPr>
+                                      <w:rFonts w:ascii="Century Gothic" w:cs="Century Gothic" w:eastAsia="Century Gothic" w:hAnsi="Century Gothic"/>
+                                      <w:b w:val="1"/>
+                                      <w:i w:val="0"/>
+                                      <w:smallCaps w:val="0"/>
+                                      <w:strike w:val="0"/>
+                                      <w:color w:val="1f497d"/>
+                                      <w:sz w:val="22"/>
+                                      <w:vertAlign w:val="baseline"/>
+                                    </w:rPr>
+                                    <w:t xml:space="preserve"> Start Availability Date: {{ start_availability }}</w:t>
+                                  </w:r>
+                                </w:p>
+                                <w:p>
+                                  <w:pPr>
+                                    <w:spacing w:after="0" w:before="50" w:line="240"/>
+                                    <w:ind w:left="0" w:right="0" w:firstLine="0"/>
+                                    <w:jc w:val="left"/>
+                                    <w:textDirection w:val="btLr"/>
+                                  </w:pPr>
+                                  <w:r>
+                                    <w:rPr>
+                                      <w:rFonts w:ascii="Century Gothic" w:cs="Century Gothic" w:eastAsia="Century Gothic" w:hAnsi="Century Gothic"/>
+                                      <w:b w:val="1"/>
+                                      <w:i w:val="0"/>
+                                      <w:smallCaps w:val="0"/>
+                                      <w:strike w:val="0"/>
+                                      <w:color w:val="1f497d"/>
+                                      <w:sz w:val="22"/>
+                                      <w:vertAlign w:val="baseline"/>
+                                    </w:rPr>
+                                  </w:r>
+                                </w:p>
+                                <w:p>
+                                  <w:pPr>
+                                    <w:spacing w:after="0" w:before="50" w:line="240"/>
+                                    <w:ind w:left="0" w:right="0" w:firstLine="0"/>
+                                    <w:jc w:val="left"/>
+                                    <w:textDirection w:val="btLr"/>
+                                  </w:pPr>
+                                  <w:r>
+                                    <w:rPr>
+                                      <w:rFonts w:ascii="Century Gothic" w:cs="Century Gothic" w:eastAsia="Century Gothic" w:hAnsi="Century Gothic"/>
+                                      <w:b w:val="1"/>
+                                      <w:i w:val="0"/>
+                                      <w:smallCaps w:val="0"/>
+                                      <w:strike w:val="0"/>
+                                      <w:color w:val="1f497d"/>
+                                      <w:sz w:val="22"/>
+                                      <w:vertAlign w:val="baseline"/>
+                                    </w:rPr>
+                                  </w:r>
+                                  <w:r>
+                                    <w:rPr>
+                                      <w:rFonts w:ascii="Century Gothic" w:cs="Century Gothic" w:eastAsia="Century Gothic" w:hAnsi="Century Gothic"/>
+                                      <w:b w:val="1"/>
+                                      <w:i w:val="0"/>
+                                      <w:smallCaps w:val="0"/>
+                                      <w:strike w:val="0"/>
+                                      <w:color w:val="1f497d"/>
+                                      <w:sz w:val="22"/>
+                                      <w:vertAlign w:val="baseline"/>
+                                    </w:rPr>
+                                    <w:t xml:space="preserve">Has the candidate worked directly for Ford before? (Yes/No) {{ worked_with_ford_before }}</w:t>
+                                  </w:r>
+                                </w:p>
+                                <w:p>
+                                  <w:pPr>
+                                    <w:spacing w:after="0" w:before="50" w:line="240"/>
+                                    <w:ind w:left="0" w:right="0" w:firstLine="0"/>
+                                    <w:jc w:val="left"/>
+                                    <w:textDirection w:val="btLr"/>
+                                  </w:pPr>
+                                  <w:r>
+                                    <w:rPr>
+                                      <w:rFonts w:ascii="Century Gothic" w:cs="Century Gothic" w:eastAsia="Century Gothic" w:hAnsi="Century Gothic"/>
+                                      <w:b w:val="1"/>
+                                      <w:i w:val="0"/>
+                                      <w:smallCaps w:val="0"/>
+                                      <w:strike w:val="0"/>
+                                      <w:color w:val="1f497d"/>
+                                      <w:sz w:val="22"/>
+                                      <w:vertAlign w:val="baseline"/>
+                                    </w:rPr>
+                                  </w:r>
+                                  <w:r>
+                                    <w:rPr>
+                                      <w:rFonts w:ascii="Century Gothic" w:cs="Century Gothic" w:eastAsia="Century Gothic" w:hAnsi="Century Gothic"/>
+                                      <w:b w:val="1"/>
+                                      <w:i w:val="0"/>
+                                      <w:smallCaps w:val="0"/>
+                                      <w:strike w:val="0"/>
+                                      <w:color w:val="1f497d"/>
+                                      <w:sz w:val="22"/>
+                                      <w:vertAlign w:val="baseline"/>
+                                    </w:rPr>
+                                    <w:t xml:space="preserve">Has the candidate worked for Ford as an Agency worker before? (Yes/No)  {{ worked_with_ford_agency_before }}</w:t>
+                                  </w:r>
+                                </w:p>
+                                <w:p>
+                                  <w:pPr>
+                                    <w:spacing w:after="0" w:before="50" w:line="240"/>
+                                    <w:ind w:left="0" w:right="0" w:firstLine="720"/>
+                                    <w:jc w:val="left"/>
+                                    <w:textDirection w:val="btLr"/>
+                                  </w:pPr>
+                                  <w:r>
+                                    <w:rPr>
+                                      <w:rFonts w:ascii="Century Gothic" w:cs="Century Gothic" w:eastAsia="Century Gothic" w:hAnsi="Century Gothic"/>
+                                      <w:b w:val="1"/>
+                                      <w:i w:val="0"/>
+                                      <w:smallCaps w:val="0"/>
+                                      <w:strike w:val="0"/>
+                                      <w:color w:val="1f497d"/>
+                                      <w:sz w:val="22"/>
+                                      <w:vertAlign w:val="baseline"/>
+                                    </w:rPr>
+                                  </w:r>
+                                  <w:r>
+                                    <w:rPr>
+                                      <w:rFonts w:ascii="Century Gothic" w:cs="Century Gothic" w:eastAsia="Century Gothic" w:hAnsi="Century Gothic"/>
+                                      <w:b w:val="1"/>
+                                      <w:i w:val="0"/>
+                                      <w:smallCaps w:val="0"/>
+                                      <w:strike w:val="0"/>
+                                      <w:color w:val="1f497d"/>
+                                      <w:sz w:val="22"/>
+                                      <w:vertAlign w:val="baseline"/>
+                                    </w:rPr>
+                                    <w:t xml:space="preserve">If yes to either of the above, please specify the below details:</w:t>
+                                  </w:r>
+                                </w:p>
+                                <w:p>
+                                  <w:pPr>
+                                    <w:spacing w:after="0" w:before="50" w:line="240"/>
+                                    <w:ind w:left="2160" w:right="0" w:firstLine="3960"/>
+                                    <w:jc w:val="left"/>
+                                    <w:textDirection w:val="btLr"/>
+                                  </w:pPr>
+                                  <w:r>
+                                    <w:rPr>
+                                      <w:rFonts w:ascii="Century Gothic" w:cs="Century Gothic" w:eastAsia="Century Gothic" w:hAnsi="Century Gothic"/>
+                                      <w:b w:val="1"/>
+                                      <w:i w:val="0"/>
+                                      <w:smallCaps w:val="0"/>
+                                      <w:strike w:val="0"/>
+                                      <w:color w:val="1f497d"/>
+                                      <w:sz w:val="22"/>
+                                      <w:vertAlign w:val="baseline"/>
+                                    </w:rPr>
+                                  </w:r>
+                                  <w:r>
+                                    <w:rPr>
+                                      <w:rFonts w:ascii="Century Gothic" w:cs="Century Gothic" w:eastAsia="Century Gothic" w:hAnsi="Century Gothic"/>
+                                      <w:b w:val="1"/>
+                                      <w:i w:val="0"/>
+                                      <w:smallCaps w:val="0"/>
+                                      <w:strike w:val="0"/>
+                                      <w:color w:val="1f497d"/>
+                                      <w:sz w:val="22"/>
+                                      <w:vertAlign w:val="baseline"/>
+                                    </w:rPr>
+                                    <w:t xml:space="preserve">CDSID:</w:t>
+                                  </w:r>
+                                </w:p>
+                                <w:p>
+                                  <w:pPr>
+                                    <w:spacing w:after="0" w:before="50" w:line="240"/>
+                                    <w:ind w:left="2160" w:right="0" w:firstLine="3960"/>
+                                    <w:jc w:val="left"/>
+                                    <w:textDirection w:val="btLr"/>
+                                  </w:pPr>
+                                  <w:r>
+                                    <w:rPr>
+                                      <w:rFonts w:ascii="Century Gothic" w:cs="Century Gothic" w:eastAsia="Century Gothic" w:hAnsi="Century Gothic"/>
+                                      <w:b w:val="1"/>
+                                      <w:i w:val="0"/>
+                                      <w:smallCaps w:val="0"/>
+                                      <w:strike w:val="0"/>
+                                      <w:color w:val="1f497d"/>
+                                      <w:sz w:val="22"/>
+                                      <w:vertAlign w:val="baseline"/>
+                                    </w:rPr>
+                                  </w:r>
+                                  <w:r>
+                                    <w:rPr>
+                                      <w:rFonts w:ascii="Century Gothic" w:cs="Century Gothic" w:eastAsia="Century Gothic" w:hAnsi="Century Gothic"/>
+                                      <w:b w:val="1"/>
+                                      <w:i w:val="0"/>
+                                      <w:smallCaps w:val="0"/>
+                                      <w:strike w:val="0"/>
+                                      <w:color w:val="1f497d"/>
+                                      <w:sz w:val="22"/>
+                                      <w:vertAlign w:val="baseline"/>
+                                    </w:rPr>
+                                    <w:t xml:space="preserve">Supervisor:</w:t>
+                                  </w:r>
+                                </w:p>
+                                <w:p>
+                                  <w:pPr>
+                                    <w:spacing w:after="0" w:before="50" w:line="240"/>
+                                    <w:ind w:left="2160" w:right="0" w:firstLine="3960"/>
+                                    <w:jc w:val="left"/>
+                                    <w:textDirection w:val="btLr"/>
+                                  </w:pPr>
+                                  <w:r>
+                                    <w:rPr>
+                                      <w:rFonts w:ascii="Century Gothic" w:cs="Century Gothic" w:eastAsia="Century Gothic" w:hAnsi="Century Gothic"/>
+                                      <w:b w:val="1"/>
+                                      <w:i w:val="0"/>
+                                      <w:smallCaps w:val="0"/>
+                                      <w:strike w:val="0"/>
+                                      <w:color w:val="1f497d"/>
+                                      <w:sz w:val="22"/>
+                                      <w:vertAlign w:val="baseline"/>
+                                    </w:rPr>
+                                  </w:r>
+                                  <w:r>
+                                    <w:rPr>
+                                      <w:rFonts w:ascii="Century Gothic" w:cs="Century Gothic" w:eastAsia="Century Gothic" w:hAnsi="Century Gothic"/>
+                                      <w:b w:val="1"/>
+                                      <w:i w:val="0"/>
+                                      <w:smallCaps w:val="0"/>
+                                      <w:strike w:val="0"/>
+                                      <w:color w:val="1f497d"/>
+                                      <w:sz w:val="22"/>
+                                      <w:vertAlign w:val="baseline"/>
+                                    </w:rPr>
+                                    <w:t xml:space="preserve">Duration of the Project:</w:t>
+                                  </w:r>
+                                </w:p>
+                                <w:p>
+                                  <w:pPr>
+                                    <w:spacing w:after="0" w:before="50" w:line="240"/>
+                                    <w:ind w:left="2160" w:right="0" w:firstLine="3960"/>
+                                    <w:jc w:val="left"/>
+                                    <w:textDirection w:val="btLr"/>
+                                  </w:pPr>
+                                  <w:r>
+                                    <w:rPr>
+                                      <w:rFonts w:ascii="Century Gothic" w:cs="Century Gothic" w:eastAsia="Century Gothic" w:hAnsi="Century Gothic"/>
+                                      <w:b w:val="1"/>
+                                      <w:i w:val="0"/>
+                                      <w:smallCaps w:val="0"/>
+                                      <w:strike w:val="0"/>
+                                      <w:color w:val="1f497d"/>
+                                      <w:sz w:val="22"/>
+                                      <w:vertAlign w:val="baseline"/>
+                                    </w:rPr>
+                                  </w:r>
+                                  <w:r>
+                                    <w:rPr>
+                                      <w:rFonts w:ascii="Century Gothic" w:cs="Century Gothic" w:eastAsia="Century Gothic" w:hAnsi="Century Gothic"/>
+                                      <w:b w:val="1"/>
+                                      <w:i w:val="0"/>
+                                      <w:smallCaps w:val="0"/>
+                                      <w:strike w:val="0"/>
+                                      <w:color w:val="1f497d"/>
+                                      <w:sz w:val="22"/>
+                                      <w:vertAlign w:val="baseline"/>
+                                    </w:rPr>
+                                    <w:t xml:space="preserve">Exit reason:</w:t>
+                                  </w:r>
+                                </w:p>
+                                <w:p>
+                                  <w:pPr>
+                                    <w:spacing w:after="0" w:before="50" w:line="240"/>
+                                    <w:ind w:left="0" w:right="0" w:firstLine="0"/>
+                                    <w:jc w:val="left"/>
+                                    <w:textDirection w:val="btLr"/>
+                                  </w:pPr>
+                                  <w:r>
+                                    <w:rPr>
+                                      <w:rFonts w:ascii="Century Gothic" w:cs="Century Gothic" w:eastAsia="Century Gothic" w:hAnsi="Century Gothic"/>
+                                      <w:b w:val="1"/>
+                                      <w:i w:val="0"/>
+                                      <w:smallCaps w:val="0"/>
+                                      <w:strike w:val="0"/>
+                                      <w:color w:val="1f497d"/>
+                                      <w:sz w:val="22"/>
+                                      <w:vertAlign w:val="baseline"/>
+                                    </w:rPr>
+                                  </w:r>
+                                </w:p>
+                                <w:p>
+                                  <w:pPr>
+                                    <w:spacing w:after="0" w:before="50" w:line="240"/>
+                                    <w:ind w:left="0" w:right="0" w:firstLine="0"/>
+                                    <w:jc w:val="left"/>
+                                    <w:textDirection w:val="btLr"/>
+                                  </w:pPr>
+                                  <w:r>
+                                    <w:rPr>
+                                      <w:rFonts w:ascii="Century Gothic" w:cs="Century Gothic" w:eastAsia="Century Gothic" w:hAnsi="Century Gothic"/>
+                                      <w:b w:val="1"/>
+                                      <w:i w:val="0"/>
+                                      <w:smallCaps w:val="0"/>
+                                      <w:strike w:val="0"/>
+                                      <w:color w:val="1f497d"/>
+                                      <w:sz w:val="22"/>
+                                      <w:vertAlign w:val="baseline"/>
+                                    </w:rPr>
+                                  </w:r>
+                                  <w:r>
+                                    <w:rPr>
+                                      <w:rFonts w:ascii="Century Gothic" w:cs="Century Gothic" w:eastAsia="Century Gothic" w:hAnsi="Century Gothic"/>
+                                      <w:b w:val="1"/>
+                                      <w:i w:val="0"/>
+                                      <w:smallCaps w:val="0"/>
+                                      <w:strike w:val="0"/>
+                                      <w:color w:val="1f497d"/>
+                                      <w:sz w:val="22"/>
+                                      <w:vertAlign w:val="baseline"/>
+                                    </w:rPr>
+                                    <w:t xml:space="preserve"> Overall IT Experience: {{ total_experience_years}} Years</w:t>
+                                  </w:r>
+                                </w:p>
+                                <w:p>
+                                  <w:pPr>
+                                    <w:spacing w:after="0" w:before="50" w:line="240"/>
+                                    <w:ind w:left="0" w:right="0" w:firstLine="0"/>
+                                    <w:jc w:val="left"/>
+                                    <w:textDirection w:val="btLr"/>
+                                  </w:pPr>
+                                  <w:r>
+                                    <w:rPr>
+                                      <w:rFonts w:ascii="Century Gothic" w:cs="Century Gothic" w:eastAsia="Century Gothic" w:hAnsi="Century Gothic"/>
+                                      <w:b w:val="1"/>
+                                      <w:i w:val="0"/>
+                                      <w:smallCaps w:val="0"/>
+                                      <w:strike w:val="0"/>
+                                      <w:color w:val="1f497d"/>
+                                      <w:sz w:val="22"/>
+                                      <w:vertAlign w:val="baseline"/>
+                                    </w:rPr>
+                                  </w:r>
+                                </w:p>
+                                <w:p>
+                                  <w:pPr>
+                                    <w:spacing w:after="0" w:before="50" w:line="240"/>
+                                    <w:ind w:left="0" w:right="0" w:firstLine="0"/>
+                                    <w:jc w:val="left"/>
+                                    <w:textDirection w:val="btLr"/>
+                                  </w:pPr>
+                                  <w:r>
+                                    <w:rPr>
+                                      <w:rFonts w:ascii="Century Gothic" w:cs="Century Gothic" w:eastAsia="Century Gothic" w:hAnsi="Century Gothic"/>
+                                      <w:b w:val="1"/>
+                                      <w:i w:val="0"/>
+                                      <w:smallCaps w:val="0"/>
+                                      <w:strike w:val="0"/>
+                                      <w:color w:val="1f497d"/>
+                                      <w:sz w:val="22"/>
+                                      <w:vertAlign w:val="baseline"/>
+                                    </w:rPr>
+                                  </w:r>
+                                  <w:r>
+                                    <w:rPr>
+                                      <w:rFonts w:ascii="Century Gothic" w:cs="Century Gothic" w:eastAsia="Century Gothic" w:hAnsi="Century Gothic"/>
+                                      <w:b w:val="1"/>
+                                      <w:i w:val="0"/>
+                                      <w:smallCaps w:val="0"/>
+                                      <w:strike w:val="0"/>
+                                      <w:color w:val="1f497d"/>
+                                      <w:sz w:val="22"/>
+                                      <w:vertAlign w:val="baseline"/>
+                                    </w:rPr>
+                                    <w:t xml:space="preserve"> Experience in Core Skills: {{ relevant_experience_years }} Years</w:t>
+                                  </w:r>
+                                </w:p>
+                                <w:p>
+                                  <w:pPr>
+                                    <w:spacing w:after="0" w:before="50" w:line="240"/>
+                                    <w:ind w:left="0" w:right="0" w:firstLine="0"/>
+                                    <w:jc w:val="left"/>
+                                    <w:textDirection w:val="btLr"/>
+                                  </w:pPr>
+                                  <w:r>
+                                    <w:rPr>
+                                      <w:rFonts w:ascii="Century Gothic" w:cs="Century Gothic" w:eastAsia="Century Gothic" w:hAnsi="Century Gothic"/>
+                                      <w:b w:val="1"/>
+                                      <w:i w:val="0"/>
+                                      <w:smallCaps w:val="0"/>
+                                      <w:strike w:val="0"/>
+                                      <w:color w:val="1f497d"/>
+                                      <w:sz w:val="22"/>
+                                      <w:vertAlign w:val="baseline"/>
+                                    </w:rPr>
+                                  </w:r>
+                                </w:p>
+                                <w:p>
+                                  <w:pPr>
+                                    <w:spacing w:after="0" w:before="50" w:line="240"/>
+                                    <w:ind w:left="0" w:right="0" w:firstLine="0"/>
+                                    <w:jc w:val="left"/>
+                                    <w:textDirection w:val="btLr"/>
+                                  </w:pPr>
+                                  <w:r>
+                                    <w:rPr>
+                                      <w:rFonts w:ascii="Century Gothic" w:cs="Century Gothic" w:eastAsia="Century Gothic" w:hAnsi="Century Gothic"/>
+                                      <w:b w:val="1"/>
+                                      <w:i w:val="0"/>
+                                      <w:smallCaps w:val="0"/>
+                                      <w:strike w:val="0"/>
+                                      <w:color w:val="1f497d"/>
+                                      <w:sz w:val="22"/>
+                                      <w:vertAlign w:val="baseline"/>
+                                    </w:rPr>
+                                  </w:r>
+                                  <w:r>
+                                    <w:rPr>
+                                      <w:rFonts w:ascii="Century Gothic" w:cs="Century Gothic" w:eastAsia="Century Gothic" w:hAnsi="Century Gothic"/>
+                                      <w:b w:val="1"/>
+                                      <w:i w:val="0"/>
+                                      <w:smallCaps w:val="0"/>
+                                      <w:strike w:val="0"/>
+                                      <w:color w:val="1f497d"/>
+                                      <w:sz w:val="22"/>
+                                      <w:vertAlign w:val="baseline"/>
+                                    </w:rPr>
+                                    <w:t xml:space="preserve"> Other relevant Qualification/Certifications, if any:</w:t>
+                                  </w:r>
+                                </w:p>
+                                <w:p>
+                                  <w:pPr>
+                                    <w:spacing w:after="0" w:before="50" w:line="240"/>
+                                    <w:ind w:left="0" w:right="0" w:firstLine="0"/>
+                                    <w:jc w:val="left"/>
+                                    <w:textDirection w:val="btLr"/>
+                                  </w:pPr>
+                                  <w:r>
+                                    <w:rPr>
+                                      <w:rFonts w:ascii="Century Gothic" w:cs="Century Gothic" w:eastAsia="Century Gothic" w:hAnsi="Century Gothic"/>
+                                      <w:b w:val="1"/>
+                                      <w:i w:val="0"/>
+                                      <w:smallCaps w:val="0"/>
+                                      <w:strike w:val="0"/>
+                                      <w:color w:val="1f497d"/>
+                                      <w:sz w:val="22"/>
+                                      <w:vertAlign w:val="baseline"/>
+                                    </w:rPr>
+                                  </w:r>
+                                </w:p>
+                                <w:p>
+                                  <w:pPr>
+                                    <w:spacing w:after="0" w:before="50" w:line="240"/>
+                                    <w:ind w:left="0" w:right="0" w:firstLine="0"/>
+                                    <w:jc w:val="left"/>
+                                    <w:textDirection w:val="btLr"/>
+                                  </w:pPr>
+                                  <w:r>
+                                    <w:rPr>
+                                      <w:rFonts w:ascii="Century Gothic" w:cs="Century Gothic" w:eastAsia="Century Gothic" w:hAnsi="Century Gothic"/>
+                                      <w:b w:val="1"/>
+                                      <w:i w:val="0"/>
+                                      <w:smallCaps w:val="0"/>
+                                      <w:strike w:val="0"/>
+                                      <w:color w:val="1f497d"/>
+                                      <w:sz w:val="22"/>
+                                      <w:vertAlign w:val="baseline"/>
+                                    </w:rPr>
+                                  </w:r>
+                                  <w:r>
+                                    <w:rPr>
+                                      <w:rFonts w:ascii="Century Gothic" w:cs="Century Gothic" w:eastAsia="Century Gothic" w:hAnsi="Century Gothic"/>
+                                      <w:b w:val="1"/>
+                                      <w:i w:val="0"/>
+                                      <w:smallCaps w:val="0"/>
+                                      <w:strike w:val="0"/>
+                                      <w:color w:val="1f497d"/>
+                                      <w:sz w:val="22"/>
+                                      <w:vertAlign w:val="baseline"/>
+                                    </w:rPr>
+                                    <w:t xml:space="preserve">Hacker rank Score:     {{ hacker_rank_score }}</w:t>
+                                  </w:r>
+                                </w:p>
+                                <w:p>
+                                  <w:pPr>
+                                    <w:spacing w:after="0" w:before="50" w:line="240"/>
+                                    <w:ind w:left="0" w:right="0" w:firstLine="0"/>
+                                    <w:jc w:val="left"/>
+                                    <w:textDirection w:val="btLr"/>
+                                  </w:pPr>
+                                  <w:r>
+                                    <w:rPr>
+                                      <w:rFonts w:ascii="Century Gothic" w:cs="Century Gothic" w:eastAsia="Century Gothic" w:hAnsi="Century Gothic"/>
+                                      <w:b w:val="1"/>
+                                      <w:i w:val="0"/>
+                                      <w:smallCaps w:val="0"/>
+                                      <w:strike w:val="0"/>
+                                      <w:color w:val="1f497d"/>
+                                      <w:sz w:val="22"/>
+                                      <w:vertAlign w:val="baseline"/>
+                                    </w:rPr>
+                                  </w:r>
+                                </w:p>
+                                <w:p>
+                                  <w:pPr>
+                                    <w:spacing w:after="0" w:before="50" w:line="240"/>
+                                    <w:ind w:left="0" w:right="0" w:firstLine="0"/>
+                                    <w:jc w:val="left"/>
+                                    <w:textDirection w:val="btLr"/>
+                                  </w:pPr>
+                                  <w:r>
+                                    <w:rPr>
+                                      <w:rFonts w:ascii="Century Gothic" w:cs="Century Gothic" w:eastAsia="Century Gothic" w:hAnsi="Century Gothic"/>
+                                      <w:b w:val="1"/>
+                                      <w:i w:val="0"/>
+                                      <w:smallCaps w:val="0"/>
+                                      <w:strike w:val="0"/>
+                                      <w:color w:val="1f497d"/>
+                                      <w:sz w:val="22"/>
+                                      <w:vertAlign w:val="baseline"/>
+                                    </w:rPr>
+                                  </w:r>
+                                </w:p>
+                                <w:p>
+                                  <w:pPr>
+                                    <w:spacing w:after="0" w:before="50" w:line="240"/>
+                                    <w:ind w:left="0" w:right="0" w:firstLine="0"/>
+                                    <w:jc w:val="left"/>
+                                    <w:textDirection w:val="btLr"/>
+                                  </w:pPr>
+                                  <w:r>
+                                    <w:rPr>
+                                      <w:rFonts w:ascii="Century Gothic" w:cs="Century Gothic" w:eastAsia="Century Gothic" w:hAnsi="Century Gothic"/>
+                                      <w:b w:val="1"/>
+                                      <w:i w:val="0"/>
+                                      <w:smallCaps w:val="0"/>
+                                      <w:strike w:val="0"/>
+                                      <w:color w:val="1f497d"/>
+                                      <w:sz w:val="22"/>
+                                      <w:vertAlign w:val="baseline"/>
+                                    </w:rPr>
+                                  </w:r>
+                                </w:p>
+                                <w:p>
+                                  <w:pPr>
+                                    <w:spacing w:after="0" w:before="50" w:line="240"/>
+                                    <w:ind w:left="0" w:right="0" w:firstLine="0"/>
+                                    <w:jc w:val="left"/>
+                                    <w:textDirection w:val="btLr"/>
+                                  </w:pPr>
+                                  <w:r>
+                                    <w:rPr>
+                                      <w:rFonts w:ascii="Century Gothic" w:cs="Century Gothic" w:eastAsia="Century Gothic" w:hAnsi="Century Gothic"/>
+                                      <w:b w:val="1"/>
+                                      <w:i w:val="0"/>
+                                      <w:smallCaps w:val="0"/>
+                                      <w:strike w:val="0"/>
+                                      <w:color w:val="1f497d"/>
+                                      <w:sz w:val="22"/>
+                                      <w:vertAlign w:val="baseline"/>
+                                    </w:rPr>
+                                  </w:r>
+                                </w:p>
+                                <w:p>
+                                  <w:pPr>
+                                    <w:spacing w:after="0" w:before="50" w:line="240"/>
+                                    <w:ind w:left="0" w:right="0" w:firstLine="0"/>
+                                    <w:jc w:val="left"/>
+                                    <w:textDirection w:val="btLr"/>
+                                  </w:pPr>
+                                  <w:r>
+                                    <w:rPr>
+                                      <w:rFonts w:ascii="Century Gothic" w:cs="Century Gothic" w:eastAsia="Century Gothic" w:hAnsi="Century Gothic"/>
+                                      <w:b w:val="1"/>
+                                      <w:i w:val="0"/>
+                                      <w:smallCaps w:val="0"/>
+                                      <w:strike w:val="0"/>
+                                      <w:color w:val="1f497d"/>
+                                      <w:sz w:val="22"/>
+                                      <w:vertAlign w:val="baseline"/>
+                                    </w:rPr>
+                                  </w:r>
+                                </w:p>
+                                <w:p>
+                                  <w:pPr>
+                                    <w:spacing w:after="0" w:before="50" w:line="240"/>
+                                    <w:ind w:left="0" w:right="0" w:firstLine="0"/>
+                                    <w:jc w:val="left"/>
+                                    <w:textDirection w:val="btLr"/>
+                                  </w:pPr>
+                                  <w:r>
+                                    <w:rPr>
+                                      <w:rFonts w:ascii="Century Gothic" w:cs="Century Gothic" w:eastAsia="Century Gothic" w:hAnsi="Century Gothic"/>
+                                      <w:b w:val="1"/>
+                                      <w:i w:val="0"/>
+                                      <w:smallCaps w:val="0"/>
+                                      <w:strike w:val="0"/>
+                                      <w:color w:val="1f497d"/>
+                                      <w:sz w:val="22"/>
+                                      <w:vertAlign w:val="baseline"/>
+                                    </w:rPr>
+                                  </w:r>
+                                </w:p>
+                                <w:p>
+                                  <w:pPr>
+                                    <w:spacing w:after="0" w:before="50" w:line="240"/>
+                                    <w:ind w:left="0" w:right="0" w:firstLine="0"/>
+                                    <w:jc w:val="left"/>
+                                    <w:textDirection w:val="btLr"/>
+                                  </w:pPr>
+                                  <w:r>
+                                    <w:rPr>
+                                      <w:rFonts w:ascii="Century Gothic" w:cs="Century Gothic" w:eastAsia="Century Gothic" w:hAnsi="Century Gothic"/>
+                                      <w:b w:val="1"/>
+                                      <w:i w:val="0"/>
+                                      <w:smallCaps w:val="0"/>
+                                      <w:strike w:val="0"/>
+                                      <w:color w:val="1f497d"/>
+                                      <w:sz w:val="22"/>
+                                      <w:vertAlign w:val="baseline"/>
+                                    </w:rPr>
+                                  </w:r>
+                                </w:p>
+                                <w:p>
+                                  <w:pPr>
+                                    <w:spacing w:after="0" w:before="50" w:line="240"/>
+                                    <w:ind w:left="103.00000190734863" w:right="0" w:firstLine="412.00000762939453"/>
+                                    <w:jc w:val="left"/>
+                                    <w:textDirection w:val="btLr"/>
+                                  </w:pPr>
+                                  <w:r>
+                                    <w:rPr>
+                                      <w:rFonts w:ascii="Century Gothic" w:cs="Century Gothic" w:eastAsia="Century Gothic" w:hAnsi="Century Gothic"/>
+                                      <w:b w:val="1"/>
+                                      <w:i w:val="0"/>
+                                      <w:smallCaps w:val="0"/>
+                                      <w:strike w:val="0"/>
+                                      <w:color w:val="1f497d"/>
+                                      <w:sz w:val="22"/>
+                                      <w:vertAlign w:val="baseline"/>
+                                    </w:rPr>
+                                  </w:r>
+                                </w:p>
+                              </w:txbxContent>
+                            </wps:txbx>
+                            <wps:bodyPr anchorCtr="0" anchor="t" bIns="0" lIns="0" spcFirstLastPara="1" rIns="0" wrap="square" tIns="0">
+                              <a:noAutofit/>
+                            </wps:bodyPr>
+                          </wps:wsp>
+                          <wps:wsp>
+                            <wps:cNvSpPr/>
+                            <wps:cNvPr id="7" name="Shape 7"/>
+                            <wps:spPr>
+                              <a:xfrm>
+                                <a:off x="6534000" y="753100"/>
+                                <a:ext cx="1845900" cy="1813800"/>
+                              </a:xfrm>
+                              <a:prstGeom prst="rect">
+                                <a:avLst/>
+                              </a:prstGeom>
+                              <a:noFill/>
+                              <a:ln cap="flat" cmpd="sng" w="9525">
+                                <a:solidFill>
+                                  <a:srgbClr val="000000"/>
+                                </a:solidFill>
+                                <a:prstDash val="solid"/>
+                                <a:miter lim="80"/>
+                                <a:headEnd len="sm" w="sm" type="none"/>
+                                <a:tailEnd len="sm" w="sm" type="none"/>
+                              </a:ln>
+                            </wps:spPr>
+                            <wps:txbx>
+                              <w:txbxContent>
+                                <w:p>
+                                  <w:pPr>
+                                    <w:spacing w:after="0" w:before="0" w:line="240"/>
+                                    <w:ind w:left="0" w:right="0" w:firstLine="0"/>
+                                    <w:jc w:val="center"/>
+                                    <w:textDirection w:val="btLr"/>
+                                  </w:pPr>
+                                </w:p>
+                                <w:p>
+                                  <w:pPr>
+                                    <w:spacing w:after="0" w:before="0" w:line="240"/>
+                                    <w:ind w:left="0" w:right="0" w:firstLine="0"/>
+                                    <w:jc w:val="center"/>
+                                    <w:textDirection w:val="btLr"/>
+                                  </w:pPr>
+                                  <w:r>
+                                    <w:rPr>
+                                      <w:rFonts w:ascii="Arial" w:cs="Arial" w:eastAsia="Arial" w:hAnsi="Arial"/>
+                                      <w:b w:val="0"/>
+                                      <w:i w:val="0"/>
+                                      <w:smallCaps w:val="0"/>
+                                      <w:strike w:val="0"/>
+                                      <w:color w:val="000000"/>
+                                      <w:sz w:val="28"/>
+                                      <w:vertAlign w:val="baseline"/>
+                                    </w:rPr>
+                                  </w:r>
+                                </w:p>
+                                <w:p>
+                                  <w:pPr>
+                                    <w:spacing w:after="0" w:before="0" w:line="240"/>
+                                    <w:ind w:left="0" w:right="0" w:firstLine="0"/>
+                                    <w:jc w:val="left"/>
+                                    <w:textDirection w:val="btLr"/>
+                                  </w:pPr>
+                                  <w:r>
+                                    <w:rPr>
+                                      <w:rFonts w:ascii="Arial" w:cs="Arial" w:eastAsia="Arial" w:hAnsi="Arial"/>
+                                      <w:b w:val="0"/>
+                                      <w:i w:val="0"/>
+                                      <w:smallCaps w:val="0"/>
+                                      <w:strike w:val="0"/>
+                                      <w:color w:val="000000"/>
+                                      <w:sz w:val="28"/>
+                                      <w:vertAlign w:val="baseline"/>
+                                    </w:rPr>
+                                  </w:r>
+                                  <w:r>
+                                    <w:rPr>
+                                      <w:rFonts w:ascii="Arial" w:cs="Arial" w:eastAsia="Arial" w:hAnsi="Arial"/>
+                                      <w:b w:val="0"/>
+                                      <w:i w:val="0"/>
+                                      <w:smallCaps w:val="0"/>
+                                      <w:strike w:val="0"/>
+                                      <w:color w:val="000000"/>
+                                      <w:sz w:val="28"/>
+                                      <w:vertAlign w:val="baseline"/>
+                                    </w:rPr>
+                                    <w:t xml:space="preserve">{{candidate_photo}}</w:t>
+                                  </w:r>
+                                </w:p>
+                              </w:txbxContent>
+                            </wps:txbx>
+                            <wps:bodyPr anchorCtr="0" anchor="t" bIns="91425" lIns="91425" spcFirstLastPara="1" rIns="91425" wrap="square" tIns="91425">
+                              <a:noAutofit/>
+                            </wps:bodyPr>
+                          </wps:wsp>
+                        </wpg:grpSp>
                       </wpg:grpSp>
                     </wpg:wgp>
                   </a:graphicData>
@@ -1405,7 +1323,7 @@
           <mc:Fallback>
             <w:drawing>
               <wp:inline distB="0" distT="0" distL="0" distR="0">
-                <wp:extent cx="6715125" cy="7304004"/>
+                <wp:extent cx="6715125" cy="7417981"/>
                 <wp:effectExtent b="0" l="0" r="0" t="0"/>
                 <wp:docPr id="1" name="image3.png"/>
                 <a:graphic>
@@ -1425,7 +1343,7 @@
                       <pic:spPr>
                         <a:xfrm>
                           <a:off x="0" y="0"/>
-                          <a:ext cx="6715125" cy="7304004"/>
+                          <a:ext cx="6715125" cy="7417981"/>
                         </a:xfrm>
                         <a:prstGeom prst="rect"/>
                         <a:ln/>
@@ -2603,7 +2521,7 @@
           <w:highlight w:val="white"/>
           <w:rtl w:val="0"/>
         </w:rPr>
-        <w:t xml:space="preserve">{%- for cert in certifications_secondary %}</w:t>
+        <w:t xml:space="preserve">{%- for cert in certifications %}</w:t>
       </w:r>
     </w:p>
     <w:p>
@@ -2644,6 +2562,11 @@
           <w:rtl w:val="0"/>
         </w:rPr>
         <w:t xml:space="preserve">{{ cert.name }}</w:t>
+      </w:r>
+      <w:r>
+        <w:rPr>
+          <w:rtl w:val="0"/>
+        </w:rPr>
       </w:r>
     </w:p>
     <w:p>
@@ -3218,12 +3141,12 @@
           <wp:extent cx="1720850" cy="676910"/>
           <wp:effectExtent b="0" l="0" r="0" t="0"/>
           <wp:wrapNone/>
-          <wp:docPr descr="Logo, company name&#10;&#10;Description automatically generated" id="3" name="image1.jpg"/>
+          <wp:docPr descr="Logo, company name&#10;&#10;Description automatically generated" id="2" name="image2.jpg"/>
           <a:graphic>
             <a:graphicData uri="http://schemas.openxmlformats.org/drawingml/2006/picture">
               <pic:pic>
                 <pic:nvPicPr>
-                  <pic:cNvPr descr="Logo, company name&#10;&#10;Description automatically generated" id="0" name="image1.jpg"/>
+                  <pic:cNvPr descr="Logo, company name&#10;&#10;Description automatically generated" id="0" name="image2.jpg"/>
                   <pic:cNvPicPr preferRelativeResize="0"/>
                 </pic:nvPicPr>
                 <pic:blipFill>
@@ -3304,12 +3227,12 @@
         <wp:inline distB="0" distT="0" distL="0" distR="0">
           <wp:extent cx="1295118" cy="570955"/>
           <wp:effectExtent b="0" l="0" r="0" t="0"/>
-          <wp:docPr descr="A blue logo with white text&#10;&#10;Description automatically generated with low confidence" id="2" name="image2.png"/>
+          <wp:docPr descr="A blue logo with white text&#10;&#10;Description automatically generated with low confidence" id="3" name="image1.png"/>
           <a:graphic>
             <a:graphicData uri="http://schemas.openxmlformats.org/drawingml/2006/picture">
               <pic:pic>
                 <pic:nvPicPr>
-                  <pic:cNvPr descr="A blue logo with white text&#10;&#10;Description automatically generated with low confidence" id="0" name="image2.png"/>
+                  <pic:cNvPr descr="A blue logo with white text&#10;&#10;Description automatically generated with low confidence" id="0" name="image1.png"/>
                   <pic:cNvPicPr preferRelativeResize="0"/>
                 </pic:nvPicPr>
                 <pic:blipFill>
@@ -3410,9 +3333,9 @@
   <w:abstractNum w:abstractNumId="1">
     <w:lvl w:ilvl="0">
       <w:start w:val="1"/>
-      <w:numFmt w:val="upperRoman"/>
-      <w:lvlText w:val="%1."/>
-      <w:lvlJc w:val="right"/>
+      <w:numFmt w:val="bullet"/>
+      <w:lvlText w:val="●"/>
+      <w:lvlJc w:val="left"/>
       <w:pPr>
         <w:ind w:left="720" w:hanging="360"/>
       </w:pPr>
@@ -3422,8 +3345,8 @@
     </w:lvl>
     <w:lvl w:ilvl="1">
       <w:start w:val="1"/>
-      <w:numFmt w:val="upperLetter"/>
-      <w:lvlText w:val="%2."/>
+      <w:numFmt w:val="bullet"/>
+      <w:lvlText w:val="○"/>
       <w:lvlJc w:val="left"/>
       <w:pPr>
         <w:ind w:left="1440" w:hanging="360"/>
@@ -3434,8 +3357,8 @@
     </w:lvl>
     <w:lvl w:ilvl="2">
       <w:start w:val="1"/>
-      <w:numFmt w:val="decimal"/>
-      <w:lvlText w:val="%3."/>
+      <w:numFmt w:val="bullet"/>
+      <w:lvlText w:val="■"/>
       <w:lvlJc w:val="left"/>
       <w:pPr>
         <w:ind w:left="2160" w:hanging="360"/>
@@ -3446,8 +3369,8 @@
     </w:lvl>
     <w:lvl w:ilvl="3">
       <w:start w:val="1"/>
-      <w:numFmt w:val="lowerLetter"/>
-      <w:lvlText w:val="%4)"/>
+      <w:numFmt w:val="bullet"/>
+      <w:lvlText w:val="●"/>
       <w:lvlJc w:val="left"/>
       <w:pPr>
         <w:ind w:left="2880" w:hanging="360"/>
@@ -3458,8 +3381,8 @@
     </w:lvl>
     <w:lvl w:ilvl="4">
       <w:start w:val="1"/>
-      <w:numFmt w:val="decimal"/>
-      <w:lvlText w:val="(%5)"/>
+      <w:numFmt w:val="bullet"/>
+      <w:lvlText w:val="○"/>
       <w:lvlJc w:val="left"/>
       <w:pPr>
         <w:ind w:left="3600" w:hanging="360"/>
@@ -3470,8 +3393,8 @@
     </w:lvl>
     <w:lvl w:ilvl="5">
       <w:start w:val="1"/>
-      <w:numFmt w:val="lowerLetter"/>
-      <w:lvlText w:val="(%6)"/>
+      <w:numFmt w:val="bullet"/>
+      <w:lvlText w:val="■"/>
       <w:lvlJc w:val="left"/>
       <w:pPr>
         <w:ind w:left="4320" w:hanging="360"/>
@@ -3482,9 +3405,9 @@
     </w:lvl>
     <w:lvl w:ilvl="6">
       <w:start w:val="1"/>
-      <w:numFmt w:val="lowerRoman"/>
-      <w:lvlText w:val="(%7)"/>
-      <w:lvlJc w:val="right"/>
+      <w:numFmt w:val="bullet"/>
+      <w:lvlText w:val="●"/>
+      <w:lvlJc w:val="left"/>
       <w:pPr>
         <w:ind w:left="5040" w:hanging="360"/>
       </w:pPr>
@@ -3494,8 +3417,8 @@
     </w:lvl>
     <w:lvl w:ilvl="7">
       <w:start w:val="1"/>
-      <w:numFmt w:val="lowerLetter"/>
-      <w:lvlText w:val="(%8)"/>
+      <w:numFmt w:val="bullet"/>
+      <w:lvlText w:val="○"/>
       <w:lvlJc w:val="left"/>
       <w:pPr>
         <w:ind w:left="5760" w:hanging="360"/>
@@ -3506,9 +3429,9 @@
     </w:lvl>
     <w:lvl w:ilvl="8">
       <w:start w:val="1"/>
-      <w:numFmt w:val="lowerRoman"/>
-      <w:lvlText w:val="(%9)"/>
-      <w:lvlJc w:val="right"/>
+      <w:numFmt w:val="bullet"/>
+      <w:lvlText w:val="■"/>
+      <w:lvlJc w:val="left"/>
       <w:pPr>
         <w:ind w:left="6480" w:hanging="360"/>
       </w:pPr>
@@ -4462,7 +4385,7 @@
 
 <file path=customXML/item1.xml><?xml version="1.0" encoding="utf-8"?>
 <go:gDocsCustomXmlDataStorage xmlns:go="http://customooxmlschemas.google.com/" xmlns:r="http://schemas.openxmlformats.org/officeDocument/2006/relationships" uri="GoogleDocsCustomDataVersion2">
-  <go:docsCustomData xmlns:go="http://customooxmlschemas.google.com/" roundtripDataSignature="AMtx7mg79WFRJwe38+9g6GJbw2noz4C/lQ==">CgMxLjA4AHIhMWYzclR2WExNUFhFWkdPaWpOREZJZ2F1b0NFN3hyMUpo</go:docsCustomData>
+  <go:docsCustomData xmlns:go="http://customooxmlschemas.google.com/" roundtripDataSignature="AMtx7mhhGED8KNWzNZnAn1u1wC9HwL32mQ==">CgMxLjA4AHIhMVJlaU9CY2ZRWkxtbXVjR254WkxBY3dJOTVKUk00dkRf</go:docsCustomData>
 </go:gDocsCustomXmlDataStorage>
 </file>
 

</xml_diff>